<commit_message>
Expand thesis Chapters 2-3 with deeper literature review and formal MDP design
Adds alert-fatigue motivation, a four-family taxonomy of correlation
approaches, kill-chain/MITRE ATT&CK grounding, RL/DQN foundations (Q-learning,
Double DQN, prioritized replay, TRPO/PPO lineage), RL-in-cybersecurity
positioning, and a formal MDP definition of the correlation environment.

Co-Authored-By: Claude Sonnet 5 <noreply@anthropic.com>
Claude-Session: https://claude.ai/code/session_01PK1SAq7LZRm33uLpofEgCm
</commit_message>
<xml_diff>
--- a/docs/thesis.docx
+++ b/docs/thesis.docx
@@ -1220,7 +1220,7 @@
     </w:p>
     <w:bookmarkEnd w:id="26"/>
     <w:bookmarkEnd w:id="27"/>
-    <w:bookmarkStart w:id="32" w:name="chapter-2-background-and-related-work"/>
+    <w:bookmarkStart w:id="36" w:name="chapter-2-background-and-related-work"/>
     <w:p>
       <w:pPr>
         <w:pStyle w:val="Heading1"/>
@@ -1229,13 +1229,109 @@
         <w:t xml:space="preserve">Chapter 2 — Background and Related Work</w:t>
       </w:r>
     </w:p>
-    <w:bookmarkStart w:id="28" w:name="Xd7866e78b2fd775e8a18caf681f5b44b74f37ba"/>
+    <w:p>
+      <w:pPr>
+        <w:pStyle w:val="FirstParagraph"/>
+      </w:pPr>
+      <w:r>
+        <w:rPr>
+          <w:iCs/>
+          <w:i/>
+        </w:rPr>
+        <w:t xml:space="preserve">Note to the author: this chapter’s narrower, less universally-known</w:t>
+      </w:r>
+      <w:r>
+        <w:rPr>
+          <w:iCs/>
+          <w:i/>
+        </w:rPr>
+        <w:t xml:space="preserve"> </w:t>
+      </w:r>
+      <w:r>
+        <w:rPr>
+          <w:iCs/>
+          <w:i/>
+        </w:rPr>
+        <w:t xml:space="preserve">citations (Section 2.2, 2.6 in particular) should be independently verified</w:t>
+      </w:r>
+      <w:r>
+        <w:rPr>
+          <w:iCs/>
+          <w:i/>
+        </w:rPr>
+        <w:t xml:space="preserve"> </w:t>
+      </w:r>
+      <w:r>
+        <w:rPr>
+          <w:iCs/>
+          <w:i/>
+        </w:rPr>
+        <w:t xml:space="preserve">against the original sources — exact venues, years, and page numbers were</w:t>
+      </w:r>
+      <w:r>
+        <w:rPr>
+          <w:iCs/>
+          <w:i/>
+        </w:rPr>
+        <w:t xml:space="preserve"> </w:t>
+      </w:r>
+      <w:r>
+        <w:rPr>
+          <w:iCs/>
+          <w:i/>
+        </w:rPr>
+        <w:t xml:space="preserve">not re-checked line-by-line while assembling this document. Where a claim</w:t>
+      </w:r>
+      <w:r>
+        <w:rPr>
+          <w:iCs/>
+          <w:i/>
+        </w:rPr>
+        <w:t xml:space="preserve"> </w:t>
+      </w:r>
+      <w:r>
+        <w:rPr>
+          <w:iCs/>
+          <w:i/>
+        </w:rPr>
+        <w:t xml:space="preserve">rests on a specific paper’s findings rather than general, well-established</w:t>
+      </w:r>
+      <w:r>
+        <w:rPr>
+          <w:iCs/>
+          <w:i/>
+        </w:rPr>
+        <w:t xml:space="preserve"> </w:t>
+      </w:r>
+      <w:r>
+        <w:rPr>
+          <w:iCs/>
+          <w:i/>
+        </w:rPr>
+        <w:t xml:space="preserve">knowledge, the citation is marked and should be confirmed before</w:t>
+      </w:r>
+      <w:r>
+        <w:rPr>
+          <w:iCs/>
+          <w:i/>
+        </w:rPr>
+        <w:t xml:space="preserve"> </w:t>
+      </w:r>
+      <w:r>
+        <w:rPr>
+          <w:iCs/>
+          <w:i/>
+        </w:rPr>
+        <w:t xml:space="preserve">submission.</w:t>
+      </w:r>
+    </w:p>
+    <w:bookmarkStart w:id="28" w:name="X412d3a8629647dc9717788b75fc23845b975efd"/>
     <w:p>
       <w:pPr>
         <w:pStyle w:val="Heading2"/>
       </w:pPr>
       <w:r>
-        <w:t xml:space="preserve">2.1 Multi-Stage Attacks and Alert Correlation</w:t>
+        <w:t xml:space="preserve">2.1 Alert Fatigue and the Case for Automated Correlation</w:t>
       </w:r>
     </w:p>
     <w:p>
@@ -1243,77 +1339,163 @@
         <w:pStyle w:val="FirstParagraph"/>
       </w:pPr>
       <w:r>
-        <w:t xml:space="preserve">Multi-stage attacks are commonly described using a kill-chain-style</w:t>
-      </w:r>
-      <w:r>
-        <w:t xml:space="preserve"> </w:t>
-      </w:r>
-      <w:r>
-        <w:t xml:space="preserve">decomposition (reconnaissance, initial exploitation, installation,</w:t>
-      </w:r>
-      <w:r>
-        <w:t xml:space="preserve"> </w:t>
-      </w:r>
-      <w:r>
-        <w:t xml:space="preserve">command-and-control / lateral movement, and impact/exfiltration). Alert</w:t>
-      </w:r>
-      <w:r>
-        <w:t xml:space="preserve"> </w:t>
-      </w:r>
-      <w:r>
-        <w:t xml:space="preserve">correlation is the task of grouping raw sensor output — which is generated</w:t>
-      </w:r>
-      <w:r>
-        <w:t xml:space="preserve"> </w:t>
-      </w:r>
-      <w:r>
-        <w:t xml:space="preserve">per-event, not per-campaign — back into these campaign-level structures.</w:t>
-      </w:r>
-      <w:r>
-        <w:t xml:space="preserve"> </w:t>
-      </w:r>
-      <w:r>
-        <w:t xml:space="preserve">Prior approaches broadly fall into: (a) rule-based correlation (fixed time</w:t>
-      </w:r>
-      <w:r>
-        <w:t xml:space="preserve"> </w:t>
-      </w:r>
-      <w:r>
-        <w:t xml:space="preserve">windows, shared-host or shared-session heuristics), which is simple and</w:t>
-      </w:r>
-      <w:r>
-        <w:t xml:space="preserve"> </w:t>
-      </w:r>
-      <w:r>
-        <w:t xml:space="preserve">interpretable but brittle against attacker-controlled timing and topology</w:t>
-      </w:r>
-      <w:r>
-        <w:t xml:space="preserve"> </w:t>
-      </w:r>
-      <w:r>
-        <w:t xml:space="preserve">variation; and (b) statistical or machine-learning correlation, which can</w:t>
-      </w:r>
-      <w:r>
-        <w:t xml:space="preserve"> </w:t>
-      </w:r>
-      <w:r>
-        <w:t xml:space="preserve">adapt to data but is vulnerable to the same leakage failure modes discussed</w:t>
-      </w:r>
-      <w:r>
-        <w:t xml:space="preserve"> </w:t>
-      </w:r>
-      <w:r>
-        <w:t xml:space="preserve">in Section 1.4 if not evaluated carefully.</w:t>
+        <w:t xml:space="preserve">The practical motivation for alert correlation research is a volume</w:t>
+      </w:r>
+      <w:r>
+        <w:t xml:space="preserve"> </w:t>
+      </w:r>
+      <w:r>
+        <w:t xml:space="preserve">problem, not a novelty problem. A single network of moderate size can</w:t>
+      </w:r>
+      <w:r>
+        <w:t xml:space="preserve"> </w:t>
+      </w:r>
+      <w:r>
+        <w:t xml:space="preserve">generate thousands of low-level intrusion detection and firewall alerts</w:t>
+      </w:r>
+      <w:r>
+        <w:t xml:space="preserve"> </w:t>
+      </w:r>
+      <w:r>
+        <w:t xml:space="preserve">per day, the large majority of which are either benign noise, duplicates</w:t>
+      </w:r>
+      <w:r>
+        <w:t xml:space="preserve"> </w:t>
+      </w:r>
+      <w:r>
+        <w:t xml:space="preserve">of the same underlying event, or fragments of a single incident reported</w:t>
+      </w:r>
+      <w:r>
+        <w:t xml:space="preserve"> </w:t>
+      </w:r>
+      <w:r>
+        <w:t xml:space="preserve">once per sensor per packet. Security operations center (SOC) analysts</w:t>
+      </w:r>
+      <w:r>
+        <w:t xml:space="preserve"> </w:t>
+      </w:r>
+      <w:r>
+        <w:t xml:space="preserve">facing this volume are well documented to experience</w:t>
+      </w:r>
+      <w:r>
+        <w:t xml:space="preserve"> </w:t>
+      </w:r>
+      <w:r>
+        <w:t xml:space="preserve">“</w:t>
+      </w:r>
+      <w:r>
+        <w:t xml:space="preserve">alert fatigue</w:t>
+      </w:r>
+      <w:r>
+        <w:t xml:space="preserve">”</w:t>
+      </w:r>
+      <w:r>
+        <w:t xml:space="preserve"> </w:t>
+      </w:r>
+      <w:r>
+        <w:t xml:space="preserve">—</w:t>
+      </w:r>
+      <w:r>
+        <w:t xml:space="preserve"> </w:t>
+      </w:r>
+      <w:r>
+        <w:t xml:space="preserve">a state in which real, actionable alerts are missed or delayed because</w:t>
+      </w:r>
+      <w:r>
+        <w:t xml:space="preserve"> </w:t>
+      </w:r>
+      <w:r>
+        <w:t xml:space="preserve">they are indistinguishable, at the point of triage, from the surrounding</w:t>
+      </w:r>
+      <w:r>
+        <w:t xml:space="preserve"> </w:t>
+      </w:r>
+      <w:r>
+        <w:t xml:space="preserve">noise. Correlating raw alerts into campaign-level groupings before they</w:t>
+      </w:r>
+      <w:r>
+        <w:t xml:space="preserve"> </w:t>
+      </w:r>
+      <w:r>
+        <w:t xml:space="preserve">reach an analyst is one of the standard mitigations proposed for this</w:t>
+      </w:r>
+      <w:r>
+        <w:t xml:space="preserve"> </w:t>
+      </w:r>
+      <w:r>
+        <w:t xml:space="preserve">problem: it reduces the</w:t>
+      </w:r>
+      <w:r>
+        <w:t xml:space="preserve"> </w:t>
+      </w:r>
+      <w:r>
+        <w:rPr>
+          <w:iCs/>
+          <w:i/>
+        </w:rPr>
+        <w:t xml:space="preserve">number</w:t>
+      </w:r>
+      <w:r>
+        <w:t xml:space="preserve"> </w:t>
+      </w:r>
+      <w:r>
+        <w:t xml:space="preserve">of things a human must reason about,</w:t>
+      </w:r>
+      <w:r>
+        <w:t xml:space="preserve"> </w:t>
+      </w:r>
+      <w:r>
+        <w:t xml:space="preserve">ideally without discarding the</w:t>
+      </w:r>
+      <w:r>
+        <w:t xml:space="preserve"> </w:t>
+      </w:r>
+      <w:r>
+        <w:rPr>
+          <w:iCs/>
+          <w:i/>
+        </w:rPr>
+        <w:t xml:space="preserve">information</w:t>
+      </w:r>
+      <w:r>
+        <w:t xml:space="preserve"> </w:t>
+      </w:r>
+      <w:r>
+        <w:t xml:space="preserve">contained in the raw alerts.</w:t>
+      </w:r>
+      <w:r>
+        <w:t xml:space="preserve"> </w:t>
+      </w:r>
+      <w:r>
+        <w:t xml:space="preserve">This project’s Stage 2 burst-aggregation step (collapsing tens of</w:t>
+      </w:r>
+      <w:r>
+        <w:t xml:space="preserve"> </w:t>
+      </w:r>
+      <w:r>
+        <w:t xml:space="preserve">thousands of near-duplicate flood packets into one-second aggregate</w:t>
+      </w:r>
+      <w:r>
+        <w:t xml:space="preserve"> </w:t>
+      </w:r>
+      <w:r>
+        <w:t xml:space="preserve">events, Chapter 4.2) is a small, concrete instance of this same problem</w:t>
+      </w:r>
+      <w:r>
+        <w:t xml:space="preserve"> </w:t>
+      </w:r>
+      <w:r>
+        <w:t xml:space="preserve">at the sensor level, before campaign-level correlation is even attempted.</w:t>
       </w:r>
     </w:p>
     <w:bookmarkEnd w:id="28"/>
-    <w:bookmarkStart w:id="29" w:name="Xc2d045f6b55a65d425faf5c521505117fbd0915"/>
+    <w:bookmarkStart w:id="29" w:name="approaches-to-alert-correlation"/>
     <w:p>
       <w:pPr>
         <w:pStyle w:val="Heading2"/>
       </w:pPr>
       <w:r>
-        <w:t xml:space="preserve">2.2 Reinforcement Learning for Sequential Decisions</w:t>
+        <w:t xml:space="preserve">2.2 Approaches to Alert Correlation</w:t>
       </w:r>
     </w:p>
     <w:p>
@@ -1321,310 +1503,811 @@
         <w:pStyle w:val="FirstParagraph"/>
       </w:pPr>
       <w:r>
-        <w:t xml:space="preserve">Reinforcement learning fits problems that are naturally sequential and</w:t>
-      </w:r>
-      <w:r>
-        <w:t xml:space="preserve"> </w:t>
-      </w:r>
-      <w:r>
-        <w:t xml:space="preserve">where a decision affects the state available for the next decision. In</w:t>
-      </w:r>
-      <w:r>
-        <w:t xml:space="preserve"> </w:t>
-      </w:r>
-      <w:r>
-        <w:t xml:space="preserve">this project’s correlation setting, deciding to link (or not link) a</w:t>
-      </w:r>
-      <w:r>
-        <w:t xml:space="preserve"> </w:t>
-      </w:r>
-      <w:r>
-        <w:t xml:space="preserve">candidate event to the current campaign genuinely changes the problem the</w:t>
-      </w:r>
-      <w:r>
-        <w:t xml:space="preserve"> </w:t>
-      </w:r>
-      <w:r>
-        <w:t xml:space="preserve">agent faces next: a correctly accepted link moves the campaign’s</w:t>
-      </w:r>
-      <w:r>
-        <w:t xml:space="preserve"> </w:t>
-      </w:r>
-      <w:r>
-        <w:t xml:space="preserve">“</w:t>
-      </w:r>
-      <w:r>
-        <w:t xml:space="preserve">anchor</w:t>
-      </w:r>
-      <w:r>
-        <w:t xml:space="preserve">”</w:t>
-      </w:r>
-      <w:r>
-        <w:t xml:space="preserve"> </w:t>
-      </w:r>
-      <w:r>
-        <w:t xml:space="preserve">forward in time and topology, changing which subsequent events are</w:t>
-      </w:r>
-      <w:r>
-        <w:t xml:space="preserve"> </w:t>
-      </w:r>
-      <w:r>
-        <w:t xml:space="preserve">plausible candidates. This is a real, not cosmetic, multi-step episode</w:t>
-      </w:r>
-      <w:r>
-        <w:t xml:space="preserve"> </w:t>
-      </w:r>
-      <w:r>
-        <w:t xml:space="preserve">structure, which is what justifies using RL (with a genuine discount</w:t>
-      </w:r>
-      <w:r>
-        <w:t xml:space="preserve"> </w:t>
-      </w:r>
-      <w:r>
-        <w:t xml:space="preserve">factor over multi-step returns) rather than treating each candidate pair as</w:t>
-      </w:r>
-      <w:r>
-        <w:t xml:space="preserve"> </w:t>
-      </w:r>
-      <w:r>
-        <w:t xml:space="preserve">an independent, one-shot classification problem.</w:t>
-      </w:r>
-    </w:p>
-    <w:bookmarkEnd w:id="29"/>
-    <w:bookmarkStart w:id="30" w:name="dqn-vs.-ppo"/>
-    <w:p>
-      <w:pPr>
-        <w:pStyle w:val="Heading2"/>
-      </w:pPr>
-      <w:r>
-        <w:t xml:space="preserve">2.3 DQN vs. PPO</w:t>
-      </w:r>
-    </w:p>
-    <w:p>
-      <w:pPr>
-        <w:pStyle w:val="FirstParagraph"/>
-      </w:pPr>
-      <w:r>
-        <w:t xml:space="preserve">Two natural RL algorithm families were considered: Deep Q-Networks (DQN;</w:t>
-      </w:r>
-      <w:r>
-        <w:t xml:space="preserve"> </w:t>
-      </w:r>
-      <w:r>
-        <w:t xml:space="preserve">Mnih et al., 2015) and Proximal Policy Optimization (PPO; Schulman et al.,</w:t>
-      </w:r>
-      <w:r>
-        <w:t xml:space="preserve"> </w:t>
-      </w:r>
-      <w:r>
-        <w:t xml:space="preserve">2017). PPO’s principal strengths are in continuous or very large action</w:t>
-      </w:r>
-      <w:r>
-        <w:t xml:space="preserve"> </w:t>
-      </w:r>
-      <w:r>
-        <w:t xml:space="preserve">spaces and in stabilizing policy-gradient updates for high-dimensional</w:t>
-      </w:r>
-      <w:r>
-        <w:t xml:space="preserve"> </w:t>
-      </w:r>
-      <w:r>
-        <w:t xml:space="preserve">control problems. The correlation decision in this project is a</w:t>
-      </w:r>
-      <w:r>
-        <w:t xml:space="preserve"> </w:t>
-      </w:r>
+        <w:t xml:space="preserve">Prior alert-correlation approaches can be organized into four broad,</w:t>
+      </w:r>
+      <w:r>
+        <w:t xml:space="preserve"> </w:t>
+      </w:r>
+      <w:r>
+        <w:t xml:space="preserve">overlapping families.</w:t>
+      </w:r>
+    </w:p>
+    <w:p>
+      <w:pPr>
+        <w:pStyle w:val="BodyText"/>
+      </w:pPr>
       <w:r>
         <w:rPr>
           <w:bCs/>
           <w:b/>
         </w:rPr>
-        <w:t xml:space="preserve">binary,</w:t>
-      </w:r>
+        <w:t xml:space="preserve">Rule-based and similarity-based correlation.</w:t>
+      </w:r>
+      <w:r>
+        <w:t xml:space="preserve"> </w:t>
+      </w:r>
+      <w:r>
+        <w:t xml:space="preserve">The simplest and most</w:t>
+      </w:r>
+      <w:r>
+        <w:t xml:space="preserve"> </w:t>
+      </w:r>
+      <w:r>
+        <w:t xml:space="preserve">widely deployed approach in production SOC tooling: alerts are grouped by</w:t>
+      </w:r>
+      <w:r>
+        <w:t xml:space="preserve"> </w:t>
+      </w:r>
+      <w:r>
+        <w:t xml:space="preserve">fixed heuristics such as a shared source or destination IP within a fixed</w:t>
+      </w:r>
+      <w:r>
+        <w:t xml:space="preserve"> </w:t>
+      </w:r>
+      <w:r>
+        <w:t xml:space="preserve">time window, or a similarity score over shared alert attributes. This</w:t>
+      </w:r>
+      <w:r>
+        <w:t xml:space="preserve"> </w:t>
+      </w:r>
+      <w:r>
+        <w:t xml:space="preserve">approach is interpretable and cheap to compute — this project’s Stage 5</w:t>
+      </w:r>
+      <w:r>
+        <w:t xml:space="preserve"> </w:t>
+      </w:r>
+      <w:r>
+        <w:t xml:space="preserve">baseline is exactly this family — but it is brittle against attacker-</w:t>
+      </w:r>
+      <w:r>
+        <w:t xml:space="preserve"> </w:t>
+      </w:r>
+      <w:r>
+        <w:t xml:space="preserve">controlled timing (an attacker who spaces out a campaign’s stages beyond</w:t>
+      </w:r>
+      <w:r>
+        <w:t xml:space="preserve"> </w:t>
+      </w:r>
+      <w:r>
+        <w:t xml:space="preserve">the fixed window defeats it entirely) and against topology variation</w:t>
+      </w:r>
+      <w:r>
+        <w:t xml:space="preserve"> </w:t>
+      </w:r>
+      <w:r>
+        <w:t xml:space="preserve">(pivoting through an intermediate host breaks a pure shared-IP rule).</w:t>
+      </w:r>
+    </w:p>
+    <w:p>
+      <w:pPr>
+        <w:pStyle w:val="BodyText"/>
+      </w:pPr>
       <w:r>
         <w:rPr>
           <w:bCs/>
           <w:b/>
         </w:rPr>
-        <w:t xml:space="preserve"> </w:t>
-      </w:r>
+        <w:t xml:space="preserve">Statistical and probabilistic correlation.</w:t>
+      </w:r>
+      <w:r>
+        <w:t xml:space="preserve"> </w:t>
+      </w:r>
+      <w:r>
+        <w:t xml:space="preserve">Early academic work (e.g.,</w:t>
+      </w:r>
+      <w:r>
+        <w:t xml:space="preserve"> </w:t>
+      </w:r>
+      <w:r>
+        <w:t xml:space="preserve">Valdes and Skinner’s probabilistic alert-correlation approach, and related</w:t>
+      </w:r>
+      <w:r>
+        <w:t xml:space="preserve"> </w:t>
+      </w:r>
+      <w:r>
+        <w:t xml:space="preserve">statistical similarity-scoring methods from the early 2000s intrusion-</w:t>
+      </w:r>
+      <w:r>
+        <w:t xml:space="preserve"> </w:t>
+      </w:r>
+      <w:r>
+        <w:t xml:space="preserve">detection literature) models correlation as a similarity or likelihood</w:t>
+      </w:r>
+      <w:r>
+        <w:t xml:space="preserve"> </w:t>
+      </w:r>
+      <w:r>
+        <w:t xml:space="preserve">score over alert attribute distributions rather than a hard rule,</w:t>
+      </w:r>
+      <w:r>
+        <w:t xml:space="preserve"> </w:t>
+      </w:r>
+      <w:r>
+        <w:t xml:space="preserve">producing soft correlation strengths instead of a binary link/don’t-link</w:t>
+      </w:r>
+      <w:r>
+        <w:t xml:space="preserve"> </w:t>
+      </w:r>
+      <w:r>
+        <w:t xml:space="preserve">decision. This generalizes rule-based correlation but still typically</w:t>
+      </w:r>
+      <w:r>
+        <w:t xml:space="preserve"> </w:t>
+      </w:r>
+      <w:r>
+        <w:t xml:space="preserve">relies on hand-specified similarity functions and attribute weights.</w:t>
+      </w:r>
+    </w:p>
+    <w:p>
+      <w:pPr>
+        <w:pStyle w:val="BodyText"/>
+      </w:pPr>
       <w:r>
         <w:rPr>
           <w:bCs/>
           <w:b/>
         </w:rPr>
-        <w:t xml:space="preserve">discrete</w:t>
-      </w:r>
-      <w:r>
-        <w:t xml:space="preserve"> </w:t>
-      </w:r>
-      <w:r>
-        <w:t xml:space="preserve">action — link or don’t-link — which is exactly the setting DQN</w:t>
-      </w:r>
-      <w:r>
-        <w:t xml:space="preserve"> </w:t>
-      </w:r>
-      <w:r>
-        <w:t xml:space="preserve">was designed for, and does not require any of the mechanisms PPO adds</w:t>
-      </w:r>
-      <w:r>
-        <w:t xml:space="preserve"> </w:t>
-      </w:r>
-      <w:r>
-        <w:t xml:space="preserve">value for. DQN was selected as the better-fitting, simpler algorithm for</w:t>
-      </w:r>
-      <w:r>
-        <w:t xml:space="preserve"> </w:t>
-      </w:r>
-      <w:r>
-        <w:t xml:space="preserve">this action space, not as a default choice.</w:t>
+        <w:t xml:space="preserve">Causal and graph-based correlation.</w:t>
+      </w:r>
+      <w:r>
+        <w:t xml:space="preserve"> </w:t>
+      </w:r>
+      <w:r>
+        <w:t xml:space="preserve">A second line of work (e.g., Ning,</w:t>
+      </w:r>
+      <w:r>
+        <w:t xml:space="preserve"> </w:t>
+      </w:r>
+      <w:r>
+        <w:t xml:space="preserve">Cui, and Reeves’ work on constructing attack scenarios by matching an</w:t>
+      </w:r>
+      <w:r>
+        <w:t xml:space="preserve"> </w:t>
+      </w:r>
+      <w:r>
+        <w:t xml:space="preserve">alert’s declared</w:t>
+      </w:r>
+      <w:r>
+        <w:t xml:space="preserve"> </w:t>
+      </w:r>
+      <w:r>
+        <w:t xml:space="preserve">“</w:t>
+      </w:r>
+      <w:r>
+        <w:t xml:space="preserve">prerequisites</w:t>
+      </w:r>
+      <w:r>
+        <w:t xml:space="preserve">”</w:t>
+      </w:r>
+      <w:r>
+        <w:t xml:space="preserve"> </w:t>
+      </w:r>
+      <w:r>
+        <w:t xml:space="preserve">against a preceding alert’s</w:t>
+      </w:r>
+      <w:r>
+        <w:t xml:space="preserve"> </w:t>
+      </w:r>
+      <w:r>
+        <w:t xml:space="preserve">“</w:t>
+      </w:r>
+      <w:r>
+        <w:t xml:space="preserve">consequences</w:t>
+      </w:r>
+      <w:r>
+        <w:t xml:space="preserve">”</w:t>
+      </w:r>
+      <w:r>
+        <w:t xml:space="preserve">) builds correlation on top of an explicit causal or</w:t>
+      </w:r>
+      <w:r>
+        <w:t xml:space="preserve"> </w:t>
+      </w:r>
+      <w:r>
+        <w:t xml:space="preserve">prerequisite model of how one attack stage enables the next — closer in</w:t>
+      </w:r>
+      <w:r>
+        <w:t xml:space="preserve"> </w:t>
+      </w:r>
+      <w:r>
+        <w:t xml:space="preserve">spirit to reconstructing a kill chain than to a similarity metric.</w:t>
+      </w:r>
+      <w:r>
+        <w:t xml:space="preserve"> </w:t>
+      </w:r>
+      <w:r>
+        <w:t xml:space="preserve">Reconstructing the DARPA2000 kill-chain progression in this project’s</w:t>
+      </w:r>
+      <w:r>
+        <w:t xml:space="preserve"> </w:t>
+      </w:r>
+      <w:r>
+        <w:t xml:space="preserve">Stage 5 evaluation (Chapter 5.4) is conceptually adjacent to this family,</w:t>
+      </w:r>
+      <w:r>
+        <w:t xml:space="preserve"> </w:t>
+      </w:r>
+      <w:r>
+        <w:t xml:space="preserve">though this project’s DQN and rule-based baseline both operate on</w:t>
+      </w:r>
+      <w:r>
+        <w:t xml:space="preserve"> </w:t>
+      </w:r>
+      <w:r>
+        <w:t xml:space="preserve">similarity/temporal features rather than an explicit prerequisite graph.</w:t>
       </w:r>
     </w:p>
     <w:p>
       <w:pPr>
         <w:pStyle w:val="BodyText"/>
-      </w:pPr>
-      <w:r>
-        <w:t xml:space="preserve">The DQN implementation in this project includes the algorithm’s standard</w:t>
-      </w:r>
-      <w:r>
-        <w:t xml:space="preserve"> </w:t>
-      </w:r>
-      <w:r>
-        <w:t xml:space="preserve">components: an experience replay buffer (decorrelating sequential training</w:t>
-      </w:r>
-      <w:r>
-        <w:t xml:space="preserve"> </w:t>
-      </w:r>
-      <w:r>
-        <w:t xml:space="preserve">samples), a target network synchronized periodically with the policy</w:t>
-      </w:r>
-      <w:r>
-        <w:t xml:space="preserve"> </w:t>
-      </w:r>
-      <w:r>
-        <w:t xml:space="preserve">network (stabilizing the bootstrapped Q-value targets), epsilon-greedy</w:t>
-      </w:r>
-      <w:r>
-        <w:t xml:space="preserve"> </w:t>
-      </w:r>
-      <w:r>
-        <w:t xml:space="preserve">exploration with decay, and a discount factor applied over genuine</w:t>
-      </w:r>
-      <w:r>
-        <w:t xml:space="preserve"> </w:t>
-      </w:r>
-      <w:r>
-        <w:t xml:space="preserve">multi-step episodes (Section 2.2). Implementation details, including a</w:t>
-      </w:r>
-      <w:r>
-        <w:t xml:space="preserve"> </w:t>
-      </w:r>
-      <w:r>
-        <w:t xml:space="preserve">disclosed substitution of</w:t>
-      </w:r>
-      <w:r>
-        <w:t xml:space="preserve"> </w:t>
-      </w:r>
-      <w:r>
-        <w:rPr>
-          <w:rStyle w:val="VerbatimChar"/>
-        </w:rPr>
-        <w:t xml:space="preserve">scikit-learn</w:t>
-      </w:r>
-      <w:r>
-        <w:t xml:space="preserve">’s</w:t>
-      </w:r>
-      <w:r>
-        <w:t xml:space="preserve"> </w:t>
-      </w:r>
-      <w:r>
-        <w:rPr>
-          <w:rStyle w:val="VerbatimChar"/>
-        </w:rPr>
-        <w:t xml:space="preserve">MLPRegressor</w:t>
-      </w:r>
-      <w:r>
-        <w:t xml:space="preserve"> </w:t>
-      </w:r>
-      <w:r>
-        <w:t xml:space="preserve">for a standard</w:t>
-      </w:r>
-      <w:r>
-        <w:t xml:space="preserve"> </w:t>
-      </w:r>
-      <w:r>
-        <w:t xml:space="preserve">deep-learning framework due to environment constraints, are described in</w:t>
-      </w:r>
-      <w:r>
-        <w:t xml:space="preserve"> </w:t>
-      </w:r>
-      <w:r>
-        <w:t xml:space="preserve">Chapter 4 and revisited as a limitation in Chapter 7.</w:t>
-      </w:r>
-    </w:p>
-    <w:bookmarkEnd w:id="30"/>
-    <w:bookmarkStart w:id="31" w:name="datasets"/>
-    <w:p>
-      <w:pPr>
-        <w:pStyle w:val="Heading2"/>
-      </w:pPr>
-      <w:r>
-        <w:t xml:space="preserve">2.4 Datasets</w:t>
-      </w:r>
-    </w:p>
-    <w:p>
-      <w:pPr>
-        <w:pStyle w:val="FirstParagraph"/>
       </w:pPr>
       <w:r>
         <w:rPr>
           <w:bCs/>
           <w:b/>
         </w:rPr>
-        <w:t xml:space="preserve">DARPA2000</w:t>
-      </w:r>
-      <w:r>
-        <w:t xml:space="preserve"> </w:t>
-      </w:r>
-      <w:r>
-        <w:t xml:space="preserve">(MIT Lincoln Laboratory) is used as this project’s external,</w:t>
-      </w:r>
-      <w:r>
-        <w:t xml:space="preserve"> </w:t>
-      </w:r>
-      <w:r>
-        <w:t xml:space="preserve">held-out evaluation set. It comprises two labeled multi-stage intrusion</w:t>
-      </w:r>
-      <w:r>
-        <w:t xml:space="preserve"> </w:t>
-      </w:r>
-      <w:r>
-        <w:t xml:space="preserve">scenarios, LLDOS 1.0 and LLDOS 2.0.2, and remains, as of this writing, one</w:t>
-      </w:r>
-      <w:r>
-        <w:t xml:space="preserve"> </w:t>
-      </w:r>
-      <w:r>
-        <w:t xml:space="preserve">of the few datasets with genuine, dataset-native multi-phase campaign</w:t>
-      </w:r>
-      <w:r>
-        <w:t xml:space="preserve"> </w:t>
-      </w:r>
-      <w:r>
-        <w:t xml:space="preserve">ground truth designed specifically to exercise correlation research — a</w:t>
-      </w:r>
-      <w:r>
-        <w:t xml:space="preserve"> </w:t>
-      </w:r>
-      <w:r>
-        <w:t xml:space="preserve">property this project’s own Stage 2 work confirmed newer flow-centric</w:t>
-      </w:r>
-      <w:r>
-        <w:t xml:space="preserve"> </w:t>
-      </w:r>
-      <w:r>
-        <w:t xml:space="preserve">datasets do not have natively (Chapter 4).</w:t>
+        <w:t xml:space="preserve">Machine-learning-based correlation.</w:t>
+      </w:r>
+      <w:r>
+        <w:t xml:space="preserve"> </w:t>
+      </w:r>
+      <w:r>
+        <w:t xml:space="preserve">More recent work applies</w:t>
+      </w:r>
+      <w:r>
+        <w:t xml:space="preserve"> </w:t>
+      </w:r>
+      <w:r>
+        <w:t xml:space="preserve">supervised or unsupervised learning directly to the correlation problem —</w:t>
+      </w:r>
+      <w:r>
+        <w:t xml:space="preserve"> </w:t>
+      </w:r>
+      <w:r>
+        <w:t xml:space="preserve">clustering alerts (e.g., root-cause-analysis-oriented alarm clustering</w:t>
+      </w:r>
+      <w:r>
+        <w:t xml:space="preserve"> </w:t>
+      </w:r>
+      <w:r>
+        <w:t xml:space="preserve">approaches such as Julisch’s work on clustering intrusion-detection</w:t>
+      </w:r>
+      <w:r>
+        <w:t xml:space="preserve"> </w:t>
+      </w:r>
+      <w:r>
+        <w:t xml:space="preserve">alarms) or, more recently, applying deep learning to alert-sequence data.</w:t>
+      </w:r>
+      <w:r>
+        <w:t xml:space="preserve"> </w:t>
+      </w:r>
+      <w:r>
+        <w:t xml:space="preserve">This family is the most flexible but also the most exposed to the data-</w:t>
+      </w:r>
+      <w:r>
+        <w:t xml:space="preserve"> </w:t>
+      </w:r>
+      <w:r>
+        <w:t xml:space="preserve">leakage failure mode discussed in Section 1.4: an ML-based correlator</w:t>
+      </w:r>
+      <w:r>
+        <w:t xml:space="preserve"> </w:t>
+      </w:r>
+      <w:r>
+        <w:t xml:space="preserve">evaluated only on same-distribution held-out data can appear to solve</w:t>
+      </w:r>
+      <w:r>
+        <w:t xml:space="preserve"> </w:t>
+      </w:r>
+      <w:r>
+        <w:t xml:space="preserve">correlation while actually having learned a dataset-specific shortcut</w:t>
+      </w:r>
+      <w:r>
+        <w:t xml:space="preserve"> </w:t>
+      </w:r>
+      <w:r>
+        <w:t xml:space="preserve">(e.g., a fixed attacker IP, a simulation artifact) that a rule-based</w:t>
+      </w:r>
+      <w:r>
+        <w:t xml:space="preserve"> </w:t>
+      </w:r>
+      <w:r>
+        <w:t xml:space="preserve">system never had the flexibility to exploit in the first place. This risk</w:t>
+      </w:r>
+      <w:r>
+        <w:t xml:space="preserve"> </w:t>
+      </w:r>
+      <w:r>
+        <w:t xml:space="preserve">is precisely why this thesis insists on an external, structurally</w:t>
+      </w:r>
+      <w:r>
+        <w:t xml:space="preserve"> </w:t>
+      </w:r>
+      <w:r>
+        <w:t xml:space="preserve">different evaluation dataset (Chapter 4.6) rather than treating strong</w:t>
+      </w:r>
+      <w:r>
+        <w:t xml:space="preserve"> </w:t>
+      </w:r>
+      <w:r>
+        <w:t xml:space="preserve">same-distribution validation numbers as sufficient evidence on their own.</w:t>
+      </w:r>
+    </w:p>
+    <w:p>
+      <w:pPr>
+        <w:pStyle w:val="BodyText"/>
+      </w:pPr>
+      <w:r>
+        <w:t xml:space="preserve">This project’s DQN-based correlator sits within the machine-learning</w:t>
+      </w:r>
+      <w:r>
+        <w:t xml:space="preserve"> </w:t>
+      </w:r>
+      <w:r>
+        <w:t xml:space="preserve">family but is deliberately restricted to a small, interpretable, seven-</w:t>
+      </w:r>
+      <w:r>
+        <w:t xml:space="preserve"> </w:t>
+      </w:r>
+      <w:r>
+        <w:t xml:space="preserve">dimensional feature vector (Section 3.5) rather than raw alert content, in</w:t>
+      </w:r>
+      <w:r>
+        <w:t xml:space="preserve"> </w:t>
+      </w:r>
+      <w:r>
+        <w:t xml:space="preserve">an attempt to reduce — though, as Chapter 6 shows, not eliminate — this</w:t>
+      </w:r>
+      <w:r>
+        <w:t xml:space="preserve"> </w:t>
+      </w:r>
+      <w:r>
+        <w:t xml:space="preserve">family’s characteristic risk of learning dataset-specific shortcuts rather</w:t>
+      </w:r>
+      <w:r>
+        <w:t xml:space="preserve"> </w:t>
+      </w:r>
+      <w:r>
+        <w:t xml:space="preserve">than genuine correlation signal.</w:t>
+      </w:r>
+    </w:p>
+    <w:bookmarkEnd w:id="29"/>
+    <w:bookmarkStart w:id="30" w:name="kill-chain-and-attack-stage-models"/>
+    <w:p>
+      <w:pPr>
+        <w:pStyle w:val="Heading2"/>
+      </w:pPr>
+      <w:r>
+        <w:t xml:space="preserve">2.3 Kill-Chain and Attack-Stage Models</w:t>
+      </w:r>
+    </w:p>
+    <w:p>
+      <w:pPr>
+        <w:pStyle w:val="FirstParagraph"/>
+      </w:pPr>
+      <w:r>
+        <w:t xml:space="preserve">This project’s notion of a</w:t>
+      </w:r>
+      <w:r>
+        <w:t xml:space="preserve"> </w:t>
+      </w:r>
+      <w:r>
+        <w:t xml:space="preserve">“</w:t>
+      </w:r>
+      <w:r>
+        <w:t xml:space="preserve">multi-stage</w:t>
+      </w:r>
+      <w:r>
+        <w:t xml:space="preserve">”</w:t>
+      </w:r>
+      <w:r>
+        <w:t xml:space="preserve"> </w:t>
+      </w:r>
+      <w:r>
+        <w:t xml:space="preserve">campaign is grounded in the</w:t>
+      </w:r>
+      <w:r>
+        <w:t xml:space="preserve"> </w:t>
+      </w:r>
+      <w:r>
+        <w:t xml:space="preserve">family of kill-chain and attack-lifecycle models used throughout the</w:t>
+      </w:r>
+      <w:r>
+        <w:t xml:space="preserve"> </w:t>
+      </w:r>
+      <w:r>
+        <w:t xml:space="preserve">intrusion-detection and threat-intelligence literature — most influentially</w:t>
+      </w:r>
+      <w:r>
+        <w:t xml:space="preserve"> </w:t>
+      </w:r>
+      <w:r>
+        <w:t xml:space="preserve">the Lockheed Martin Cyber Kill Chain (Hutchins, Cloppert, and Amin, 2011),</w:t>
+      </w:r>
+      <w:r>
+        <w:t xml:space="preserve"> </w:t>
+      </w:r>
+      <w:r>
+        <w:t xml:space="preserve">which decomposes an intrusion into a fixed sequence of stages</w:t>
+      </w:r>
+      <w:r>
+        <w:t xml:space="preserve"> </w:t>
+      </w:r>
+      <w:r>
+        <w:t xml:space="preserve">(reconnaissance, weaponization, delivery, exploitation, installation,</w:t>
+      </w:r>
+      <w:r>
+        <w:t xml:space="preserve"> </w:t>
+      </w:r>
+      <w:r>
+        <w:t xml:space="preserve">command-and-control, and actions on objectives), and the more granular,</w:t>
+      </w:r>
+      <w:r>
+        <w:t xml:space="preserve"> </w:t>
+      </w:r>
+      <w:r>
+        <w:t xml:space="preserve">technique-level MITRE ATT&amp;CK framework, which catalogs specific adversary</w:t>
+      </w:r>
+      <w:r>
+        <w:t xml:space="preserve"> </w:t>
+      </w:r>
+      <w:r>
+        <w:t xml:space="preserve">techniques organized under broadly analogous tactic categories. This</w:t>
+      </w:r>
+      <w:r>
+        <w:t xml:space="preserve"> </w:t>
+      </w:r>
+      <w:r>
+        <w:t xml:space="preserve">project’s</w:t>
+      </w:r>
+      <w:r>
+        <w:t xml:space="preserve"> </w:t>
+      </w:r>
+      <w:r>
+        <w:rPr>
+          <w:rStyle w:val="VerbatimChar"/>
+        </w:rPr>
+        <w:t xml:space="preserve">kill_chain_stage</w:t>
+      </w:r>
+      <w:r>
+        <w:t xml:space="preserve"> </w:t>
+      </w:r>
+      <w:r>
+        <w:t xml:space="preserve">schema field (Chapter 3.2) is a coarsened</w:t>
+      </w:r>
+      <w:r>
+        <w:t xml:space="preserve"> </w:t>
+      </w:r>
+      <w:r>
+        <w:t xml:space="preserve">version of this family of models, chosen to be granular enough to give the</w:t>
+      </w:r>
+      <w:r>
+        <w:t xml:space="preserve"> </w:t>
+      </w:r>
+      <w:r>
+        <w:t xml:space="preserve">correlation agent a genuine stage-progression signal (Section 3.5) while</w:t>
+      </w:r>
+      <w:r>
+        <w:t xml:space="preserve"> </w:t>
+      </w:r>
+      <w:r>
+        <w:t xml:space="preserve">remaining mappable onto both DARPA2000’s own documented phase structure</w:t>
+      </w:r>
+      <w:r>
+        <w:t xml:space="preserve"> </w:t>
+      </w:r>
+      <w:r>
+        <w:t xml:space="preserve">and CICIDS2017’s flat per-technique labels — the two source datasets do</w:t>
+      </w:r>
+      <w:r>
+        <w:t xml:space="preserve"> </w:t>
+      </w:r>
+      <w:r>
+        <w:t xml:space="preserve">not share a stage taxonomy natively, and reconciling them onto one shared</w:t>
+      </w:r>
+      <w:r>
+        <w:t xml:space="preserve"> </w:t>
+      </w:r>
+      <w:r>
+        <w:t xml:space="preserve">scale was itself one of Stage 2’s concrete tasks (Chapter 4.2).</w:t>
+      </w:r>
+    </w:p>
+    <w:bookmarkEnd w:id="30"/>
+    <w:bookmarkStart w:id="31" w:name="reinforcement-learning-foundations"/>
+    <w:p>
+      <w:pPr>
+        <w:pStyle w:val="Heading2"/>
+      </w:pPr>
+      <w:r>
+        <w:t xml:space="preserve">2.4 Reinforcement Learning Foundations</w:t>
+      </w:r>
+    </w:p>
+    <w:p>
+      <w:pPr>
+        <w:pStyle w:val="FirstParagraph"/>
+      </w:pPr>
+      <w:r>
+        <w:t xml:space="preserve">Reinforcement learning formalizes sequential decision-making as a Markov</w:t>
+      </w:r>
+      <w:r>
+        <w:t xml:space="preserve"> </w:t>
+      </w:r>
+      <w:r>
+        <w:t xml:space="preserve">Decision Process (MDP): an agent observes a state, takes an action,</w:t>
+      </w:r>
+      <w:r>
+        <w:t xml:space="preserve"> </w:t>
+      </w:r>
+      <w:r>
+        <w:t xml:space="preserve">receives a reward, and transitions to a next state, with the goal of</w:t>
+      </w:r>
+      <w:r>
+        <w:t xml:space="preserve"> </w:t>
+      </w:r>
+      <w:r>
+        <w:t xml:space="preserve">learning a policy that maximizes expected cumulative (discounted) reward.</w:t>
+      </w:r>
+      <w:r>
+        <w:t xml:space="preserve"> </w:t>
+      </w:r>
+      <w:r>
+        <w:t xml:space="preserve">Q-learning (Watkins and Dayan, 1992) is the foundational value-based</w:t>
+      </w:r>
+      <w:r>
+        <w:t xml:space="preserve"> </w:t>
+      </w:r>
+      <w:r>
+        <w:t xml:space="preserve">algorithm in this family: it learns an action-value function, Q(s, a),</w:t>
+      </w:r>
+      <w:r>
+        <w:t xml:space="preserve"> </w:t>
+      </w:r>
+      <w:r>
+        <w:t xml:space="preserve">estimating the expected return of taking action</w:t>
+      </w:r>
+      <w:r>
+        <w:t xml:space="preserve"> </w:t>
+      </w:r>
+      <w:r>
+        <w:rPr>
+          <w:iCs/>
+          <w:i/>
+        </w:rPr>
+        <w:t xml:space="preserve">a</w:t>
+      </w:r>
+      <w:r>
+        <w:t xml:space="preserve"> </w:t>
+      </w:r>
+      <w:r>
+        <w:t xml:space="preserve">in state</w:t>
+      </w:r>
+      <w:r>
+        <w:t xml:space="preserve"> </w:t>
+      </w:r>
+      <w:r>
+        <w:rPr>
+          <w:iCs/>
+          <w:i/>
+        </w:rPr>
+        <w:t xml:space="preserve">s</w:t>
+      </w:r>
+      <w:r>
+        <w:t xml:space="preserve"> </w:t>
+      </w:r>
+      <w:r>
+        <w:t xml:space="preserve">and</w:t>
+      </w:r>
+      <w:r>
+        <w:t xml:space="preserve"> </w:t>
+      </w:r>
+      <w:r>
+        <w:t xml:space="preserve">acting optimally thereafter, without requiring a model of the environment’s</w:t>
+      </w:r>
+      <w:r>
+        <w:t xml:space="preserve"> </w:t>
+      </w:r>
+      <w:r>
+        <w:t xml:space="preserve">transition dynamics. Deep Q-Networks (DQN; Mnih et al., 2015) extend</w:t>
+      </w:r>
+      <w:r>
+        <w:t xml:space="preserve"> </w:t>
+      </w:r>
+      <w:r>
+        <w:t xml:space="preserve">tabular Q-learning to large or continuous state spaces by approximating</w:t>
+      </w:r>
+      <w:r>
+        <w:t xml:space="preserve"> </w:t>
+      </w:r>
+      <w:r>
+        <w:t xml:space="preserve">Q(s, a) with a neural network, and introduced two mechanisms specifically</w:t>
+      </w:r>
+      <w:r>
+        <w:t xml:space="preserve"> </w:t>
+      </w:r>
+      <w:r>
+        <w:t xml:space="preserve">to stabilize this combination: an experience replay buffer, which</w:t>
+      </w:r>
+      <w:r>
+        <w:t xml:space="preserve"> </w:t>
+      </w:r>
+      <w:r>
+        <w:t xml:space="preserve">decorrelates the sequential training samples a naive online update would</w:t>
+      </w:r>
+      <w:r>
+        <w:t xml:space="preserve"> </w:t>
+      </w:r>
+      <w:r>
+        <w:t xml:space="preserve">otherwise produce, and a separate, periodically-synchronized target</w:t>
+      </w:r>
+      <w:r>
+        <w:t xml:space="preserve"> </w:t>
+      </w:r>
+      <w:r>
+        <w:t xml:space="preserve">network, which prevents the bootstrapped Q-value target from chasing a</w:t>
+      </w:r>
+      <w:r>
+        <w:t xml:space="preserve"> </w:t>
+      </w:r>
+      <w:r>
+        <w:t xml:space="preserve">rapidly-shifting estimate of itself. Subsequent work identified and</w:t>
+      </w:r>
+      <w:r>
+        <w:t xml:space="preserve"> </w:t>
+      </w:r>
+      <w:r>
+        <w:t xml:space="preserve">addressed specific weaknesses in vanilla DQN — most notably Double DQN</w:t>
+      </w:r>
+      <w:r>
+        <w:t xml:space="preserve"> </w:t>
+      </w:r>
+      <w:r>
+        <w:t xml:space="preserve">(Van Hasselt, Guez, and Silver, 2016), which addresses DQN’s tendency to</w:t>
+      </w:r>
+      <w:r>
+        <w:t xml:space="preserve"> </w:t>
+      </w:r>
+      <w:r>
+        <w:t xml:space="preserve">systematically overestimate Q-values by decoupling action selection from</w:t>
+      </w:r>
+      <w:r>
+        <w:t xml:space="preserve"> </w:t>
+      </w:r>
+      <w:r>
+        <w:t xml:space="preserve">action evaluation, and prioritized experience replay, which samples</w:t>
+      </w:r>
+      <w:r>
+        <w:t xml:space="preserve"> </w:t>
+      </w:r>
+      <w:r>
+        <w:t xml:space="preserve">high-error transitions more often than uniform replay does. This project’s</w:t>
+      </w:r>
+      <w:r>
+        <w:t xml:space="preserve"> </w:t>
+      </w:r>
+      <w:r>
+        <w:t xml:space="preserve">implementation (Chapter 4.4) uses standard uniform replay and single-</w:t>
+      </w:r>
+      <w:r>
+        <w:t xml:space="preserve"> </w:t>
+      </w:r>
+      <w:r>
+        <w:t xml:space="preserve">network action selection rather than these refinements; this is a</w:t>
+      </w:r>
+      <w:r>
+        <w:t xml:space="preserve"> </w:t>
+      </w:r>
+      <w:r>
+        <w:t xml:space="preserve">deliberate scope limitation, not an oversight, and is revisited in</w:t>
+      </w:r>
+      <w:r>
+        <w:t xml:space="preserve"> </w:t>
+      </w:r>
+      <w:r>
+        <w:t xml:space="preserve">Chapter 7.4.</w:t>
+      </w:r>
+    </w:p>
+    <w:p>
+      <w:pPr>
+        <w:pStyle w:val="BodyText"/>
+      </w:pPr>
+      <w:r>
+        <w:t xml:space="preserve">Policy-gradient methods take a different approach, directly parameterizing</w:t>
+      </w:r>
+      <w:r>
+        <w:t xml:space="preserve"> </w:t>
+      </w:r>
+      <w:r>
+        <w:t xml:space="preserve">and optimizing a stochastic policy rather than a value function. Trust</w:t>
+      </w:r>
+      <w:r>
+        <w:t xml:space="preserve"> </w:t>
+      </w:r>
+      <w:r>
+        <w:t xml:space="preserve">Region Policy Optimization (TRPO; Schulman et al., 2015) constrains each</w:t>
+      </w:r>
+      <w:r>
+        <w:t xml:space="preserve"> </w:t>
+      </w:r>
+      <w:r>
+        <w:t xml:space="preserve">policy update to a trust region around the current policy to guarantee</w:t>
+      </w:r>
+      <w:r>
+        <w:t xml:space="preserve"> </w:t>
+      </w:r>
+      <w:r>
+        <w:t xml:space="preserve">stable improvement, at significant computational cost per update; Proximal</w:t>
+      </w:r>
+      <w:r>
+        <w:t xml:space="preserve"> </w:t>
+      </w:r>
+      <w:r>
+        <w:t xml:space="preserve">Policy Optimization (PPO; Schulman et al., 2017) approximates the same</w:t>
+      </w:r>
+      <w:r>
+        <w:t xml:space="preserve"> </w:t>
+      </w:r>
+      <w:r>
+        <w:t xml:space="preserve">stabilizing effect far more cheaply via a clipped surrogate objective, and</w:t>
+      </w:r>
+      <w:r>
+        <w:t xml:space="preserve"> </w:t>
+      </w:r>
+      <w:r>
+        <w:t xml:space="preserve">has become one of the most widely used general-purpose deep-RL algorithms,</w:t>
+      </w:r>
+      <w:r>
+        <w:t xml:space="preserve"> </w:t>
+      </w:r>
+      <w:r>
+        <w:t xml:space="preserve">particularly for continuous-control and large-action-space problems.</w:t>
+      </w:r>
+    </w:p>
+    <w:bookmarkEnd w:id="31"/>
+    <w:bookmarkStart w:id="32" w:name="dqn-vs.-ppo-for-this-problem"/>
+    <w:p>
+      <w:pPr>
+        <w:pStyle w:val="Heading2"/>
+      </w:pPr>
+      <w:r>
+        <w:t xml:space="preserve">2.5 DQN vs. PPO for This Problem</w:t>
+      </w:r>
+    </w:p>
+    <w:p>
+      <w:pPr>
+        <w:pStyle w:val="FirstParagraph"/>
+      </w:pPr>
+      <w:r>
+        <w:t xml:space="preserve">Section 2.4’s algorithm families differ principally in the action spaces</w:t>
+      </w:r>
+      <w:r>
+        <w:t xml:space="preserve"> </w:t>
+      </w:r>
+      <w:r>
+        <w:t xml:space="preserve">and update stability tradeoffs they were designed around. PPO’s clipped-</w:t>
+      </w:r>
+      <w:r>
+        <w:t xml:space="preserve"> </w:t>
+      </w:r>
+      <w:r>
+        <w:t xml:space="preserve">surrogate mechanism earns its complexity in continuous or very large</w:t>
+      </w:r>
+      <w:r>
+        <w:t xml:space="preserve"> </w:t>
+      </w:r>
+      <w:r>
+        <w:t xml:space="preserve">discrete action spaces, where naive value-based methods struggle to</w:t>
+      </w:r>
+      <w:r>
+        <w:t xml:space="preserve"> </w:t>
+      </w:r>
+      <w:r>
+        <w:t xml:space="preserve">represent or search over the action set efficiently. The correlation</w:t>
+      </w:r>
+      <w:r>
+        <w:t xml:space="preserve"> </w:t>
+      </w:r>
+      <w:r>
+        <w:t xml:space="preserve">decision in this project is a</w:t>
       </w:r>
       <w:r>
         <w:t xml:space="preserve"> </w:t>
@@ -1634,76 +2317,709 @@
           <w:bCs/>
           <w:b/>
         </w:rPr>
-        <w:t xml:space="preserve">CICIDS2017</w:t>
-      </w:r>
-      <w:r>
-        <w:t xml:space="preserve"> </w:t>
-      </w:r>
-      <w:r>
-        <w:t xml:space="preserve">(Sharafaldin,</w:t>
-      </w:r>
-      <w:r>
-        <w:t xml:space="preserve"> </w:t>
-      </w:r>
-      <w:r>
-        <w:t xml:space="preserve">Lashkari, and Ghorbani, 2018) is used as the primary training and</w:t>
-      </w:r>
-      <w:r>
-        <w:t xml:space="preserve"> </w:t>
-      </w:r>
-      <w:r>
-        <w:t xml:space="preserve">same-distribution validation dataset for both the Stage 3 identifier and</w:t>
-      </w:r>
-      <w:r>
-        <w:t xml:space="preserve"> </w:t>
-      </w:r>
-      <w:r>
-        <w:t xml:space="preserve">the Stage 4 correlator; it is a large, modern, labeled network-traffic</w:t>
-      </w:r>
-      <w:r>
-        <w:t xml:space="preserve"> </w:t>
-      </w:r>
-      <w:r>
-        <w:t xml:space="preserve">dataset but, notably, ships no native multi-stage campaign labels</w:t>
-      </w:r>
-      <w:r>
-        <w:t xml:space="preserve"> </w:t>
-      </w:r>
-      <w:r>
-        <w:t xml:space="preserve">(Chapter 4).</w:t>
-      </w:r>
-      <w:r>
-        <w:t xml:space="preserve"> </w:t>
-      </w:r>
+        <w:t xml:space="preserve">binary, discrete</w:t>
+      </w:r>
+      <w:r>
+        <w:t xml:space="preserve"> </w:t>
+      </w:r>
+      <w:r>
+        <w:t xml:space="preserve">action — link or</w:t>
+      </w:r>
+      <w:r>
+        <w:t xml:space="preserve"> </w:t>
+      </w:r>
+      <w:r>
+        <w:t xml:space="preserve">don’t-link — which is precisely the small, discrete action space DQN was</w:t>
+      </w:r>
+      <w:r>
+        <w:t xml:space="preserve"> </w:t>
+      </w:r>
+      <w:r>
+        <w:t xml:space="preserve">designed for, and does not require any of the machinery PPO adds value</w:t>
+      </w:r>
+      <w:r>
+        <w:t xml:space="preserve"> </w:t>
+      </w:r>
+      <w:r>
+        <w:t xml:space="preserve">for. DQN was selected as the better-fitting, simpler algorithm for this</w:t>
+      </w:r>
+      <w:r>
+        <w:t xml:space="preserve"> </w:t>
+      </w:r>
+      <w:r>
+        <w:t xml:space="preserve">specific action space, not as a default or a convenience choice; a</w:t>
+      </w:r>
+      <w:r>
+        <w:t xml:space="preserve"> </w:t>
+      </w:r>
+      <w:r>
+        <w:t xml:space="preserve">policy-gradient method remains a reasonable alternative worth testing in</w:t>
+      </w:r>
+      <w:r>
+        <w:t xml:space="preserve"> </w:t>
+      </w:r>
+      <w:r>
+        <w:t xml:space="preserve">future work (Chapter 8.2), but nothing about this problem’s action space</w:t>
+      </w:r>
+      <w:r>
+        <w:t xml:space="preserve"> </w:t>
+      </w:r>
+      <w:r>
+        <w:t xml:space="preserve">argues for one over DQN.</w:t>
+      </w:r>
+    </w:p>
+    <w:p>
+      <w:pPr>
+        <w:pStyle w:val="BodyText"/>
+      </w:pPr>
+      <w:r>
+        <w:t xml:space="preserve">The DQN implementation in this project includes the algorithm’s core</w:t>
+      </w:r>
+      <w:r>
+        <w:t xml:space="preserve"> </w:t>
+      </w:r>
+      <w:r>
+        <w:t xml:space="preserve">stabilizing components described in Section 2.4: an experience replay</w:t>
+      </w:r>
+      <w:r>
+        <w:t xml:space="preserve"> </w:t>
+      </w:r>
+      <w:r>
+        <w:t xml:space="preserve">buffer, a target network synchronized periodically with the policy</w:t>
+      </w:r>
+      <w:r>
+        <w:t xml:space="preserve"> </w:t>
+      </w:r>
+      <w:r>
+        <w:t xml:space="preserve">network, epsilon-greedy exploration with decay, and a discount factor</w:t>
+      </w:r>
+      <w:r>
+        <w:t xml:space="preserve"> </w:t>
+      </w:r>
+      <w:r>
+        <w:t xml:space="preserve">applied over genuine multi-step episodes (Section 2.2 above; formalized as</w:t>
+      </w:r>
+      <w:r>
+        <w:t xml:space="preserve"> </w:t>
+      </w:r>
+      <w:r>
+        <w:t xml:space="preserve">an MDP in Section 3.5). It does not include Double DQN’s decoupled action</w:t>
+      </w:r>
+      <w:r>
+        <w:t xml:space="preserve"> </w:t>
+      </w:r>
+      <w:r>
+        <w:t xml:space="preserve">selection or prioritized replay (Section 2.4), a disclosed scope</w:t>
+      </w:r>
+      <w:r>
+        <w:t xml:space="preserve"> </w:t>
+      </w:r>
+      <w:r>
+        <w:t xml:space="preserve">limitation. It also substitutes</w:t>
+      </w:r>
+      <w:r>
+        <w:t xml:space="preserve"> </w:t>
+      </w:r>
+      <w:r>
+        <w:rPr>
+          <w:rStyle w:val="VerbatimChar"/>
+        </w:rPr>
+        <w:t xml:space="preserve">scikit-learn</w:t>
+      </w:r>
+      <w:r>
+        <w:t xml:space="preserve">’s</w:t>
+      </w:r>
+      <w:r>
+        <w:t xml:space="preserve"> </w:t>
+      </w:r>
+      <w:r>
+        <w:rPr>
+          <w:rStyle w:val="VerbatimChar"/>
+        </w:rPr>
+        <w:t xml:space="preserve">MLPRegressor</w:t>
+      </w:r>
+      <w:r>
+        <w:t xml:space="preserve"> </w:t>
+      </w:r>
+      <w:r>
+        <w:t xml:space="preserve">for a</w:t>
+      </w:r>
+      <w:r>
+        <w:t xml:space="preserve"> </w:t>
+      </w:r>
+      <w:r>
+        <w:t xml:space="preserve">standard deep-learning framework, a disclosed environment-driven</w:t>
+      </w:r>
+      <w:r>
+        <w:t xml:space="preserve"> </w:t>
+      </w:r>
+      <w:r>
+        <w:t xml:space="preserve">engineering decision described in Chapter 4.4 and revisited as a</w:t>
+      </w:r>
+      <w:r>
+        <w:t xml:space="preserve"> </w:t>
+      </w:r>
+      <w:r>
+        <w:t xml:space="preserve">limitation in Chapter 7.4.</w:t>
+      </w:r>
+    </w:p>
+    <w:bookmarkEnd w:id="32"/>
+    <w:bookmarkStart w:id="33" w:name="X544b8a4a762e9019c19b03031eaa7dbcfa5b3c6"/>
+    <w:p>
+      <w:pPr>
+        <w:pStyle w:val="Heading2"/>
+      </w:pPr>
+      <w:r>
+        <w:t xml:space="preserve">2.6 Reinforcement Learning Applied to Cybersecurity</w:t>
+      </w:r>
+    </w:p>
+    <w:p>
+      <w:pPr>
+        <w:pStyle w:val="FirstParagraph"/>
+      </w:pPr>
+      <w:r>
+        <w:t xml:space="preserve">Beyond alert correlation specifically, reinforcement learning has been</w:t>
+      </w:r>
+      <w:r>
+        <w:t xml:space="preserve"> </w:t>
+      </w:r>
+      <w:r>
+        <w:t xml:space="preserve">applied across several cybersecurity subareas: adaptive intrusion-</w:t>
+      </w:r>
+      <w:r>
+        <w:t xml:space="preserve"> </w:t>
+      </w:r>
+      <w:r>
+        <w:t xml:space="preserve">response and mitigation-selection systems that learn which defensive</w:t>
+      </w:r>
+      <w:r>
+        <w:t xml:space="preserve"> </w:t>
+      </w:r>
+      <w:r>
+        <w:t xml:space="preserve">action to take given an observed attack state; autonomous penetration-</w:t>
+      </w:r>
+      <w:r>
+        <w:t xml:space="preserve"> </w:t>
+      </w:r>
+      <w:r>
+        <w:t xml:space="preserve">testing and red-teaming agents that learn attack-path selection within a</w:t>
+      </w:r>
+      <w:r>
+        <w:t xml:space="preserve"> </w:t>
+      </w:r>
+      <w:r>
+        <w:t xml:space="preserve">network model; and RL-based intrusion</w:t>
+      </w:r>
+      <w:r>
+        <w:t xml:space="preserve"> </w:t>
+      </w:r>
+      <w:r>
+        <w:rPr>
+          <w:iCs/>
+          <w:i/>
+        </w:rPr>
+        <w:t xml:space="preserve">detection</w:t>
+      </w:r>
+      <w:r>
+        <w:t xml:space="preserve"> </w:t>
+      </w:r>
+      <w:r>
+        <w:t xml:space="preserve">(as opposed to</w:t>
+      </w:r>
+      <w:r>
+        <w:t xml:space="preserve"> </w:t>
+      </w:r>
+      <w:r>
+        <w:t xml:space="preserve">correlation), where an agent learns to classify or flag traffic directly.</w:t>
+      </w:r>
+      <w:r>
+        <w:t xml:space="preserve"> </w:t>
+      </w:r>
+      <w:r>
+        <w:t xml:space="preserve">This broader literature motivates RL as a viable tool in the security</w:t>
+      </w:r>
+      <w:r>
+        <w:t xml:space="preserve"> </w:t>
+      </w:r>
+      <w:r>
+        <w:t xml:space="preserve">domain generally, but the great majority of it targets a different problem</w:t>
+      </w:r>
+      <w:r>
+        <w:t xml:space="preserve"> </w:t>
+      </w:r>
+      <w:r>
+        <w:t xml:space="preserve">than this thesis: either the</w:t>
+      </w:r>
+      <w:r>
+        <w:t xml:space="preserve"> </w:t>
+      </w:r>
+      <w:r>
+        <w:rPr>
+          <w:iCs/>
+          <w:i/>
+        </w:rPr>
+        <w:t xml:space="preserve">detection</w:t>
+      </w:r>
+      <w:r>
+        <w:t xml:space="preserve">/</w:t>
+      </w:r>
+      <w:r>
+        <w:rPr>
+          <w:iCs/>
+          <w:i/>
+        </w:rPr>
+        <w:t xml:space="preserve">response</w:t>
+      </w:r>
+      <w:r>
+        <w:t xml:space="preserve"> </w:t>
+      </w:r>
+      <w:r>
+        <w:t xml:space="preserve">decision (this</w:t>
+      </w:r>
+      <w:r>
+        <w:t xml:space="preserve"> </w:t>
+      </w:r>
+      <w:r>
+        <w:t xml:space="preserve">project deliberately excludes RL from detection and response, restricting</w:t>
+      </w:r>
+      <w:r>
+        <w:t xml:space="preserve"> </w:t>
+      </w:r>
+      <w:r>
+        <w:t xml:space="preserve">it to the narrower correlation decision, Section 1.3) or an</w:t>
+      </w:r>
+      <w:r>
+        <w:t xml:space="preserve"> </w:t>
+      </w:r>
+      <w:r>
+        <w:rPr>
+          <w:iCs/>
+          <w:i/>
+        </w:rPr>
+        <w:t xml:space="preserve">offensive</w:t>
+      </w:r>
+      <w:r>
+        <w:t xml:space="preserve"> </w:t>
+      </w:r>
+      <w:r>
+        <w:t xml:space="preserve">planning problem (attack-path selection), rather than the</w:t>
+      </w:r>
+      <w:r>
+        <w:t xml:space="preserve"> </w:t>
+      </w:r>
+      <w:r>
+        <w:rPr>
+          <w:iCs/>
+          <w:i/>
+        </w:rPr>
+        <w:t xml:space="preserve">defensive,</w:t>
+      </w:r>
+      <w:r>
+        <w:rPr>
+          <w:iCs/>
+          <w:i/>
+        </w:rPr>
+        <w:t xml:space="preserve"> </w:t>
+      </w:r>
+      <w:r>
+        <w:rPr>
+          <w:iCs/>
+          <w:i/>
+        </w:rPr>
+        <w:t xml:space="preserve">post-hoc correlation</w:t>
+      </w:r>
+      <w:r>
+        <w:t xml:space="preserve"> </w:t>
+      </w:r>
+      <w:r>
+        <w:t xml:space="preserve">problem this thesis addresses. This project’s</w:t>
+      </w:r>
+      <w:r>
+        <w:t xml:space="preserve"> </w:t>
+      </w:r>
+      <w:r>
+        <w:t xml:space="preserve">specific combination — RL restricted to a binary correlation decision,</w:t>
+      </w:r>
+      <w:r>
+        <w:t xml:space="preserve"> </w:t>
+      </w:r>
+      <w:r>
+        <w:t xml:space="preserve">evaluated with a genuinely external, structurally different test set — is</w:t>
+      </w:r>
+      <w:r>
+        <w:t xml:space="preserve"> </w:t>
+      </w:r>
+      <w:r>
+        <w:t xml:space="preserve">comparatively underrepresented in this literature relative to RL-based</w:t>
+      </w:r>
+      <w:r>
+        <w:t xml:space="preserve"> </w:t>
+      </w:r>
+      <w:r>
+        <w:t xml:space="preserve">detection work, which more commonly reports same-distribution validation</w:t>
+      </w:r>
+      <w:r>
+        <w:t xml:space="preserve"> </w:t>
+      </w:r>
+      <w:r>
+        <w:t xml:space="preserve">results only, a gap this thesis’s Chapter 6 finding speaks directly to.</w:t>
+      </w:r>
+    </w:p>
+    <w:bookmarkEnd w:id="33"/>
+    <w:bookmarkStart w:id="34" w:name="datasets"/>
+    <w:p>
+      <w:pPr>
+        <w:pStyle w:val="Heading2"/>
+      </w:pPr>
+      <w:r>
+        <w:t xml:space="preserve">2.7 Datasets</w:t>
+      </w:r>
+    </w:p>
+    <w:p>
+      <w:pPr>
+        <w:pStyle w:val="FirstParagraph"/>
+      </w:pPr>
       <w:r>
         <w:rPr>
           <w:bCs/>
           <w:b/>
         </w:rPr>
+        <w:t xml:space="preserve">DARPA2000</w:t>
+      </w:r>
+      <w:r>
+        <w:t xml:space="preserve"> </w:t>
+      </w:r>
+      <w:r>
+        <w:t xml:space="preserve">(MIT Lincoln Laboratory) is used as this project’s external,</w:t>
+      </w:r>
+      <w:r>
+        <w:t xml:space="preserve"> </w:t>
+      </w:r>
+      <w:r>
+        <w:t xml:space="preserve">held-out evaluation set. It comprises two labeled multi-stage intrusion</w:t>
+      </w:r>
+      <w:r>
+        <w:t xml:space="preserve"> </w:t>
+      </w:r>
+      <w:r>
+        <w:t xml:space="preserve">scenarios, LLDOS 1.0 and LLDOS 2.0.2, and remains, as of this writing, one</w:t>
+      </w:r>
+      <w:r>
+        <w:t xml:space="preserve"> </w:t>
+      </w:r>
+      <w:r>
+        <w:t xml:space="preserve">of the few datasets with genuine, dataset-native multi-phase campaign</w:t>
+      </w:r>
+      <w:r>
+        <w:t xml:space="preserve"> </w:t>
+      </w:r>
+      <w:r>
+        <w:t xml:space="preserve">ground truth designed specifically to exercise correlation research — a</w:t>
+      </w:r>
+      <w:r>
+        <w:t xml:space="preserve"> </w:t>
+      </w:r>
+      <w:r>
+        <w:t xml:space="preserve">property this project’s own Stage 2 work confirmed newer flow-centric</w:t>
+      </w:r>
+      <w:r>
+        <w:t xml:space="preserve"> </w:t>
+      </w:r>
+      <w:r>
+        <w:t xml:space="preserve">datasets do not have natively (Chapter 4). Its age and known limitations</w:t>
+      </w:r>
+      <w:r>
+        <w:t xml:space="preserve"> </w:t>
+      </w:r>
+      <w:r>
+        <w:t xml:space="preserve">(Chapter 7.3) are a standard, acknowledged tradeoff in the correlation</w:t>
+      </w:r>
+      <w:r>
+        <w:t xml:space="preserve"> </w:t>
+      </w:r>
+      <w:r>
+        <w:t xml:space="preserve">literature, not unique to this project: newer datasets with realistic</w:t>
+      </w:r>
+      <w:r>
+        <w:t xml:space="preserve"> </w:t>
+      </w:r>
+      <w:r>
+        <w:t xml:space="preserve">traffic volumes have generally not been constructed with genuine</w:t>
+      </w:r>
+      <w:r>
+        <w:t xml:space="preserve"> </w:t>
+      </w:r>
+      <w:r>
+        <w:t xml:space="preserve">multi-phase campaign ground truth as a design goal, which is itself an</w:t>
+      </w:r>
+      <w:r>
+        <w:t xml:space="preserve"> </w:t>
+      </w:r>
+      <w:r>
+        <w:t xml:space="preserve">observation this project’s Stage 2 work makes concrete (Section 2.7,</w:t>
+      </w:r>
+      <w:r>
+        <w:t xml:space="preserve"> </w:t>
+      </w:r>
+      <w:r>
+        <w:t xml:space="preserve">CICIDS2017 below).</w:t>
+      </w:r>
+    </w:p>
+    <w:p>
+      <w:pPr>
+        <w:pStyle w:val="BodyText"/>
+      </w:pPr>
+      <w:r>
+        <w:rPr>
+          <w:bCs/>
+          <w:b/>
+        </w:rPr>
+        <w:t xml:space="preserve">CICIDS2017</w:t>
+      </w:r>
+      <w:r>
+        <w:t xml:space="preserve"> </w:t>
+      </w:r>
+      <w:r>
+        <w:t xml:space="preserve">(Sharafaldin, Lashkari, and Ghorbani, 2018) is used as the</w:t>
+      </w:r>
+      <w:r>
+        <w:t xml:space="preserve"> </w:t>
+      </w:r>
+      <w:r>
+        <w:t xml:space="preserve">primary training and same-distribution validation dataset for both the</w:t>
+      </w:r>
+      <w:r>
+        <w:t xml:space="preserve"> </w:t>
+      </w:r>
+      <w:r>
+        <w:t xml:space="preserve">Stage 3 identifier and the Stage 4 correlator. It is a large, modern,</w:t>
+      </w:r>
+      <w:r>
+        <w:t xml:space="preserve"> </w:t>
+      </w:r>
+      <w:r>
+        <w:t xml:space="preserve">labeled network-traffic dataset built specifically to address well-known</w:t>
+      </w:r>
+      <w:r>
+        <w:t xml:space="preserve"> </w:t>
+      </w:r>
+      <w:r>
+        <w:t xml:space="preserve">shortcomings of older intrusion-detection datasets (limited traffic</w:t>
+      </w:r>
+      <w:r>
+        <w:t xml:space="preserve"> </w:t>
+      </w:r>
+      <w:r>
+        <w:t xml:space="preserve">diversity, unrealistic background traffic, missing modern attack types),</w:t>
+      </w:r>
+      <w:r>
+        <w:t xml:space="preserve"> </w:t>
+      </w:r>
+      <w:r>
+        <w:t xml:space="preserve">and has become one of the most widely used benchmarks in recent network-</w:t>
+      </w:r>
+      <w:r>
+        <w:t xml:space="preserve"> </w:t>
+      </w:r>
+      <w:r>
+        <w:t xml:space="preserve">intrusion-detection ML research. It ships no native multi-stage campaign</w:t>
+      </w:r>
+      <w:r>
+        <w:t xml:space="preserve"> </w:t>
+      </w:r>
+      <w:r>
+        <w:t xml:space="preserve">labels, however — every attack type is captured as a separate, single-</w:t>
+      </w:r>
+      <w:r>
+        <w:t xml:space="preserve"> </w:t>
+      </w:r>
+      <w:r>
+        <w:t xml:space="preserve">technique file — which is precisely why Stage 2 had to derive campaign</w:t>
+      </w:r>
+      <w:r>
+        <w:t xml:space="preserve"> </w:t>
+      </w:r>
+      <w:r>
+        <w:t xml:space="preserve">structure rather than read it directly (Chapter 4.2), and is the dataset</w:t>
+      </w:r>
+      <w:r>
+        <w:t xml:space="preserve"> </w:t>
+      </w:r>
+      <w:r>
+        <w:t xml:space="preserve">property most directly responsible for this project’s insistence on a</w:t>
+      </w:r>
+      <w:r>
+        <w:t xml:space="preserve"> </w:t>
+      </w:r>
+      <w:r>
+        <w:t xml:space="preserve">second, genuinely campaign-labeled dataset (DARPA2000) for the headline</w:t>
+      </w:r>
+      <w:r>
+        <w:t xml:space="preserve"> </w:t>
+      </w:r>
+      <w:r>
+        <w:t xml:space="preserve">evaluation.</w:t>
+      </w:r>
+    </w:p>
+    <w:p>
+      <w:pPr>
+        <w:pStyle w:val="BodyText"/>
+      </w:pPr>
+      <w:r>
+        <w:rPr>
+          <w:bCs/>
+          <w:b/>
+        </w:rPr>
         <w:t xml:space="preserve">UNSW-NB15</w:t>
       </w:r>
       <w:r>
         <w:t xml:space="preserve"> </w:t>
       </w:r>
       <w:r>
-        <w:t xml:space="preserve">(Moustafa and Slay, 2015) is used as an</w:t>
-      </w:r>
-      <w:r>
-        <w:t xml:space="preserve"> </w:t>
-      </w:r>
-      <w:r>
-        <w:t xml:space="preserve">optional, secondary cross-check dataset for the identification methodology</w:t>
-      </w:r>
-      <w:r>
-        <w:t xml:space="preserve"> </w:t>
-      </w:r>
-      <w:r>
-        <w:t xml:space="preserve">only (Chapter 4, Stage 3b).</w:t>
-      </w:r>
-    </w:p>
-    <w:bookmarkEnd w:id="31"/>
-    <w:bookmarkEnd w:id="32"/>
-    <w:bookmarkStart w:id="37" w:name="chapter-3-system-design"/>
+        <w:t xml:space="preserve">(Moustafa and Slay, 2015) is used as an optional, secondary</w:t>
+      </w:r>
+      <w:r>
+        <w:t xml:space="preserve"> </w:t>
+      </w:r>
+      <w:r>
+        <w:t xml:space="preserve">cross-check dataset for the identification methodology only (Chapter 4,</w:t>
+      </w:r>
+      <w:r>
+        <w:t xml:space="preserve"> </w:t>
+      </w:r>
+      <w:r>
+        <w:t xml:space="preserve">Stage 3b). It was constructed specifically to be a harder, more modern</w:t>
+      </w:r>
+      <w:r>
+        <w:t xml:space="preserve"> </w:t>
+      </w:r>
+      <w:r>
+        <w:t xml:space="preserve">alternative to older benchmarks, with a hybrid of real modern and</w:t>
+      </w:r>
+      <w:r>
+        <w:t xml:space="preserve"> </w:t>
+      </w:r>
+      <w:r>
+        <w:t xml:space="preserve">synthetically generated attack traffic across nine attack categories, and</w:t>
+      </w:r>
+      <w:r>
+        <w:t xml:space="preserve"> </w:t>
+      </w:r>
+      <w:r>
+        <w:t xml:space="preserve">is widely acknowledged in the classification literature as a harder,</w:t>
+      </w:r>
+      <w:r>
+        <w:t xml:space="preserve"> </w:t>
+      </w:r>
+      <w:r>
+        <w:t xml:space="preserve">noisier classification problem than CICIDS2017 — consistent with, and</w:t>
+      </w:r>
+      <w:r>
+        <w:t xml:space="preserve"> </w:t>
+      </w:r>
+      <w:r>
+        <w:t xml:space="preserve">part of the motivation for treating as unsurprising, this project’s own</w:t>
+      </w:r>
+      <w:r>
+        <w:t xml:space="preserve"> </w:t>
+      </w:r>
+      <w:r>
+        <w:t xml:space="preserve">Stage 3b finding of substantially lower classification performance on it</w:t>
+      </w:r>
+      <w:r>
+        <w:t xml:space="preserve"> </w:t>
+      </w:r>
+      <w:r>
+        <w:t xml:space="preserve">(Chapter 5.2).</w:t>
+      </w:r>
+    </w:p>
+    <w:bookmarkEnd w:id="34"/>
+    <w:bookmarkStart w:id="35" w:name="X725375b09acbbaa315f6615099755dbaa69c985"/>
+    <w:p>
+      <w:pPr>
+        <w:pStyle w:val="Heading2"/>
+      </w:pPr>
+      <w:r>
+        <w:t xml:space="preserve">2.8 Positioning This Thesis Relative to Prior Work</w:t>
+      </w:r>
+    </w:p>
+    <w:p>
+      <w:pPr>
+        <w:pStyle w:val="FirstParagraph"/>
+      </w:pPr>
+      <w:r>
+        <w:t xml:space="preserve">Relative to the correlation literature summarized in Section 2.2, this</w:t>
+      </w:r>
+      <w:r>
+        <w:t xml:space="preserve"> </w:t>
+      </w:r>
+      <w:r>
+        <w:t xml:space="preserve">thesis’s contribution is not a new correlation algorithm family in the</w:t>
+      </w:r>
+      <w:r>
+        <w:t xml:space="preserve"> </w:t>
+      </w:r>
+      <w:r>
+        <w:t xml:space="preserve">abstract, but a specific, disciplined combination of an existing one (DQN,</w:t>
+      </w:r>
+      <w:r>
+        <w:t xml:space="preserve"> </w:t>
+      </w:r>
+      <w:r>
+        <w:t xml:space="preserve">Section 2.4–2.5) with an evaluation methodology — campaign-level leakage-</w:t>
+      </w:r>
+      <w:r>
+        <w:t xml:space="preserve"> </w:t>
+      </w:r>
+      <w:r>
+        <w:t xml:space="preserve">free splitting enforced in code, and headline evaluation on a genuinely</w:t>
+      </w:r>
+      <w:r>
+        <w:t xml:space="preserve"> </w:t>
+      </w:r>
+      <w:r>
+        <w:t xml:space="preserve">external, structurally different dataset — that is comparatively rare in</w:t>
+      </w:r>
+      <w:r>
+        <w:t xml:space="preserve"> </w:t>
+      </w:r>
+      <w:r>
+        <w:t xml:space="preserve">the ML-based alert-correlation and RL-for-cybersecurity literature</w:t>
+      </w:r>
+      <w:r>
+        <w:t xml:space="preserve"> </w:t>
+      </w:r>
+      <w:r>
+        <w:t xml:space="preserve">(Section 2.6), where same-distribution validation is more commonly</w:t>
+      </w:r>
+      <w:r>
+        <w:t xml:space="preserve"> </w:t>
+      </w:r>
+      <w:r>
+        <w:t xml:space="preserve">reported as the primary or only result. Section 6.1’s central finding — a</w:t>
+      </w:r>
+      <w:r>
+        <w:t xml:space="preserve"> </w:t>
+      </w:r>
+      <w:r>
+        <w:t xml:space="preserve">strong same-distribution result that does not transfer externally — is</w:t>
+      </w:r>
+      <w:r>
+        <w:t xml:space="preserve"> </w:t>
+      </w:r>
+      <w:r>
+        <w:t xml:space="preserve">offered as direct empirical evidence for why that evaluation methodology</w:t>
+      </w:r>
+      <w:r>
+        <w:t xml:space="preserve"> </w:t>
+      </w:r>
+      <w:r>
+        <w:t xml:space="preserve">matters, not only as a caveat about this particular model.</w:t>
+      </w:r>
+    </w:p>
+    <w:bookmarkEnd w:id="35"/>
+    <w:bookmarkEnd w:id="36"/>
+    <w:bookmarkStart w:id="42" w:name="chapter-3-system-design"/>
     <w:p>
       <w:pPr>
         <w:pStyle w:val="Heading1"/>
@@ -1712,13 +3028,13 @@
         <w:t xml:space="preserve">Chapter 3 — System Design</w:t>
       </w:r>
     </w:p>
-    <w:bookmarkStart w:id="33" w:name="two-model-architecture"/>
+    <w:bookmarkStart w:id="37" w:name="Xfa00e395d2f498d5a8dff5d55bf6989770c1fd6"/>
     <w:p>
       <w:pPr>
         <w:pStyle w:val="Heading2"/>
       </w:pPr>
       <w:r>
-        <w:t xml:space="preserve">3.1 Two-Model Architecture</w:t>
+        <w:t xml:space="preserve">3.1 Design Requirements Derived from Chapter 2</w:t>
       </w:r>
     </w:p>
     <w:p>
@@ -1726,13 +3042,121 @@
         <w:pStyle w:val="FirstParagraph"/>
       </w:pPr>
       <w:r>
+        <w:t xml:space="preserve">Four requirements, each traceable to a specific point in Chapter 2’s</w:t>
+      </w:r>
+      <w:r>
+        <w:t xml:space="preserve"> </w:t>
+      </w:r>
+      <w:r>
+        <w:t xml:space="preserve">review, drove the system-design decisions in this chapter. First, Section</w:t>
+      </w:r>
+      <w:r>
+        <w:t xml:space="preserve"> </w:t>
+      </w:r>
+      <w:r>
+        <w:t xml:space="preserve">2.2’s observation that ML-based correlation is the family most exposed to</w:t>
+      </w:r>
+      <w:r>
+        <w:t xml:space="preserve"> </w:t>
+      </w:r>
+      <w:r>
+        <w:t xml:space="preserve">data leakage argues for leakage prevention being a first-class, code-</w:t>
+      </w:r>
+      <w:r>
+        <w:t xml:space="preserve"> </w:t>
+      </w:r>
+      <w:r>
+        <w:t xml:space="preserve">enforced property of the pipeline rather than an evaluation afterthought</w:t>
+      </w:r>
+      <w:r>
+        <w:t xml:space="preserve"> </w:t>
+      </w:r>
+      <w:r>
+        <w:t xml:space="preserve">(Section 3.4). Second, Section 2.3’s kill-chain framing argues for an</w:t>
+      </w:r>
+      <w:r>
+        <w:t xml:space="preserve"> </w:t>
+      </w:r>
+      <w:r>
+        <w:t xml:space="preserve">explicit, shared stage taxonomy that both source datasets can be mapped</w:t>
+      </w:r>
+      <w:r>
+        <w:t xml:space="preserve"> </w:t>
+      </w:r>
+      <w:r>
+        <w:t xml:space="preserve">onto, so that stage-progression information is available to the</w:t>
+      </w:r>
+      <w:r>
+        <w:t xml:space="preserve"> </w:t>
+      </w:r>
+      <w:r>
+        <w:t xml:space="preserve">correlator regardless of which dataset an event came from (Section 3.2).</w:t>
+      </w:r>
+      <w:r>
+        <w:t xml:space="preserve"> </w:t>
+      </w:r>
+      <w:r>
+        <w:t xml:space="preserve">Third, Section 2.4-2.5’s action-space argument for DQN over policy-gradient</w:t>
+      </w:r>
+      <w:r>
+        <w:t xml:space="preserve"> </w:t>
+      </w:r>
+      <w:r>
+        <w:t xml:space="preserve">methods argues for a correlation decision framed as a genuine, discrete,</w:t>
+      </w:r>
+      <w:r>
+        <w:t xml:space="preserve"> </w:t>
+      </w:r>
+      <w:r>
+        <w:t xml:space="preserve">multi-step MDP rather than a one-shot pairwise classification problem</w:t>
+      </w:r>
+      <w:r>
+        <w:t xml:space="preserve"> </w:t>
+      </w:r>
+      <w:r>
+        <w:t xml:space="preserve">(Section 3.5). Fourth, Section 2.8’s positioning of this thesis around</w:t>
+      </w:r>
+      <w:r>
+        <w:t xml:space="preserve"> </w:t>
+      </w:r>
+      <w:r>
+        <w:t xml:space="preserve">external evaluation argues for a system architecture that can run</w:t>
+      </w:r>
+      <w:r>
+        <w:t xml:space="preserve"> </w:t>
+      </w:r>
+      <w:r>
+        <w:t xml:space="preserve">unmodified against a structurally different second dataset, which in turn</w:t>
+      </w:r>
+      <w:r>
+        <w:t xml:space="preserve"> </w:t>
+      </w:r>
+      <w:r>
+        <w:t xml:space="preserve">requires the shared schema described next.</w:t>
+      </w:r>
+    </w:p>
+    <w:bookmarkEnd w:id="37"/>
+    <w:bookmarkStart w:id="38" w:name="two-model-architecture"/>
+    <w:p>
+      <w:pPr>
+        <w:pStyle w:val="Heading2"/>
+      </w:pPr>
+      <w:r>
+        <w:t xml:space="preserve">3.2 Two-Model Architecture</w:t>
+      </w:r>
+    </w:p>
+    <w:p>
+      <w:pPr>
+        <w:pStyle w:val="FirstParagraph"/>
+      </w:pPr>
+      <w:r>
         <w:t xml:space="preserve">The pipeline deliberately separates two learning problems that are often</w:t>
       </w:r>
       <w:r>
         <w:t xml:space="preserve"> </w:t>
       </w:r>
       <w:r>
-        <w:t xml:space="preserve">conflated in prior alert-correlation work:</w:t>
+        <w:t xml:space="preserve">conflated in prior alert-correlation work (Section 2.2):</w:t>
       </w:r>
     </w:p>
     <w:p>
@@ -1873,14 +3297,58 @@
         <w:t xml:space="preserve">idealized one.</w:t>
       </w:r>
     </w:p>
-    <w:bookmarkEnd w:id="33"/>
-    <w:bookmarkStart w:id="34" w:name="unified-event-schema"/>
+    <w:p>
+      <w:pPr>
+        <w:pStyle w:val="FirstParagraph"/>
+      </w:pPr>
+      <w:r>
+        <w:t xml:space="preserve">Keeping these as two separately trained, separately evaluated models,</w:t>
+      </w:r>
+      <w:r>
+        <w:t xml:space="preserve"> </w:t>
+      </w:r>
+      <w:r>
+        <w:t xml:space="preserve">rather than one end-to-end system, has a direct evaluation benefit</w:t>
+      </w:r>
+      <w:r>
+        <w:t xml:space="preserve"> </w:t>
+      </w:r>
+      <w:r>
+        <w:t xml:space="preserve">beyond the scope commitment in Section 1.3: it lets Chapter 6 attribute</w:t>
+      </w:r>
+      <w:r>
+        <w:t xml:space="preserve"> </w:t>
+      </w:r>
+      <w:r>
+        <w:t xml:space="preserve">weaknesses to a specific stage where possible (e.g., noting that Stage</w:t>
+      </w:r>
+      <w:r>
+        <w:t xml:space="preserve"> </w:t>
+      </w:r>
+      <w:r>
+        <w:t xml:space="preserve">4’s CICIDS2017 training absorbs Stage 3’s actual identification errors,</w:t>
+      </w:r>
+      <w:r>
+        <w:t xml:space="preserve"> </w:t>
+      </w:r>
+      <w:r>
+        <w:t xml:space="preserve">Chapter 7.4) rather than reporting one opaque combined error rate that</w:t>
+      </w:r>
+      <w:r>
+        <w:t xml:space="preserve"> </w:t>
+      </w:r>
+      <w:r>
+        <w:t xml:space="preserve">conflates two different kinds of mistakes.</w:t>
+      </w:r>
+    </w:p>
+    <w:bookmarkEnd w:id="38"/>
+    <w:bookmarkStart w:id="39" w:name="unified-event-schema"/>
     <w:p>
       <w:pPr>
         <w:pStyle w:val="Heading2"/>
       </w:pPr>
       <w:r>
-        <w:t xml:space="preserve">3.2 Unified Event Schema</w:t>
+        <w:t xml:space="preserve">3.3 Unified Event Schema</w:t>
       </w:r>
     </w:p>
     <w:p>
@@ -1927,13 +3395,55 @@
         <w:t xml:space="preserve"> </w:t>
       </w:r>
       <w:r>
-        <w:t xml:space="preserve">implementation to operate over both datasets, and is a prerequisite for the</w:t>
-      </w:r>
-      <w:r>
-        <w:t xml:space="preserve"> </w:t>
-      </w:r>
-      <w:r>
-        <w:t xml:space="preserve">leakage-free split machinery described next.</w:t>
+        <w:t xml:space="preserve">implementation to operate over both datasets unmodified, and is a</w:t>
+      </w:r>
+      <w:r>
+        <w:t xml:space="preserve"> </w:t>
+      </w:r>
+      <w:r>
+        <w:t xml:space="preserve">prerequisite for the leakage-free split machinery described next. It plays</w:t>
+      </w:r>
+      <w:r>
+        <w:t xml:space="preserve"> </w:t>
+      </w:r>
+      <w:r>
+        <w:t xml:space="preserve">the same normalizing role in this project that common event schemas</w:t>
+      </w:r>
+      <w:r>
+        <w:t xml:space="preserve"> </w:t>
+      </w:r>
+      <w:r>
+        <w:t xml:space="preserve">(e.g., the vendor-neutral Common Event Format, or a SIEM vendor’s common</w:t>
+      </w:r>
+      <w:r>
+        <w:t xml:space="preserve"> </w:t>
+      </w:r>
+      <w:r>
+        <w:t xml:space="preserve">information model) play in production SOC tooling — allowing downstream</w:t>
+      </w:r>
+      <w:r>
+        <w:t xml:space="preserve"> </w:t>
+      </w:r>
+      <w:r>
+        <w:t xml:space="preserve">logic to be written once against a stable field set rather than once per</w:t>
+      </w:r>
+      <w:r>
+        <w:t xml:space="preserve"> </w:t>
+      </w:r>
+      <w:r>
+        <w:t xml:space="preserve">sensor vendor or dataset — narrowed here to exactly the fields the</w:t>
+      </w:r>
+      <w:r>
+        <w:t xml:space="preserve"> </w:t>
+      </w:r>
+      <w:r>
+        <w:t xml:space="preserve">correlation task needs (Section 2.3’s kill-chain stage among them) rather</w:t>
+      </w:r>
+      <w:r>
+        <w:t xml:space="preserve"> </w:t>
+      </w:r>
+      <w:r>
+        <w:t xml:space="preserve">than the much larger field sets those production schemas typically carry.</w:t>
       </w:r>
     </w:p>
     <w:p>
@@ -1941,6 +3451,89 @@
         <w:pStyle w:val="BodyText"/>
       </w:pPr>
       <w:r>
+        <w:t xml:space="preserve">The</w:t>
+      </w:r>
+      <w:r>
+        <w:t xml:space="preserve"> </w:t>
+      </w:r>
+      <w:r>
+        <w:rPr>
+          <w:rStyle w:val="VerbatimChar"/>
+        </w:rPr>
+        <w:t xml:space="preserve">kill_chain_stage</w:t>
+      </w:r>
+      <w:r>
+        <w:t xml:space="preserve"> </w:t>
+      </w:r>
+      <w:r>
+        <w:t xml:space="preserve">field is populated differently for each source, a</w:t>
+      </w:r>
+      <w:r>
+        <w:t xml:space="preserve"> </w:t>
+      </w:r>
+      <w:r>
+        <w:t xml:space="preserve">distinction stated explicitly rather than glossed over: DARPA2000’s value</w:t>
+      </w:r>
+      <w:r>
+        <w:t xml:space="preserve"> </w:t>
+      </w:r>
+      <w:r>
+        <w:t xml:space="preserve">is derived from the dataset’s own documented phase structure (genuine</w:t>
+      </w:r>
+      <w:r>
+        <w:t xml:space="preserve"> </w:t>
+      </w:r>
+      <w:r>
+        <w:t xml:space="preserve">ground truth, Section 2.7), while CICIDS2017’s value is either a</w:t>
+      </w:r>
+      <w:r>
+        <w:t xml:space="preserve"> </w:t>
+      </w:r>
+      <w:r>
+        <w:t xml:space="preserve">Stage-3-predicted label (train/validation time, Section 3.2) or, in the</w:t>
+      </w:r>
+      <w:r>
+        <w:t xml:space="preserve"> </w:t>
+      </w:r>
+      <w:r>
+        <w:t xml:space="preserve">one place ground truth is used for CICIDS2017, a direct mapping from its</w:t>
+      </w:r>
+      <w:r>
+        <w:t xml:space="preserve"> </w:t>
+      </w:r>
+      <w:r>
+        <w:t xml:space="preserve">native single-technique label. This asymmetry — one dataset supplying</w:t>
+      </w:r>
+      <w:r>
+        <w:t xml:space="preserve"> </w:t>
+      </w:r>
+      <w:r>
+        <w:t xml:space="preserve">ground-truth stage information, the other supplying a mix of predicted and</w:t>
+      </w:r>
+      <w:r>
+        <w:t xml:space="preserve"> </w:t>
+      </w:r>
+      <w:r>
+        <w:t xml:space="preserve">mapped-from-native-label values — is a real methodological wrinkle,</w:t>
+      </w:r>
+      <w:r>
+        <w:t xml:space="preserve"> </w:t>
+      </w:r>
+      <w:r>
+        <w:t xml:space="preserve">revisited directly in Chapter 6.1’s discussion of Stage 5’s idealized</w:t>
+      </w:r>
+      <w:r>
+        <w:t xml:space="preserve"> </w:t>
+      </w:r>
+      <w:r>
+        <w:t xml:space="preserve">DARPA2000 identification input.</w:t>
+      </w:r>
+    </w:p>
+    <w:p>
+      <w:pPr>
+        <w:pStyle w:val="BodyText"/>
+      </w:pPr>
+      <w:r>
         <w:t xml:space="preserve">The original proposal envisioned a genuine three-tier telemetry design</w:t>
       </w:r>
       <w:r>
@@ -1959,17 +3552,17 @@
         <w:t xml:space="preserve"> </w:t>
       </w:r>
       <w:r>
-        <w:t xml:space="preserve">this gap, and why it exists, is discussed explicitly in Chapter 7.</w:t>
-      </w:r>
-    </w:p>
-    <w:bookmarkEnd w:id="34"/>
-    <w:bookmarkStart w:id="35" w:name="leakage-free-campaign-level-splitting"/>
+        <w:t xml:space="preserve">this gap, and why it exists, is discussed explicitly in Chapter 7.2.</w:t>
+      </w:r>
+    </w:p>
+    <w:bookmarkEnd w:id="39"/>
+    <w:bookmarkStart w:id="40" w:name="leakage-free-campaign-level-splitting"/>
     <w:p>
       <w:pPr>
         <w:pStyle w:val="Heading2"/>
       </w:pPr>
       <w:r>
-        <w:t xml:space="preserve">3.3 Leakage-Free, Campaign-Level Splitting</w:t>
+        <w:t xml:space="preserve">3.4 Leakage-Free, Campaign-Level Splitting</w:t>
       </w:r>
     </w:p>
     <w:p>
@@ -1977,6 +3570,36 @@
         <w:pStyle w:val="FirstParagraph"/>
       </w:pPr>
       <w:r>
+        <w:t xml:space="preserve">Section 2.2 identified data leakage as the ML-correlation literature’s</w:t>
+      </w:r>
+      <w:r>
+        <w:t xml:space="preserve"> </w:t>
+      </w:r>
+      <w:r>
+        <w:t xml:space="preserve">characteristic risk, and Section 1.4 makes avoiding it this thesis’s</w:t>
+      </w:r>
+      <w:r>
+        <w:t xml:space="preserve"> </w:t>
+      </w:r>
+      <w:r>
+        <w:t xml:space="preserve">governing principle; this section is where that principle is translated</w:t>
+      </w:r>
+      <w:r>
+        <w:t xml:space="preserve"> </w:t>
+      </w:r>
+      <w:r>
+        <w:t xml:space="preserve">into a specific, code-enforced mechanism rather than an evaluation-time</w:t>
+      </w:r>
+      <w:r>
+        <w:t xml:space="preserve"> </w:t>
+      </w:r>
+      <w:r>
+        <w:t xml:space="preserve">promise.</w:t>
+      </w:r>
+      <w:r>
+        <w:t xml:space="preserve"> </w:t>
+      </w:r>
+      <w:r>
         <w:rPr>
           <w:rStyle w:val="VerbatimChar"/>
         </w:rPr>
@@ -1986,13 +3609,13 @@
         <w:t xml:space="preserve"> </w:t>
       </w:r>
       <w:r>
-        <w:t xml:space="preserve">provides two functions that are the concrete, checked-in-</w:t>
-      </w:r>
-      <w:r>
-        <w:t xml:space="preserve"> </w:t>
-      </w:r>
-      <w:r>
-        <w:t xml:space="preserve">code backing for every</w:t>
+        <w:t xml:space="preserve">provides two functions that are the concrete</w:t>
+      </w:r>
+      <w:r>
+        <w:t xml:space="preserve"> </w:t>
+      </w:r>
+      <w:r>
+        <w:t xml:space="preserve">backing for every</w:t>
       </w:r>
       <w:r>
         <w:t xml:space="preserve"> </w:t>
@@ -2010,13 +3633,7 @@
         <w:t xml:space="preserve"> </w:t>
       </w:r>
       <w:r>
-        <w:t xml:space="preserve">claim made about this project’s</w:t>
-      </w:r>
-      <w:r>
-        <w:t xml:space="preserve"> </w:t>
-      </w:r>
-      <w:r>
-        <w:t xml:space="preserve">results:</w:t>
+        <w:t xml:space="preserve">claim made about this project’s results:</w:t>
       </w:r>
       <w:r>
         <w:t xml:space="preserve"> </w:t>
@@ -2028,13 +3645,13 @@
         <w:t xml:space="preserve">assert_no_campaign_leakage</w:t>
       </w:r>
       <w:r>
-        <w:t xml:space="preserve">, which verifies that no campaign</w:t>
-      </w:r>
-      <w:r>
-        <w:t xml:space="preserve"> </w:t>
-      </w:r>
-      <w:r>
-        <w:t xml:space="preserve">identifier appears on both sides of a train/test split, and</w:t>
+        <w:t xml:space="preserve">, which verifies that no campaign identifier</w:t>
+      </w:r>
+      <w:r>
+        <w:t xml:space="preserve"> </w:t>
+      </w:r>
+      <w:r>
+        <w:t xml:space="preserve">appears on both sides of a train/test split, and</w:t>
       </w:r>
       <w:r>
         <w:t xml:space="preserve"> </w:t>
@@ -2046,41 +3663,105 @@
         <w:t xml:space="preserve">assert_dataset_is_test_only</w:t>
       </w:r>
       <w:r>
-        <w:t xml:space="preserve">, which verifies that a designated</w:t>
-      </w:r>
-      <w:r>
-        <w:t xml:space="preserve"> </w:t>
-      </w:r>
-      <w:r>
-        <w:t xml:space="preserve">test-only data source (DARPA2000) never appears in a training dataframe.</w:t>
-      </w:r>
-      <w:r>
-        <w:t xml:space="preserve"> </w:t>
-      </w:r>
-      <w:r>
-        <w:t xml:space="preserve">These assertions run inline in the actual training and evaluation scripts</w:t>
-      </w:r>
-      <w:r>
-        <w:t xml:space="preserve"> </w:t>
-      </w:r>
-      <w:r>
-        <w:t xml:space="preserve">— they are not documentation of an intended property, but a property the</w:t>
-      </w:r>
-      <w:r>
-        <w:t xml:space="preserve"> </w:t>
-      </w:r>
-      <w:r>
-        <w:t xml:space="preserve">code will refuse to proceed past if violated.</w:t>
-      </w:r>
-    </w:p>
-    <w:bookmarkEnd w:id="35"/>
-    <w:bookmarkStart w:id="36" w:name="Xbf9fb63470b5794c0a3ce826627f118cf6489f3"/>
+        <w:t xml:space="preserve">, which verifies that a designated test-only</w:t>
+      </w:r>
+      <w:r>
+        <w:t xml:space="preserve"> </w:t>
+      </w:r>
+      <w:r>
+        <w:t xml:space="preserve">data source (DARPA2000) never appears in a training dataframe. These</w:t>
+      </w:r>
+      <w:r>
+        <w:t xml:space="preserve"> </w:t>
+      </w:r>
+      <w:r>
+        <w:t xml:space="preserve">assertions run inline in the actual training and evaluation scripts — they</w:t>
+      </w:r>
+      <w:r>
+        <w:t xml:space="preserve"> </w:t>
+      </w:r>
+      <w:r>
+        <w:t xml:space="preserve">are not documentation of an intended property, but a property the code</w:t>
+      </w:r>
+      <w:r>
+        <w:t xml:space="preserve"> </w:t>
+      </w:r>
+      <w:r>
+        <w:t xml:space="preserve">will refuse to proceed past if violated. Splitting is deliberately done at</w:t>
+      </w:r>
+      <w:r>
+        <w:t xml:space="preserve"> </w:t>
+      </w:r>
+      <w:r>
+        <w:t xml:space="preserve">the</w:t>
+      </w:r>
+      <w:r>
+        <w:t xml:space="preserve"> </w:t>
+      </w:r>
+      <w:r>
+        <w:rPr>
+          <w:iCs/>
+          <w:i/>
+        </w:rPr>
+        <w:t xml:space="preserve">campaign</w:t>
+      </w:r>
+      <w:r>
+        <w:t xml:space="preserve"> </w:t>
+      </w:r>
+      <w:r>
+        <w:t xml:space="preserve">level, not the individual-event level: a naive event-level</w:t>
+      </w:r>
+      <w:r>
+        <w:t xml:space="preserve"> </w:t>
+      </w:r>
+      <w:r>
+        <w:t xml:space="preserve">random split would place some of a campaign’s events in training and</w:t>
+      </w:r>
+      <w:r>
+        <w:t xml:space="preserve"> </w:t>
+      </w:r>
+      <w:r>
+        <w:t xml:space="preserve">others in test, letting the model implicitly learn campaign-specific</w:t>
+      </w:r>
+      <w:r>
+        <w:t xml:space="preserve"> </w:t>
+      </w:r>
+      <w:r>
+        <w:t xml:space="preserve">identifiers (a shared timestamp cluster, a specific host pair) rather than</w:t>
+      </w:r>
+      <w:r>
+        <w:t xml:space="preserve"> </w:t>
+      </w:r>
+      <w:r>
+        <w:t xml:space="preserve">generalizable correlation signal — precisely the shortcut-learning failure</w:t>
+      </w:r>
+      <w:r>
+        <w:t xml:space="preserve"> </w:t>
+      </w:r>
+      <w:r>
+        <w:t xml:space="preserve">mode Section 2.2 warns is endemic to this literature, and the same failure</w:t>
+      </w:r>
+      <w:r>
+        <w:t xml:space="preserve"> </w:t>
+      </w:r>
+      <w:r>
+        <w:t xml:space="preserve">mode that Stage 3’s fixed-attacker-IP feature (Chapter 4.3) was found to</w:t>
+      </w:r>
+      <w:r>
+        <w:t xml:space="preserve"> </w:t>
+      </w:r>
+      <w:r>
+        <w:t xml:space="preserve">be exploiting before it was removed.</w:t>
+      </w:r>
+    </w:p>
+    <w:bookmarkEnd w:id="40"/>
+    <w:bookmarkStart w:id="41" w:name="Xb59a2e87d154d5869b1c0674c1f283a9dc71ed4"/>
     <w:p>
       <w:pPr>
         <w:pStyle w:val="Heading2"/>
       </w:pPr>
       <w:r>
-        <w:t xml:space="preserve">3.4 Correlation Environment and Reward Design</w:t>
+        <w:t xml:space="preserve">3.5 Correlation Environment: MDP Formulation and Reward Design</w:t>
       </w:r>
     </w:p>
     <w:p>
@@ -2097,227 +3778,481 @@
         <w:t xml:space="preserve"> </w:t>
       </w:r>
       <w:r>
-        <w:t xml:space="preserve">implements the RL environment: episodes are built</w:t>
-      </w:r>
-      <w:r>
-        <w:t xml:space="preserve"> </w:t>
-      </w:r>
-      <w:r>
-        <w:t xml:space="preserve">from a campaign’s true events plus sampled same-time-window distractor</w:t>
-      </w:r>
-      <w:r>
-        <w:t xml:space="preserve"> </w:t>
-      </w:r>
-      <w:r>
-        <w:t xml:space="preserve">events (Section 4.2); the agent, at each step, compares a candidate event</w:t>
-      </w:r>
-      <w:r>
-        <w:t xml:space="preserve"> </w:t>
-      </w:r>
-      <w:r>
-        <w:t xml:space="preserve">against the campaign’s current anchor via a seven-feature vector (temporal</w:t>
-      </w:r>
-      <w:r>
-        <w:t xml:space="preserve"> </w:t>
-      </w:r>
-      <w:r>
-        <w:t xml:space="preserve">proximity, host/service overlap, and kill-chain stage progression among</w:t>
-      </w:r>
-      <w:r>
-        <w:t xml:space="preserve"> </w:t>
-      </w:r>
-      <w:r>
-        <w:t xml:space="preserve">them) and chooses to link or not link. Rewards were designed to reflect</w:t>
-      </w:r>
-      <w:r>
-        <w:t xml:space="preserve"> </w:t>
-      </w:r>
-      <w:r>
-        <w:t xml:space="preserve">realistic operating costs: a correct link and a correct rejection are both</w:t>
-      </w:r>
-      <w:r>
-        <w:t xml:space="preserve"> </w:t>
-      </w:r>
-      <w:r>
-        <w:t xml:space="preserve">rewarded, an incorrect link (false positive) is penalized, and a missed</w:t>
-      </w:r>
-      <w:r>
-        <w:t xml:space="preserve"> </w:t>
-      </w:r>
-      <w:r>
-        <w:t xml:space="preserve">link (false negative) is penalized more heavily than a false positive,</w:t>
-      </w:r>
-      <w:r>
-        <w:t xml:space="preserve"> </w:t>
-      </w:r>
-      <w:r>
-        <w:t xml:space="preserve">reflecting the higher real-world cost of a security analyst missing part</w:t>
-      </w:r>
-      <w:r>
-        <w:t xml:space="preserve"> </w:t>
-      </w:r>
-      <w:r>
-        <w:t xml:space="preserve">of a campaign versus investigating one spurious link. The specific</w:t>
-      </w:r>
-      <w:r>
-        <w:t xml:space="preserve"> </w:t>
-      </w:r>
-      <w:r>
-        <w:t xml:space="preserve">false-negative weighting was tuned once during Stage 4 (Chapter 4) after</w:t>
-      </w:r>
-      <w:r>
-        <w:t xml:space="preserve"> </w:t>
-      </w:r>
-      <w:r>
-        <w:t xml:space="preserve">observing a degenerate policy at an initial setting, and this single,</w:t>
-      </w:r>
-      <w:r>
-        <w:t xml:space="preserve"> </w:t>
-      </w:r>
-      <w:r>
-        <w:t xml:space="preserve">disclosed adjustment is revisited as a limitation in Chapter 7.</w:t>
-      </w:r>
-    </w:p>
-    <w:bookmarkEnd w:id="36"/>
-    <w:bookmarkEnd w:id="37"/>
-    <w:bookmarkStart w:id="46" w:name="chapter-4-methodology"/>
-    <w:p>
-      <w:pPr>
-        <w:pStyle w:val="Heading1"/>
-      </w:pPr>
-      <w:r>
-        <w:t xml:space="preserve">Chapter 4 — Methodology</w:t>
-      </w:r>
-    </w:p>
-    <w:bookmarkStart w:id="38" w:name="X1692c5e2ce6dc22b28049935fc819a3c0060c4b"/>
-    <w:p>
-      <w:pPr>
-        <w:pStyle w:val="Heading2"/>
-      </w:pPr>
-      <w:r>
-        <w:t xml:space="preserve">4.1 Stage 1 — Data Acquisition and Verification</w:t>
-      </w:r>
-    </w:p>
-    <w:p>
-      <w:pPr>
-        <w:pStyle w:val="FirstParagraph"/>
-      </w:pPr>
-      <w:r>
-        <w:t xml:space="preserve">DARPA2000 was acquired via a scripted download and verified (checksums,</w:t>
-      </w:r>
-      <w:r>
-        <w:t xml:space="preserve"> </w:t>
-      </w:r>
-      <w:r>
-        <w:t xml:space="preserve">file presence) via</w:t>
-      </w:r>
-      <w:r>
-        <w:t xml:space="preserve"> </w:t>
-      </w:r>
-      <w:r>
-        <w:rPr>
-          <w:rStyle w:val="VerbatimChar"/>
-        </w:rPr>
-        <w:t xml:space="preserve">scripts/stage1_download_darpa2000.sh</w:t>
-      </w:r>
-      <w:r>
-        <w:t xml:space="preserve"> </w:t>
-      </w:r>
-      <w:r>
-        <w:t xml:space="preserve">and</w:t>
-      </w:r>
-      <w:r>
-        <w:t xml:space="preserve"> </w:t>
-      </w:r>
-      <w:r>
-        <w:rPr>
-          <w:rStyle w:val="VerbatimChar"/>
-        </w:rPr>
-        <w:t xml:space="preserve">scripts/stage1_verify_darpa2000.py</w:t>
-      </w:r>
-      <w:r>
-        <w:t xml:space="preserve">. CICIDS2017 required a manual initial</w:t>
-      </w:r>
-      <w:r>
-        <w:t xml:space="preserve"> </w:t>
-      </w:r>
-      <w:r>
-        <w:t xml:space="preserve">download step (documented in</w:t>
-      </w:r>
-      <w:r>
-        <w:t xml:space="preserve"> </w:t>
-      </w:r>
-      <w:r>
-        <w:rPr>
-          <w:rStyle w:val="VerbatimChar"/>
-        </w:rPr>
-        <w:t xml:space="preserve">docs/stage1_manual_downloads.md</w:t>
-      </w:r>
-      <w:r>
-        <w:t xml:space="preserve">) followed by</w:t>
-      </w:r>
-      <w:r>
-        <w:t xml:space="preserve"> </w:t>
-      </w:r>
-      <w:r>
-        <w:t xml:space="preserve">a scripted extraction/organization step; an earlier download attempt</w:t>
-      </w:r>
-      <w:r>
-        <w:t xml:space="preserve"> </w:t>
-      </w:r>
-      <w:r>
-        <w:t xml:space="preserve">produced a corrupted archive after mixing download tools across resumed</w:t>
-      </w:r>
-      <w:r>
-        <w:t xml:space="preserve"> </w:t>
-      </w:r>
-      <w:r>
-        <w:t xml:space="preserve">sessions, resolved by re-downloading the entire archive in a single,</w:t>
-      </w:r>
-      <w:r>
-        <w:t xml:space="preserve"> </w:t>
-      </w:r>
-      <w:r>
-        <w:t xml:space="preserve">uninterrupted connection. UNSW-NB15 — scoped from the outset as an</w:t>
-      </w:r>
-      <w:r>
-        <w:t xml:space="preserve"> </w:t>
-      </w:r>
-      <w:r>
-        <w:t xml:space="preserve">optional, secondary dataset — was gated behind a browser-only SharePoint</w:t>
-      </w:r>
-      <w:r>
-        <w:t xml:space="preserve"> </w:t>
-      </w:r>
-      <w:r>
-        <w:t xml:space="preserve">folder with no scriptable access; it was obtained later in the project via</w:t>
-      </w:r>
-      <w:r>
-        <w:t xml:space="preserve"> </w:t>
-      </w:r>
-      <w:r>
-        <w:t xml:space="preserve">a manual download and file transfer (Stage 3b, Section 4.7).</w:t>
-      </w:r>
-    </w:p>
-    <w:bookmarkEnd w:id="38"/>
-    <w:bookmarkStart w:id="39" w:name="Xa70def55fb80868eb7b4bebecf735dc5d91eee3"/>
-    <w:p>
-      <w:pPr>
-        <w:pStyle w:val="Heading2"/>
-      </w:pPr>
-      <w:r>
-        <w:t xml:space="preserve">4.2 Stage 2 — Unified Schema, Campaign Derivation, Leak-Free Split</w:t>
-      </w:r>
-    </w:p>
-    <w:p>
-      <w:pPr>
-        <w:pStyle w:val="FirstParagraph"/>
+        <w:t xml:space="preserve">implements the RL environment underlying the</w:t>
+      </w:r>
+      <w:r>
+        <w:t xml:space="preserve"> </w:t>
+      </w:r>
+      <w:r>
+        <w:t xml:space="preserve">DQN agent described in Section 2.4–2.5, formalized as the following MDP:</w:t>
+      </w:r>
+    </w:p>
+    <w:p>
+      <w:pPr>
+        <w:numPr>
+          <w:ilvl w:val="0"/>
+          <w:numId w:val="1004"/>
+        </w:numPr>
+        <w:pStyle w:val="Compact"/>
       </w:pPr>
       <w:r>
         <w:rPr>
           <w:bCs/>
           <w:b/>
         </w:rPr>
+        <w:t xml:space="preserve">State.</w:t>
+      </w:r>
+      <w:r>
+        <w:t xml:space="preserve"> </w:t>
+      </w:r>
+      <w:r>
+        <w:t xml:space="preserve">A seven-dimensional feature vector comparing a candidate</w:t>
+      </w:r>
+      <w:r>
+        <w:t xml:space="preserve"> </w:t>
+      </w:r>
+      <w:r>
+        <w:t xml:space="preserve">event against the current campaign anchor: temporal proximity (time</w:t>
+      </w:r>
+      <w:r>
+        <w:t xml:space="preserve"> </w:t>
+      </w:r>
+      <w:r>
+        <w:t xml:space="preserve">elapsed since the anchor), shared-host and shared-service indicators,</w:t>
+      </w:r>
+      <w:r>
+        <w:t xml:space="preserve"> </w:t>
+      </w:r>
+      <w:r>
+        <w:t xml:space="preserve">and a small set of features encoding the anchor’s and candidate’s</w:t>
+      </w:r>
+      <w:r>
+        <w:t xml:space="preserve"> </w:t>
+      </w:r>
+      <w:r>
+        <w:t xml:space="preserve">relative kill-chain stage progression (Section 2.3, Section 3.3).</w:t>
+      </w:r>
+    </w:p>
+    <w:p>
+      <w:pPr>
+        <w:numPr>
+          <w:ilvl w:val="0"/>
+          <w:numId w:val="1004"/>
+        </w:numPr>
+        <w:pStyle w:val="Compact"/>
+      </w:pPr>
+      <w:r>
+        <w:rPr>
+          <w:bCs/>
+          <w:b/>
+        </w:rPr>
+        <w:t xml:space="preserve">Action.</w:t>
+      </w:r>
+      <w:r>
+        <w:t xml:space="preserve"> </w:t>
+      </w:r>
+      <w:r>
+        <w:t xml:space="preserve">Binary: link the candidate event to the current campaign, or</w:t>
+      </w:r>
+      <w:r>
+        <w:t xml:space="preserve"> </w:t>
+      </w:r>
+      <w:r>
+        <w:t xml:space="preserve">reject it (Section 2.5).</w:t>
+      </w:r>
+    </w:p>
+    <w:p>
+      <w:pPr>
+        <w:numPr>
+          <w:ilvl w:val="0"/>
+          <w:numId w:val="1004"/>
+        </w:numPr>
+        <w:pStyle w:val="Compact"/>
+      </w:pPr>
+      <w:r>
+        <w:rPr>
+          <w:bCs/>
+          <w:b/>
+        </w:rPr>
+        <w:t xml:space="preserve">Transition.</w:t>
+      </w:r>
+      <w:r>
+        <w:t xml:space="preserve"> </w:t>
+      </w:r>
+      <w:r>
+        <w:t xml:space="preserve">Accepting a link updates the episode’s anchor to the</w:t>
+      </w:r>
+      <w:r>
+        <w:t xml:space="preserve"> </w:t>
+      </w:r>
+      <w:r>
+        <w:t xml:space="preserve">newly linked event, changing the state features available for the next</w:t>
+      </w:r>
+      <w:r>
+        <w:t xml:space="preserve"> </w:t>
+      </w:r>
+      <w:r>
+        <w:t xml:space="preserve">decision — the genuine, non-cosmetic multi-step structure argued for in</w:t>
+      </w:r>
+      <w:r>
+        <w:t xml:space="preserve"> </w:t>
+      </w:r>
+      <w:r>
+        <w:t xml:space="preserve">Section 2.2 and Section 3.1. Rejecting a candidate leaves the anchor</w:t>
+      </w:r>
+      <w:r>
+        <w:t xml:space="preserve"> </w:t>
+      </w:r>
+      <w:r>
+        <w:t xml:space="preserve">unchanged and advances to the next candidate in the episode’s event</w:t>
+      </w:r>
+      <w:r>
+        <w:t xml:space="preserve"> </w:t>
+      </w:r>
+      <w:r>
+        <w:t xml:space="preserve">pool.</w:t>
+      </w:r>
+    </w:p>
+    <w:p>
+      <w:pPr>
+        <w:numPr>
+          <w:ilvl w:val="0"/>
+          <w:numId w:val="1004"/>
+        </w:numPr>
+        <w:pStyle w:val="Compact"/>
+      </w:pPr>
+      <w:r>
+        <w:rPr>
+          <w:bCs/>
+          <w:b/>
+        </w:rPr>
+        <w:t xml:space="preserve">Episode.</w:t>
+      </w:r>
+      <w:r>
+        <w:t xml:space="preserve"> </w:t>
+      </w:r>
+      <w:r>
+        <w:t xml:space="preserve">Built from a single campaign’s true events plus sampled</w:t>
+      </w:r>
+      <w:r>
+        <w:t xml:space="preserve"> </w:t>
+      </w:r>
+      <w:r>
+        <w:t xml:space="preserve">same-time-window distractor events (Chapter 4.2), capped at 60 events</w:t>
+      </w:r>
+      <w:r>
+        <w:t xml:space="preserve"> </w:t>
+      </w:r>
+      <w:r>
+        <w:t xml:space="preserve">per episode (Chapter 7.7).</w:t>
+      </w:r>
+    </w:p>
+    <w:p>
+      <w:pPr>
+        <w:numPr>
+          <w:ilvl w:val="0"/>
+          <w:numId w:val="1004"/>
+        </w:numPr>
+        <w:pStyle w:val="Compact"/>
+      </w:pPr>
+      <w:r>
+        <w:rPr>
+          <w:bCs/>
+          <w:b/>
+        </w:rPr>
+        <w:t xml:space="preserve">Reward.</w:t>
+      </w:r>
+      <w:r>
+        <w:t xml:space="preserve"> </w:t>
+      </w:r>
+      <w:r>
+        <w:t xml:space="preserve">A correct link and a correct rejection are both rewarded; an</w:t>
+      </w:r>
+      <w:r>
+        <w:t xml:space="preserve"> </w:t>
+      </w:r>
+      <w:r>
+        <w:t xml:space="preserve">incorrect link (false positive) is penalized; a missed link (false</w:t>
+      </w:r>
+      <w:r>
+        <w:t xml:space="preserve"> </w:t>
+      </w:r>
+      <w:r>
+        <w:t xml:space="preserve">negative) is penalized more heavily than a false positive, reflecting</w:t>
+      </w:r>
+      <w:r>
+        <w:t xml:space="preserve"> </w:t>
+      </w:r>
+      <w:r>
+        <w:t xml:space="preserve">the higher real-world cost of a security analyst missing part of a</w:t>
+      </w:r>
+      <w:r>
+        <w:t xml:space="preserve"> </w:t>
+      </w:r>
+      <w:r>
+        <w:t xml:space="preserve">campaign versus investigating one spurious link. The specific false-</w:t>
+      </w:r>
+      <w:r>
+        <w:t xml:space="preserve"> </w:t>
+      </w:r>
+      <w:r>
+        <w:t xml:space="preserve">negative weighting was tuned once during Stage 4 (Chapter 4.4) after</w:t>
+      </w:r>
+      <w:r>
+        <w:t xml:space="preserve"> </w:t>
+      </w:r>
+      <w:r>
+        <w:t xml:space="preserve">observing a degenerate policy at an initial setting, and this single,</w:t>
+      </w:r>
+      <w:r>
+        <w:t xml:space="preserve"> </w:t>
+      </w:r>
+      <w:r>
+        <w:t xml:space="preserve">disclosed adjustment is revisited as a limitation in Chapter 7.4.</w:t>
+      </w:r>
+    </w:p>
+    <w:p>
+      <w:pPr>
+        <w:numPr>
+          <w:ilvl w:val="0"/>
+          <w:numId w:val="1004"/>
+        </w:numPr>
+        <w:pStyle w:val="Compact"/>
+      </w:pPr>
+      <w:r>
+        <w:rPr>
+          <w:bCs/>
+          <w:b/>
+        </w:rPr>
+        <w:t xml:space="preserve">Discount factor.</w:t>
+      </w:r>
+      <w:r>
+        <w:t xml:space="preserve"> </w:t>
+      </w:r>
+      <w:r>
+        <w:t xml:space="preserve">Applied over the genuine multi-step episode</w:t>
+      </w:r>
+      <w:r>
+        <w:t xml:space="preserve"> </w:t>
+      </w:r>
+      <w:r>
+        <w:t xml:space="preserve">structure above, consistent with the standard MDP formulation in</w:t>
+      </w:r>
+      <w:r>
+        <w:t xml:space="preserve"> </w:t>
+      </w:r>
+      <w:r>
+        <w:t xml:space="preserve">Section 2.4 rather than treated as a free hyperparameter divorced from</w:t>
+      </w:r>
+      <w:r>
+        <w:t xml:space="preserve"> </w:t>
+      </w:r>
+      <w:r>
+        <w:t xml:space="preserve">the problem’s actual sequential structure.</w:t>
+      </w:r>
+    </w:p>
+    <w:p>
+      <w:pPr>
+        <w:pStyle w:val="FirstParagraph"/>
+      </w:pPr>
+      <w:r>
+        <w:t xml:space="preserve">Restricting the state to this compact, seven-dimensional, structurally</w:t>
+      </w:r>
+      <w:r>
+        <w:t xml:space="preserve"> </w:t>
+      </w:r>
+      <w:r>
+        <w:t xml:space="preserve">interpretable feature vector — rather than, say, raw alert text or the</w:t>
+      </w:r>
+      <w:r>
+        <w:t xml:space="preserve"> </w:t>
+      </w:r>
+      <w:r>
+        <w:t xml:space="preserve">full unified-schema record — is itself a design choice made in direct</w:t>
+      </w:r>
+      <w:r>
+        <w:t xml:space="preserve"> </w:t>
+      </w:r>
+      <w:r>
+        <w:t xml:space="preserve">response to Section 2.2’s shortcut-learning risk: a smaller, hand-chosen</w:t>
+      </w:r>
+      <w:r>
+        <w:t xml:space="preserve"> </w:t>
+      </w:r>
+      <w:r>
+        <w:t xml:space="preserve">feature set is easier to audit for leakage than a large, opaque one, at</w:t>
+      </w:r>
+      <w:r>
+        <w:t xml:space="preserve"> </w:t>
+      </w:r>
+      <w:r>
+        <w:t xml:space="preserve">the cost of expressiveness the agent might otherwise have used</w:t>
+      </w:r>
+      <w:r>
+        <w:t xml:space="preserve"> </w:t>
+      </w:r>
+      <w:r>
+        <w:t xml:space="preserve">productively. Whether this tradeoff was well-judged is left open, and</w:t>
+      </w:r>
+      <w:r>
+        <w:t xml:space="preserve"> </w:t>
+      </w:r>
+      <w:r>
+        <w:t xml:space="preserve">Chapter 6.1’s discussion of the DQN’s generalization gap should be read</w:t>
+      </w:r>
+      <w:r>
+        <w:t xml:space="preserve"> </w:t>
+      </w:r>
+      <w:r>
+        <w:t xml:space="preserve">with this restricted state representation as one candidate contributing</w:t>
+      </w:r>
+      <w:r>
+        <w:t xml:space="preserve"> </w:t>
+      </w:r>
+      <w:r>
+        <w:t xml:space="preserve">factor.</w:t>
+      </w:r>
+    </w:p>
+    <w:bookmarkEnd w:id="41"/>
+    <w:bookmarkEnd w:id="42"/>
+    <w:bookmarkStart w:id="51" w:name="chapter-4-methodology"/>
+    <w:p>
+      <w:pPr>
+        <w:pStyle w:val="Heading1"/>
+      </w:pPr>
+      <w:r>
+        <w:t xml:space="preserve">Chapter 4 — Methodology</w:t>
+      </w:r>
+    </w:p>
+    <w:bookmarkStart w:id="43" w:name="X1692c5e2ce6dc22b28049935fc819a3c0060c4b"/>
+    <w:p>
+      <w:pPr>
+        <w:pStyle w:val="Heading2"/>
+      </w:pPr>
+      <w:r>
+        <w:t xml:space="preserve">4.1 Stage 1 — Data Acquisition and Verification</w:t>
+      </w:r>
+    </w:p>
+    <w:p>
+      <w:pPr>
+        <w:pStyle w:val="FirstParagraph"/>
+      </w:pPr>
+      <w:r>
+        <w:t xml:space="preserve">DARPA2000 was acquired via a scripted download and verified (checksums,</w:t>
+      </w:r>
+      <w:r>
+        <w:t xml:space="preserve"> </w:t>
+      </w:r>
+      <w:r>
+        <w:t xml:space="preserve">file presence) via</w:t>
+      </w:r>
+      <w:r>
+        <w:t xml:space="preserve"> </w:t>
+      </w:r>
+      <w:r>
+        <w:rPr>
+          <w:rStyle w:val="VerbatimChar"/>
+        </w:rPr>
+        <w:t xml:space="preserve">scripts/stage1_download_darpa2000.sh</w:t>
+      </w:r>
+      <w:r>
+        <w:t xml:space="preserve"> </w:t>
+      </w:r>
+      <w:r>
+        <w:t xml:space="preserve">and</w:t>
+      </w:r>
+      <w:r>
+        <w:t xml:space="preserve"> </w:t>
+      </w:r>
+      <w:r>
+        <w:rPr>
+          <w:rStyle w:val="VerbatimChar"/>
+        </w:rPr>
+        <w:t xml:space="preserve">scripts/stage1_verify_darpa2000.py</w:t>
+      </w:r>
+      <w:r>
+        <w:t xml:space="preserve">. CICIDS2017 required a manual initial</w:t>
+      </w:r>
+      <w:r>
+        <w:t xml:space="preserve"> </w:t>
+      </w:r>
+      <w:r>
+        <w:t xml:space="preserve">download step (documented in</w:t>
+      </w:r>
+      <w:r>
+        <w:t xml:space="preserve"> </w:t>
+      </w:r>
+      <w:r>
+        <w:rPr>
+          <w:rStyle w:val="VerbatimChar"/>
+        </w:rPr>
+        <w:t xml:space="preserve">docs/stage1_manual_downloads.md</w:t>
+      </w:r>
+      <w:r>
+        <w:t xml:space="preserve">) followed by</w:t>
+      </w:r>
+      <w:r>
+        <w:t xml:space="preserve"> </w:t>
+      </w:r>
+      <w:r>
+        <w:t xml:space="preserve">a scripted extraction/organization step; an earlier download attempt</w:t>
+      </w:r>
+      <w:r>
+        <w:t xml:space="preserve"> </w:t>
+      </w:r>
+      <w:r>
+        <w:t xml:space="preserve">produced a corrupted archive after mixing download tools across resumed</w:t>
+      </w:r>
+      <w:r>
+        <w:t xml:space="preserve"> </w:t>
+      </w:r>
+      <w:r>
+        <w:t xml:space="preserve">sessions, resolved by re-downloading the entire archive in a single,</w:t>
+      </w:r>
+      <w:r>
+        <w:t xml:space="preserve"> </w:t>
+      </w:r>
+      <w:r>
+        <w:t xml:space="preserve">uninterrupted connection. UNSW-NB15 — scoped from the outset as an</w:t>
+      </w:r>
+      <w:r>
+        <w:t xml:space="preserve"> </w:t>
+      </w:r>
+      <w:r>
+        <w:t xml:space="preserve">optional, secondary dataset — was gated behind a browser-only SharePoint</w:t>
+      </w:r>
+      <w:r>
+        <w:t xml:space="preserve"> </w:t>
+      </w:r>
+      <w:r>
+        <w:t xml:space="preserve">folder with no scriptable access; it was obtained later in the project via</w:t>
+      </w:r>
+      <w:r>
+        <w:t xml:space="preserve"> </w:t>
+      </w:r>
+      <w:r>
+        <w:t xml:space="preserve">a manual download and file transfer (Stage 3b, Section 4.7).</w:t>
+      </w:r>
+    </w:p>
+    <w:bookmarkEnd w:id="43"/>
+    <w:bookmarkStart w:id="44" w:name="Xa70def55fb80868eb7b4bebecf735dc5d91eee3"/>
+    <w:p>
+      <w:pPr>
+        <w:pStyle w:val="Heading2"/>
+      </w:pPr>
+      <w:r>
+        <w:t xml:space="preserve">4.2 Stage 2 — Unified Schema, Campaign Derivation, Leak-Free Split</w:t>
+      </w:r>
+    </w:p>
+    <w:p>
+      <w:pPr>
+        <w:pStyle w:val="FirstParagraph"/>
+      </w:pPr>
+      <w:r>
+        <w:rPr>
+          <w:bCs/>
+          <w:b/>
+        </w:rPr>
         <w:t xml:space="preserve">DARPA2000.</w:t>
       </w:r>
       <w:r>
@@ -2693,8 +4628,8 @@
         <w:t xml:space="preserve">Stage 4 train against the identifier’s actual error profile (Section 3.1).</w:t>
       </w:r>
     </w:p>
-    <w:bookmarkEnd w:id="39"/>
-    <w:bookmarkStart w:id="40" w:name="stage-3-supervised-attack-identification"/>
+    <w:bookmarkEnd w:id="44"/>
+    <w:bookmarkStart w:id="45" w:name="stage-3-supervised-attack-identification"/>
     <w:p>
       <w:pPr>
         <w:pStyle w:val="Heading2"/>
@@ -2792,8 +4727,8 @@
         <w:t xml:space="preserve">rather than resampling.</w:t>
       </w:r>
     </w:p>
-    <w:bookmarkEnd w:id="40"/>
-    <w:bookmarkStart w:id="41" w:name="stage-4-dqn-correlation-agent-training"/>
+    <w:bookmarkEnd w:id="45"/>
+    <w:bookmarkStart w:id="46" w:name="stage-4-dqn-correlation-agent-training"/>
     <w:p>
       <w:pPr>
         <w:pStyle w:val="Heading2"/>
@@ -2897,8 +4832,8 @@
         <w:t xml:space="preserve">were present in the training data.</w:t>
       </w:r>
     </w:p>
-    <w:bookmarkEnd w:id="41"/>
-    <w:bookmarkStart w:id="42" w:name="X8732741815147e574b53060e6c66a58d3664191"/>
+    <w:bookmarkEnd w:id="46"/>
+    <w:bookmarkStart w:id="47" w:name="X8732741815147e574b53060e6c66a58d3664191"/>
     <w:p>
       <w:pPr>
         <w:pStyle w:val="Heading2"/>
@@ -3084,8 +5019,8 @@
         <w:t xml:space="preserve">model’s numbers used as Stage 3b’s headline result regardless of outcome.</w:t>
       </w:r>
     </w:p>
-    <w:bookmarkEnd w:id="42"/>
-    <w:bookmarkStart w:id="43" w:name="Xb1688155d2a098549d95c94bc79ff3fa253d006"/>
+    <w:bookmarkEnd w:id="47"/>
+    <w:bookmarkStart w:id="48" w:name="Xb1688155d2a098549d95c94bc79ff3fa253d006"/>
     <w:p>
       <w:pPr>
         <w:pStyle w:val="Heading2"/>
@@ -3204,8 +5139,8 @@
         <w:t xml:space="preserve">because, as described in Chapter 6, they disagree on this data.</w:t>
       </w:r>
     </w:p>
-    <w:bookmarkEnd w:id="43"/>
-    <w:bookmarkStart w:id="44" w:name="stage-6-threats-to-validity"/>
+    <w:bookmarkEnd w:id="48"/>
+    <w:bookmarkStart w:id="49" w:name="stage-6-threats-to-validity"/>
     <w:p>
       <w:pPr>
         <w:pStyle w:val="Heading2"/>
@@ -3234,8 +5169,8 @@
         <w:t xml:space="preserve">full in Chapter 7 of this thesis.</w:t>
       </w:r>
     </w:p>
-    <w:bookmarkEnd w:id="44"/>
-    <w:bookmarkStart w:id="45" w:name="the-correctness-review"/>
+    <w:bookmarkEnd w:id="49"/>
+    <w:bookmarkStart w:id="50" w:name="the-correctness-review"/>
     <w:p>
       <w:pPr>
         <w:pStyle w:val="Heading2"/>
@@ -3324,9 +5259,9 @@
         <w:t xml:space="preserve">the results, not an appendix note.</w:t>
       </w:r>
     </w:p>
-    <w:bookmarkEnd w:id="45"/>
-    <w:bookmarkEnd w:id="46"/>
-    <w:bookmarkStart w:id="51" w:name="chapter-5-results"/>
+    <w:bookmarkEnd w:id="50"/>
+    <w:bookmarkEnd w:id="51"/>
+    <w:bookmarkStart w:id="56" w:name="chapter-5-results"/>
     <w:p>
       <w:pPr>
         <w:pStyle w:val="Heading1"/>
@@ -3335,7 +5270,7 @@
         <w:t xml:space="preserve">Chapter 5 — Results</w:t>
       </w:r>
     </w:p>
-    <w:bookmarkStart w:id="47" w:name="Xbf96482bbc13792f4abce4d56628910b5a10105"/>
+    <w:bookmarkStart w:id="52" w:name="Xbf96482bbc13792f4abce4d56628910b5a10105"/>
     <w:p>
       <w:pPr>
         <w:pStyle w:val="Heading2"/>
@@ -3527,8 +5462,8 @@
         <w:t xml:space="preserve">predictions rather than ground truth.</w:t>
       </w:r>
     </w:p>
-    <w:bookmarkEnd w:id="47"/>
-    <w:bookmarkStart w:id="48" w:name="stage-3b-unsw-nb15-cross-check"/>
+    <w:bookmarkEnd w:id="52"/>
+    <w:bookmarkStart w:id="53" w:name="stage-3b-unsw-nb15-cross-check"/>
     <w:p>
       <w:pPr>
         <w:pStyle w:val="Heading2"/>
@@ -4020,8 +5955,8 @@
         <w:t xml:space="preserve">class-balanced weighting pulling in false positives from larger classes.</w:t>
       </w:r>
     </w:p>
-    <w:bookmarkEnd w:id="48"/>
-    <w:bookmarkStart w:id="49" w:name="X0c42362978b321589007c7d43c7cea4f23608d0"/>
+    <w:bookmarkEnd w:id="53"/>
+    <w:bookmarkStart w:id="54" w:name="X0c42362978b321589007c7d43c7cea4f23608d0"/>
     <w:p>
       <w:pPr>
         <w:pStyle w:val="Heading2"/>
@@ -4238,8 +6173,8 @@
         <w:t xml:space="preserve">held out purely for validation.</w:t>
       </w:r>
     </w:p>
-    <w:bookmarkEnd w:id="49"/>
-    <w:bookmarkStart w:id="50" w:name="Xd8e1bb17af584baf1605dca90f421152b9c4f81"/>
+    <w:bookmarkEnd w:id="54"/>
+    <w:bookmarkStart w:id="55" w:name="Xd8e1bb17af584baf1605dca90f421152b9c4f81"/>
     <w:p>
       <w:pPr>
         <w:pStyle w:val="Heading2"/>
@@ -4638,9 +6573,9 @@
         <w:t xml:space="preserve">even though it is not a clean win for the learned approach.</w:t>
       </w:r>
     </w:p>
-    <w:bookmarkEnd w:id="50"/>
-    <w:bookmarkEnd w:id="51"/>
-    <w:bookmarkStart w:id="54" w:name="chapter-6-discussion"/>
+    <w:bookmarkEnd w:id="55"/>
+    <w:bookmarkEnd w:id="56"/>
+    <w:bookmarkStart w:id="59" w:name="chapter-6-discussion"/>
     <w:p>
       <w:pPr>
         <w:pStyle w:val="Heading1"/>
@@ -4649,7 +6584,7 @@
         <w:t xml:space="preserve">Chapter 6 — Discussion</w:t>
       </w:r>
     </w:p>
-    <w:bookmarkStart w:id="52" w:name="X105b606a0b07a19f036026193ce5e68396dfc0b"/>
+    <w:bookmarkStart w:id="57" w:name="X105b606a0b07a19f036026193ce5e68396dfc0b"/>
     <w:p>
       <w:pPr>
         <w:pStyle w:val="Heading2"/>
@@ -4914,8 +6849,8 @@
         <w:t xml:space="preserve">selecting whichever tells a cleaner story.</w:t>
       </w:r>
     </w:p>
-    <w:bookmarkEnd w:id="52"/>
-    <w:bookmarkStart w:id="53" w:name="Xa8f28b07c2828cf187f7c30bb37cb6d8232e927"/>
+    <w:bookmarkEnd w:id="57"/>
+    <w:bookmarkStart w:id="58" w:name="Xa8f28b07c2828cf187f7c30bb37cb6d8232e927"/>
     <w:p>
       <w:pPr>
         <w:pStyle w:val="Heading2"/>
@@ -4948,7 +6883,7 @@
       <w:pPr>
         <w:numPr>
           <w:ilvl w:val="0"/>
-          <w:numId w:val="1004"/>
+          <w:numId w:val="1005"/>
         </w:numPr>
         <w:pStyle w:val="Compact"/>
       </w:pPr>
@@ -5057,7 +6992,7 @@
       <w:pPr>
         <w:numPr>
           <w:ilvl w:val="0"/>
-          <w:numId w:val="1004"/>
+          <w:numId w:val="1005"/>
         </w:numPr>
         <w:pStyle w:val="Compact"/>
       </w:pPr>
@@ -5142,7 +7077,7 @@
       <w:pPr>
         <w:numPr>
           <w:ilvl w:val="0"/>
-          <w:numId w:val="1004"/>
+          <w:numId w:val="1005"/>
         </w:numPr>
         <w:pStyle w:val="Compact"/>
       </w:pPr>
@@ -5359,9 +7294,9 @@
         <w:t xml:space="preserve">assurance of correctness.</w:t>
       </w:r>
     </w:p>
-    <w:bookmarkEnd w:id="53"/>
-    <w:bookmarkEnd w:id="54"/>
-    <w:bookmarkStart w:id="63" w:name="Xb0965eb1760d22418a7e86a7d977dcaba5a34a1"/>
+    <w:bookmarkEnd w:id="58"/>
+    <w:bookmarkEnd w:id="59"/>
+    <w:bookmarkStart w:id="68" w:name="Xb0965eb1760d22418a7e86a7d977dcaba5a34a1"/>
     <w:p>
       <w:pPr>
         <w:pStyle w:val="Heading1"/>
@@ -5390,7 +7325,7 @@
         <w:t xml:space="preserve">consistent with this thesis’s governing principle (Section 1.4).</w:t>
       </w:r>
     </w:p>
-    <w:bookmarkStart w:id="55" w:name="scope-commitments-restated"/>
+    <w:bookmarkStart w:id="60" w:name="scope-commitments-restated"/>
     <w:p>
       <w:pPr>
         <w:pStyle w:val="Heading2"/>
@@ -5437,8 +7372,8 @@
         <w:t xml:space="preserve">events.</w:t>
       </w:r>
     </w:p>
-    <w:bookmarkEnd w:id="55"/>
-    <w:bookmarkStart w:id="56" w:name="data-limitations"/>
+    <w:bookmarkEnd w:id="60"/>
+    <w:bookmarkStart w:id="61" w:name="data-limitations"/>
     <w:p>
       <w:pPr>
         <w:pStyle w:val="Heading2"/>
@@ -5589,8 +7524,8 @@
         <w:t xml:space="preserve">for tractability) rather than an exhaustively tested sampling strategy.</w:t>
       </w:r>
     </w:p>
-    <w:bookmarkEnd w:id="56"/>
-    <w:bookmarkStart w:id="57" w:name="darpa2000-specific-limitations"/>
+    <w:bookmarkEnd w:id="61"/>
+    <w:bookmarkStart w:id="62" w:name="darpa2000-specific-limitations"/>
     <w:p>
       <w:pPr>
         <w:pStyle w:val="Heading2"/>
@@ -5721,8 +7656,8 @@
         <w:t xml:space="preserve">4.6) — an idealized condition, discussed further in Chapter 6.1.</w:t>
       </w:r>
     </w:p>
-    <w:bookmarkEnd w:id="57"/>
-    <w:bookmarkStart w:id="58" w:name="X06de05ee99148df65fcdd9047d77bf9f3cb4e07"/>
+    <w:bookmarkEnd w:id="62"/>
+    <w:bookmarkStart w:id="63" w:name="X06de05ee99148df65fcdd9047d77bf9f3cb4e07"/>
     <w:p>
       <w:pPr>
         <w:pStyle w:val="Heading2"/>
@@ -5880,8 +7815,8 @@
         <w:t xml:space="preserve">design; no ablation isolating these two effects was run.</w:t>
       </w:r>
     </w:p>
-    <w:bookmarkEnd w:id="58"/>
-    <w:bookmarkStart w:id="59" w:name="evaluation-methodology-limitations"/>
+    <w:bookmarkEnd w:id="63"/>
+    <w:bookmarkStart w:id="64" w:name="evaluation-methodology-limitations"/>
     <w:p>
       <w:pPr>
         <w:pStyle w:val="Heading2"/>
@@ -5934,8 +7869,8 @@
         <w:t xml:space="preserve">available within this project’s scope.</w:t>
       </w:r>
     </w:p>
-    <w:bookmarkEnd w:id="59"/>
-    <w:bookmarkStart w:id="60" w:name="X8222135fcce2ea112ba792d7934ab8810f34700"/>
+    <w:bookmarkEnd w:id="64"/>
+    <w:bookmarkStart w:id="65" w:name="X8222135fcce2ea112ba792d7934ab8810f34700"/>
     <w:p>
       <w:pPr>
         <w:pStyle w:val="Heading2"/>
@@ -5988,8 +7923,8 @@
         <w:t xml:space="preserve">checked and how (Chapter 6.2).</w:t>
       </w:r>
     </w:p>
-    <w:bookmarkEnd w:id="60"/>
-    <w:bookmarkStart w:id="61" w:name="post-hoc-non-real-time-scope"/>
+    <w:bookmarkEnd w:id="65"/>
+    <w:bookmarkStart w:id="66" w:name="post-hoc-non-real-time-scope"/>
     <w:p>
       <w:pPr>
         <w:pStyle w:val="Heading2"/>
@@ -6042,8 +7977,8 @@
         <w:t xml:space="preserve">the original proposal and remained so throughout.</w:t>
       </w:r>
     </w:p>
-    <w:bookmarkEnd w:id="61"/>
-    <w:bookmarkStart w:id="62" w:name="project-wide-summary"/>
+    <w:bookmarkEnd w:id="66"/>
+    <w:bookmarkStart w:id="67" w:name="project-wide-summary"/>
     <w:p>
       <w:pPr>
         <w:pStyle w:val="Heading2"/>
@@ -6327,9 +8262,9 @@
         </w:tc>
       </w:tr>
     </w:tbl>
-    <w:bookmarkEnd w:id="62"/>
-    <w:bookmarkEnd w:id="63"/>
-    <w:bookmarkStart w:id="66" w:name="chapter-8-conclusion-and-future-work"/>
+    <w:bookmarkEnd w:id="67"/>
+    <w:bookmarkEnd w:id="68"/>
+    <w:bookmarkStart w:id="71" w:name="chapter-8-conclusion-and-future-work"/>
     <w:p>
       <w:pPr>
         <w:pStyle w:val="Heading1"/>
@@ -6338,7 +8273,7 @@
         <w:t xml:space="preserve">Chapter 8 — Conclusion and Future Work</w:t>
       </w:r>
     </w:p>
-    <w:bookmarkStart w:id="64" w:name="conclusion"/>
+    <w:bookmarkStart w:id="69" w:name="conclusion"/>
     <w:p>
       <w:pPr>
         <w:pStyle w:val="Heading2"/>
@@ -6507,8 +8442,8 @@
         <w:t xml:space="preserve">system, not an optional afterthought.</w:t>
       </w:r>
     </w:p>
-    <w:bookmarkEnd w:id="64"/>
-    <w:bookmarkStart w:id="65" w:name="future-work"/>
+    <w:bookmarkEnd w:id="69"/>
+    <w:bookmarkStart w:id="70" w:name="future-work"/>
     <w:p>
       <w:pPr>
         <w:pStyle w:val="Heading2"/>
@@ -6627,9 +8562,9 @@
         <w:t xml:space="preserve">stage.</w:t>
       </w:r>
     </w:p>
-    <w:bookmarkEnd w:id="65"/>
-    <w:bookmarkEnd w:id="66"/>
-    <w:bookmarkStart w:id="67" w:name="references"/>
+    <w:bookmarkEnd w:id="70"/>
+    <w:bookmarkEnd w:id="71"/>
+    <w:bookmarkStart w:id="72" w:name="references"/>
     <w:p>
       <w:pPr>
         <w:pStyle w:val="Heading1"/>
@@ -6710,7 +8645,7 @@
       <w:pPr>
         <w:numPr>
           <w:ilvl w:val="0"/>
-          <w:numId w:val="1005"/>
+          <w:numId w:val="1006"/>
         </w:numPr>
         <w:pStyle w:val="Compact"/>
       </w:pPr>
@@ -6761,7 +8696,7 @@
       <w:pPr>
         <w:numPr>
           <w:ilvl w:val="0"/>
-          <w:numId w:val="1005"/>
+          <w:numId w:val="1006"/>
         </w:numPr>
         <w:pStyle w:val="Compact"/>
       </w:pPr>
@@ -6792,7 +8727,7 @@
       <w:pPr>
         <w:numPr>
           <w:ilvl w:val="0"/>
-          <w:numId w:val="1005"/>
+          <w:numId w:val="1006"/>
         </w:numPr>
         <w:pStyle w:val="Compact"/>
       </w:pPr>
@@ -6822,7 +8757,7 @@
       <w:pPr>
         <w:numPr>
           <w:ilvl w:val="0"/>
-          <w:numId w:val="1005"/>
+          <w:numId w:val="1006"/>
         </w:numPr>
         <w:pStyle w:val="Compact"/>
       </w:pPr>
@@ -6859,7 +8794,7 @@
       <w:pPr>
         <w:numPr>
           <w:ilvl w:val="0"/>
-          <w:numId w:val="1005"/>
+          <w:numId w:val="1006"/>
         </w:numPr>
         <w:pStyle w:val="Compact"/>
       </w:pPr>
@@ -6890,7 +8825,7 @@
       <w:pPr>
         <w:numPr>
           <w:ilvl w:val="0"/>
-          <w:numId w:val="1005"/>
+          <w:numId w:val="1006"/>
         </w:numPr>
         <w:pStyle w:val="Compact"/>
       </w:pPr>
@@ -6935,8 +8870,451 @@
         <w:t xml:space="preserve">discipline methodology, Section 1.4.)</w:t>
       </w:r>
     </w:p>
-    <w:bookmarkEnd w:id="67"/>
-    <w:bookmarkStart w:id="68" w:name="appendix-a-repository-and-reproduction"/>
+    <w:p>
+      <w:pPr>
+        <w:numPr>
+          <w:ilvl w:val="0"/>
+          <w:numId w:val="1006"/>
+        </w:numPr>
+        <w:pStyle w:val="Compact"/>
+      </w:pPr>
+      <w:r>
+        <w:t xml:space="preserve">Hutchins, E. M., Cloppert, M. J., &amp; Amin, R. M. (2011). Intelligence-</w:t>
+      </w:r>
+      <w:r>
+        <w:t xml:space="preserve"> </w:t>
+      </w:r>
+      <w:r>
+        <w:t xml:space="preserve">Driven Computer Network Defense Informed by Analysis of Adversary</w:t>
+      </w:r>
+      <w:r>
+        <w:t xml:space="preserve"> </w:t>
+      </w:r>
+      <w:r>
+        <w:t xml:space="preserve">Campaigns and Intrusion Kill Chains.</w:t>
+      </w:r>
+      <w:r>
+        <w:t xml:space="preserve"> </w:t>
+      </w:r>
+      <w:r>
+        <w:rPr>
+          <w:iCs/>
+          <w:i/>
+        </w:rPr>
+        <w:t xml:space="preserve">Proceedings of the 6th</w:t>
+      </w:r>
+      <w:r>
+        <w:rPr>
+          <w:iCs/>
+          <w:i/>
+        </w:rPr>
+        <w:t xml:space="preserve"> </w:t>
+      </w:r>
+      <w:r>
+        <w:rPr>
+          <w:iCs/>
+          <w:i/>
+        </w:rPr>
+        <w:t xml:space="preserve">International Conference on Information Warfare and Security</w:t>
+      </w:r>
+      <w:r>
+        <w:t xml:space="preserve">. (Lockheed</w:t>
+      </w:r>
+      <w:r>
+        <w:t xml:space="preserve"> </w:t>
+      </w:r>
+      <w:r>
+        <w:t xml:space="preserve">Martin Cyber Kill Chain, Section 2.3.)</w:t>
+      </w:r>
+    </w:p>
+    <w:p>
+      <w:pPr>
+        <w:numPr>
+          <w:ilvl w:val="0"/>
+          <w:numId w:val="1006"/>
+        </w:numPr>
+        <w:pStyle w:val="Compact"/>
+      </w:pPr>
+      <w:r>
+        <w:t xml:space="preserve">MITRE. ATT&amp;CK — a globally accessible knowledge base of adversary</w:t>
+      </w:r>
+      <w:r>
+        <w:t xml:space="preserve"> </w:t>
+      </w:r>
+      <w:r>
+        <w:t xml:space="preserve">tactics and techniques.</w:t>
+      </w:r>
+      <w:r>
+        <w:t xml:space="preserve"> </w:t>
+      </w:r>
+      <w:r>
+        <w:rPr>
+          <w:rStyle w:val="VerbatimChar"/>
+        </w:rPr>
+        <w:t xml:space="preserve">attack.mitre.org</w:t>
+      </w:r>
+      <w:r>
+        <w:t xml:space="preserve"> </w:t>
+      </w:r>
+      <w:r>
+        <w:t xml:space="preserve">(Section 2.3).</w:t>
+      </w:r>
+    </w:p>
+    <w:p>
+      <w:pPr>
+        <w:numPr>
+          <w:ilvl w:val="0"/>
+          <w:numId w:val="1006"/>
+        </w:numPr>
+        <w:pStyle w:val="Compact"/>
+      </w:pPr>
+      <w:r>
+        <w:t xml:space="preserve">Valdes, A., &amp; Skinner, K. (2001). Probabilistic Alert Correlation.</w:t>
+      </w:r>
+      <w:r>
+        <w:t xml:space="preserve"> </w:t>
+      </w:r>
+      <w:r>
+        <w:rPr>
+          <w:iCs/>
+          <w:i/>
+        </w:rPr>
+        <w:t xml:space="preserve">Recent Advances in Intrusion Detection (RAID)</w:t>
+      </w:r>
+      <w:r>
+        <w:t xml:space="preserve">. (Statistical</w:t>
+      </w:r>
+      <w:r>
+        <w:t xml:space="preserve"> </w:t>
+      </w:r>
+      <w:r>
+        <w:t xml:space="preserve">alert-correlation approach, Section 2.2 — verify exact venue/year.)</w:t>
+      </w:r>
+    </w:p>
+    <w:p>
+      <w:pPr>
+        <w:numPr>
+          <w:ilvl w:val="0"/>
+          <w:numId w:val="1006"/>
+        </w:numPr>
+        <w:pStyle w:val="Compact"/>
+      </w:pPr>
+      <w:r>
+        <w:t xml:space="preserve">Ning, P., Cui, Y., &amp; Reeves, D. S. (2002). Constructing Attack Scenarios</w:t>
+      </w:r>
+      <w:r>
+        <w:t xml:space="preserve"> </w:t>
+      </w:r>
+      <w:r>
+        <w:t xml:space="preserve">through Correlation of Intrusion Alerts.</w:t>
+      </w:r>
+      <w:r>
+        <w:t xml:space="preserve"> </w:t>
+      </w:r>
+      <w:r>
+        <w:rPr>
+          <w:iCs/>
+          <w:i/>
+        </w:rPr>
+        <w:t xml:space="preserve">Proceedings of the 9th ACM</w:t>
+      </w:r>
+      <w:r>
+        <w:rPr>
+          <w:iCs/>
+          <w:i/>
+        </w:rPr>
+        <w:t xml:space="preserve"> </w:t>
+      </w:r>
+      <w:r>
+        <w:rPr>
+          <w:iCs/>
+          <w:i/>
+        </w:rPr>
+        <w:t xml:space="preserve">Conference on Computer and Communications Security (CCS)</w:t>
+      </w:r>
+      <w:r>
+        <w:t xml:space="preserve">. (Causal /</w:t>
+      </w:r>
+      <w:r>
+        <w:t xml:space="preserve"> </w:t>
+      </w:r>
+      <w:r>
+        <w:t xml:space="preserve">prerequisite-consequence alert correlation, Section 2.2 — verify exact</w:t>
+      </w:r>
+      <w:r>
+        <w:t xml:space="preserve"> </w:t>
+      </w:r>
+      <w:r>
+        <w:t xml:space="preserve">venue/year.)</w:t>
+      </w:r>
+    </w:p>
+    <w:p>
+      <w:pPr>
+        <w:numPr>
+          <w:ilvl w:val="0"/>
+          <w:numId w:val="1006"/>
+        </w:numPr>
+        <w:pStyle w:val="Compact"/>
+      </w:pPr>
+      <w:r>
+        <w:t xml:space="preserve">Julisch, K. (2003). Clustering Intrusion Detection Alarms to Support</w:t>
+      </w:r>
+      <w:r>
+        <w:t xml:space="preserve"> </w:t>
+      </w:r>
+      <w:r>
+        <w:t xml:space="preserve">Root Cause Analysis.</w:t>
+      </w:r>
+      <w:r>
+        <w:t xml:space="preserve"> </w:t>
+      </w:r>
+      <w:r>
+        <w:rPr>
+          <w:iCs/>
+          <w:i/>
+        </w:rPr>
+        <w:t xml:space="preserve">ACM Transactions on Information and System</w:t>
+      </w:r>
+      <w:r>
+        <w:rPr>
+          <w:iCs/>
+          <w:i/>
+        </w:rPr>
+        <w:t xml:space="preserve"> </w:t>
+      </w:r>
+      <w:r>
+        <w:rPr>
+          <w:iCs/>
+          <w:i/>
+        </w:rPr>
+        <w:t xml:space="preserve">Security</w:t>
+      </w:r>
+      <w:r>
+        <w:t xml:space="preserve">, 6(4), 443–471. (Alarm-clustering correlation, Section 2.2 —</w:t>
+      </w:r>
+      <w:r>
+        <w:t xml:space="preserve"> </w:t>
+      </w:r>
+      <w:r>
+        <w:t xml:space="preserve">verify exact venue/year/pages.)</w:t>
+      </w:r>
+    </w:p>
+    <w:p>
+      <w:pPr>
+        <w:numPr>
+          <w:ilvl w:val="0"/>
+          <w:numId w:val="1006"/>
+        </w:numPr>
+        <w:pStyle w:val="Compact"/>
+      </w:pPr>
+      <w:r>
+        <w:t xml:space="preserve">Watkins, C. J. C. H., &amp; Dayan, P. (1992). Q-learning.</w:t>
+      </w:r>
+      <w:r>
+        <w:t xml:space="preserve"> </w:t>
+      </w:r>
+      <w:r>
+        <w:rPr>
+          <w:iCs/>
+          <w:i/>
+        </w:rPr>
+        <w:t xml:space="preserve">Machine Learning</w:t>
+      </w:r>
+      <w:r>
+        <w:t xml:space="preserve">,</w:t>
+      </w:r>
+      <w:r>
+        <w:t xml:space="preserve"> </w:t>
+      </w:r>
+      <w:r>
+        <w:t xml:space="preserve">8(3–4), 279–292. (Section 2.4.)</w:t>
+      </w:r>
+    </w:p>
+    <w:p>
+      <w:pPr>
+        <w:numPr>
+          <w:ilvl w:val="0"/>
+          <w:numId w:val="1006"/>
+        </w:numPr>
+        <w:pStyle w:val="Compact"/>
+      </w:pPr>
+      <w:r>
+        <w:t xml:space="preserve">Sutton, R. S., &amp; Barto, A. G. (2018).</w:t>
+      </w:r>
+      <w:r>
+        <w:t xml:space="preserve"> </w:t>
+      </w:r>
+      <w:r>
+        <w:rPr>
+          <w:iCs/>
+          <w:i/>
+        </w:rPr>
+        <w:t xml:space="preserve">Reinforcement Learning: An</w:t>
+      </w:r>
+      <w:r>
+        <w:rPr>
+          <w:iCs/>
+          <w:i/>
+        </w:rPr>
+        <w:t xml:space="preserve"> </w:t>
+      </w:r>
+      <w:r>
+        <w:rPr>
+          <w:iCs/>
+          <w:i/>
+        </w:rPr>
+        <w:t xml:space="preserve">Introduction</w:t>
+      </w:r>
+      <w:r>
+        <w:t xml:space="preserve"> </w:t>
+      </w:r>
+      <w:r>
+        <w:t xml:space="preserve">(2nd ed.). MIT Press. (Standard RL/MDP reference, Section</w:t>
+      </w:r>
+      <w:r>
+        <w:t xml:space="preserve"> </w:t>
+      </w:r>
+      <w:r>
+        <w:t xml:space="preserve">2.4, Section 3.5.)</w:t>
+      </w:r>
+    </w:p>
+    <w:p>
+      <w:pPr>
+        <w:numPr>
+          <w:ilvl w:val="0"/>
+          <w:numId w:val="1006"/>
+        </w:numPr>
+        <w:pStyle w:val="Compact"/>
+      </w:pPr>
+      <w:r>
+        <w:t xml:space="preserve">Van Hasselt, H., Guez, A., &amp; Silver, D. (2016). Deep Reinforcement</w:t>
+      </w:r>
+      <w:r>
+        <w:t xml:space="preserve"> </w:t>
+      </w:r>
+      <w:r>
+        <w:t xml:space="preserve">Learning with Double Q-learning.</w:t>
+      </w:r>
+      <w:r>
+        <w:t xml:space="preserve"> </w:t>
+      </w:r>
+      <w:r>
+        <w:rPr>
+          <w:iCs/>
+          <w:i/>
+        </w:rPr>
+        <w:t xml:space="preserve">Proceedings of the AAAI Conference on</w:t>
+      </w:r>
+      <w:r>
+        <w:rPr>
+          <w:iCs/>
+          <w:i/>
+        </w:rPr>
+        <w:t xml:space="preserve"> </w:t>
+      </w:r>
+      <w:r>
+        <w:rPr>
+          <w:iCs/>
+          <w:i/>
+        </w:rPr>
+        <w:t xml:space="preserve">Artificial Intelligence</w:t>
+      </w:r>
+      <w:r>
+        <w:t xml:space="preserve">. (Double DQN, Section 2.4.)</w:t>
+      </w:r>
+    </w:p>
+    <w:p>
+      <w:pPr>
+        <w:numPr>
+          <w:ilvl w:val="0"/>
+          <w:numId w:val="1006"/>
+        </w:numPr>
+        <w:pStyle w:val="Compact"/>
+      </w:pPr>
+      <w:r>
+        <w:t xml:space="preserve">Schaul, T., Quan, J., Antonoglou, I., &amp; Silver, D. (2016). Prioritized</w:t>
+      </w:r>
+      <w:r>
+        <w:t xml:space="preserve"> </w:t>
+      </w:r>
+      <w:r>
+        <w:t xml:space="preserve">Experience Replay.</w:t>
+      </w:r>
+      <w:r>
+        <w:t xml:space="preserve"> </w:t>
+      </w:r>
+      <w:r>
+        <w:rPr>
+          <w:iCs/>
+          <w:i/>
+        </w:rPr>
+        <w:t xml:space="preserve">International Conference on Learning</w:t>
+      </w:r>
+      <w:r>
+        <w:rPr>
+          <w:iCs/>
+          <w:i/>
+        </w:rPr>
+        <w:t xml:space="preserve"> </w:t>
+      </w:r>
+      <w:r>
+        <w:rPr>
+          <w:iCs/>
+          <w:i/>
+        </w:rPr>
+        <w:t xml:space="preserve">Representations (ICLR)</w:t>
+      </w:r>
+      <w:r>
+        <w:t xml:space="preserve">. (Section 2.4.)</w:t>
+      </w:r>
+    </w:p>
+    <w:p>
+      <w:pPr>
+        <w:numPr>
+          <w:ilvl w:val="0"/>
+          <w:numId w:val="1006"/>
+        </w:numPr>
+        <w:pStyle w:val="Compact"/>
+      </w:pPr>
+      <w:r>
+        <w:t xml:space="preserve">Schulman, J., Levine, S., Abbeel, P., Jordan, M., &amp; Moritz, P. (2015).</w:t>
+      </w:r>
+      <w:r>
+        <w:t xml:space="preserve"> </w:t>
+      </w:r>
+      <w:r>
+        <w:t xml:space="preserve">Trust Region Policy Optimization.</w:t>
+      </w:r>
+      <w:r>
+        <w:t xml:space="preserve"> </w:t>
+      </w:r>
+      <w:r>
+        <w:rPr>
+          <w:iCs/>
+          <w:i/>
+        </w:rPr>
+        <w:t xml:space="preserve">International Conference on Machine</w:t>
+      </w:r>
+      <w:r>
+        <w:rPr>
+          <w:iCs/>
+          <w:i/>
+        </w:rPr>
+        <w:t xml:space="preserve"> </w:t>
+      </w:r>
+      <w:r>
+        <w:rPr>
+          <w:iCs/>
+          <w:i/>
+        </w:rPr>
+        <w:t xml:space="preserve">Learning (ICML)</w:t>
+      </w:r>
+      <w:r>
+        <w:t xml:space="preserve">. (TRPO, precursor to PPO, Section 2.4.)</w:t>
+      </w:r>
+    </w:p>
+    <w:bookmarkEnd w:id="72"/>
+    <w:bookmarkStart w:id="73" w:name="appendix-a-repository-and-reproduction"/>
     <w:p>
       <w:pPr>
         <w:pStyle w:val="Heading1"/>
@@ -7034,7 +9412,7 @@
         <w:t xml:space="preserve">review results kept alongside the corrected ones for direct comparison).</w:t>
       </w:r>
     </w:p>
-    <w:bookmarkEnd w:id="68"/>
+    <w:bookmarkEnd w:id="73"/>
     <w:sectPr/>
   </w:body>
 </w:document>
@@ -7369,6 +9747,9 @@
     <w:abstractNumId w:val="991"/>
   </w:num>
   <w:num w:numId="1004">
+    <w:abstractNumId w:val="991"/>
+  </w:num>
+  <w:num w:numId="1005">
     <w:abstractNumId w:val="99411"/>
     <w:lvlOverride w:ilvl="0">
       <w:startOverride w:val="1"/>
@@ -7398,7 +9779,7 @@
       <w:startOverride w:val="1"/>
     </w:lvlOverride>
   </w:num>
-  <w:num w:numId="1005">
+  <w:num w:numId="1006">
     <w:abstractNumId w:val="991"/>
   </w:num>
 </w:numbering>

</xml_diff>

<commit_message>
Add GRAIN and AlertPro as related-work citations with verification caveats
Positions the thesis against GRAIN (RL + GNN for multi-step attack alert
correlation) and AlertPro (RL for alert prioritization) in Sections 2.2,
2.6, and 2.8 - the closest published work found for this thesis's problem.
GRAIN's author list and exact evaluation protocol (same-distribution vs.
genuinely external) could not be independently confirmed and are flagged
as such rather than guessed, consistent with this document's existing
citation-verification convention.

Co-Authored-By: Claude Sonnet 5 <noreply@anthropic.com>
</commit_message>
<xml_diff>
--- a/docs/thesis.docx
+++ b/docs/thesis.docx
@@ -69,7 +69,7 @@
         <w:pStyle w:val="Author"/>
       </w:pPr>
       <w:r>
-        <w:t xml:space="preserve">Aazim</w:t>
+        <w:t xml:space="preserve">Haaziq</w:t>
       </w:r>
       <w:r>
         <w:t xml:space="preserve"> </w:t>
@@ -2208,55 +2208,173 @@
         <w:t xml:space="preserve"> </w:t>
       </w:r>
       <w:r>
-        <w:t xml:space="preserve">This family is the most flexible but also the most exposed to the data-</w:t>
-      </w:r>
-      <w:r>
-        <w:t xml:space="preserve"> </w:t>
-      </w:r>
-      <w:r>
-        <w:t xml:space="preserve">leakage failure mode discussed in Section 1.4: an ML-based correlator</w:t>
-      </w:r>
-      <w:r>
-        <w:t xml:space="preserve"> </w:t>
-      </w:r>
-      <w:r>
-        <w:t xml:space="preserve">evaluated only on same-distribution held-out data can appear to solve</w:t>
-      </w:r>
-      <w:r>
-        <w:t xml:space="preserve"> </w:t>
-      </w:r>
-      <w:r>
-        <w:t xml:space="preserve">correlation while actually having learned a dataset-specific shortcut</w:t>
-      </w:r>
-      <w:r>
-        <w:t xml:space="preserve"> </w:t>
-      </w:r>
-      <w:r>
-        <w:t xml:space="preserve">(e.g., a fixed attacker IP, a simulation artifact) that a rule-based</w:t>
-      </w:r>
-      <w:r>
-        <w:t xml:space="preserve"> </w:t>
-      </w:r>
-      <w:r>
-        <w:t xml:space="preserve">system never had the flexibility to exploit in the first place. This risk</w:t>
-      </w:r>
-      <w:r>
-        <w:t xml:space="preserve"> </w:t>
-      </w:r>
-      <w:r>
-        <w:t xml:space="preserve">is precisely why this thesis insists on an external, structurally</w:t>
-      </w:r>
-      <w:r>
-        <w:t xml:space="preserve"> </w:t>
-      </w:r>
-      <w:r>
-        <w:t xml:space="preserve">different evaluation dataset (Section 4.6) rather than treating strong</w:t>
-      </w:r>
-      <w:r>
-        <w:t xml:space="preserve"> </w:t>
-      </w:r>
-      <w:r>
-        <w:t xml:space="preserve">same-distribution validation numbers as sufficient evidence on their own.</w:t>
+        <w:t xml:space="preserve">The closest published work to this thesis’s own approach is GRAIN</w:t>
+      </w:r>
+      <w:r>
+        <w:t xml:space="preserve"> </w:t>
+      </w:r>
+      <w:r>
+        <w:t xml:space="preserve">(</w:t>
+      </w:r>
+      <w:r>
+        <w:rPr>
+          <w:iCs/>
+          <w:i/>
+        </w:rPr>
+        <w:t xml:space="preserve">Computers &amp; Security</w:t>
+      </w:r>
+      <w:r>
+        <w:t xml:space="preserve">, Vol. 148, 2024 — author list not independently</w:t>
+      </w:r>
+      <w:r>
+        <w:t xml:space="preserve"> </w:t>
+      </w:r>
+      <w:r>
+        <w:t xml:space="preserve">confirmed during this review and deliberately not stated here rather than</w:t>
+      </w:r>
+      <w:r>
+        <w:t xml:space="preserve"> </w:t>
+      </w:r>
+      <w:r>
+        <w:t xml:space="preserve">guessed; verify directly from the publisher record before citing further),</w:t>
+      </w:r>
+      <w:r>
+        <w:t xml:space="preserve"> </w:t>
+      </w:r>
+      <w:r>
+        <w:t xml:space="preserve">which builds a</w:t>
+      </w:r>
+      <w:r>
+        <w:t xml:space="preserve"> </w:t>
+      </w:r>
+      <w:r>
+        <w:t xml:space="preserve">graph neural network over an alert causal graph and uses reinforcement</w:t>
+      </w:r>
+      <w:r>
+        <w:t xml:space="preserve"> </w:t>
+      </w:r>
+      <w:r>
+        <w:t xml:space="preserve">learning to screen the causal graph down to the authentic multi-step</w:t>
+      </w:r>
+      <w:r>
+        <w:t xml:space="preserve"> </w:t>
+      </w:r>
+      <w:r>
+        <w:t xml:space="preserve">attack path — RL applied to essentially this thesis’s problem (deciding</w:t>
+      </w:r>
+      <w:r>
+        <w:t xml:space="preserve"> </w:t>
+      </w:r>
+      <w:r>
+        <w:t xml:space="preserve">which alerts belong to the same attack narrative), but via a materially</w:t>
+      </w:r>
+      <w:r>
+        <w:t xml:space="preserve"> </w:t>
+      </w:r>
+      <w:r>
+        <w:t xml:space="preserve">different architecture (a GNN operating over a full alert graph, versus</w:t>
+      </w:r>
+      <w:r>
+        <w:t xml:space="preserve"> </w:t>
+      </w:r>
+      <w:r>
+        <w:t xml:space="preserve">this thesis’s DQN operating on a single hand-engineered seven-feature</w:t>
+      </w:r>
+      <w:r>
+        <w:t xml:space="preserve"> </w:t>
+      </w:r>
+      <w:r>
+        <w:t xml:space="preserve">pairwise state, Section 3.5) and, as far as could be confirmed from</w:t>
+      </w:r>
+      <w:r>
+        <w:t xml:space="preserve"> </w:t>
+      </w:r>
+      <w:r>
+        <w:t xml:space="preserve">published summaries alone, an unconfirmed evaluation protocol — whether</w:t>
+      </w:r>
+      <w:r>
+        <w:t xml:space="preserve"> </w:t>
+      </w:r>
+      <w:r>
+        <w:t xml:space="preserve">its reported results include a genuinely external, never-touched holdout</w:t>
+      </w:r>
+      <w:r>
+        <w:t xml:space="preserve"> </w:t>
+      </w:r>
+      <w:r>
+        <w:t xml:space="preserve">in the sense Section 4.6 insists on, or same-distribution evaluation</w:t>
+      </w:r>
+      <w:r>
+        <w:t xml:space="preserve"> </w:t>
+      </w:r>
+      <w:r>
+        <w:t xml:space="preserve">across its stated four benchmark datasets, was not established here and</w:t>
+      </w:r>
+      <w:r>
+        <w:t xml:space="preserve"> </w:t>
+      </w:r>
+      <w:r>
+        <w:t xml:space="preserve">should be checked directly against the paper before treating it as a</w:t>
+      </w:r>
+      <w:r>
+        <w:t xml:space="preserve"> </w:t>
+      </w:r>
+      <w:r>
+        <w:t xml:space="preserve">directly comparable headline number (Section 2.8). This family is the</w:t>
+      </w:r>
+      <w:r>
+        <w:t xml:space="preserve"> </w:t>
+      </w:r>
+      <w:r>
+        <w:t xml:space="preserve">most flexible but also the most exposed to the data-leakage failure mode</w:t>
+      </w:r>
+      <w:r>
+        <w:t xml:space="preserve"> </w:t>
+      </w:r>
+      <w:r>
+        <w:t xml:space="preserve">discussed in Section 1.4: an ML-based correlator evaluated only on</w:t>
+      </w:r>
+      <w:r>
+        <w:t xml:space="preserve"> </w:t>
+      </w:r>
+      <w:r>
+        <w:t xml:space="preserve">same-distribution held-out data can appear to solve correlation while</w:t>
+      </w:r>
+      <w:r>
+        <w:t xml:space="preserve"> </w:t>
+      </w:r>
+      <w:r>
+        <w:t xml:space="preserve">actually having learned a dataset-specific shortcut (e.g., a fixed</w:t>
+      </w:r>
+      <w:r>
+        <w:t xml:space="preserve"> </w:t>
+      </w:r>
+      <w:r>
+        <w:t xml:space="preserve">attacker IP, a simulation artifact) that a rule-based system never had</w:t>
+      </w:r>
+      <w:r>
+        <w:t xml:space="preserve"> </w:t>
+      </w:r>
+      <w:r>
+        <w:t xml:space="preserve">the flexibility to exploit in the first place. This risk is precisely why</w:t>
+      </w:r>
+      <w:r>
+        <w:t xml:space="preserve"> </w:t>
+      </w:r>
+      <w:r>
+        <w:t xml:space="preserve">this thesis insists on an external, structurally different evaluation</w:t>
+      </w:r>
+      <w:r>
+        <w:t xml:space="preserve"> </w:t>
+      </w:r>
+      <w:r>
+        <w:t xml:space="preserve">dataset (Section 4.6) rather than treating strong same-distribution</w:t>
+      </w:r>
+      <w:r>
+        <w:t xml:space="preserve"> </w:t>
+      </w:r>
+      <w:r>
+        <w:t xml:space="preserve">validation numbers as sufficient evidence on their own.</w:t>
       </w:r>
     </w:p>
     <w:p>
@@ -3093,25 +3211,13 @@
         <w:t xml:space="preserve"> </w:t>
       </w:r>
       <w:r>
-        <w:t xml:space="preserve">(Section 1.3) deliberately rule out for its own identification stage. This broader</w:t>
-      </w:r>
-      <w:r>
-        <w:t xml:space="preserve"> </w:t>
-      </w:r>
-      <w:r>
-        <w:t xml:space="preserve">literature motivates RL as a viable tool in the security domain generally,</w:t>
-      </w:r>
-      <w:r>
-        <w:t xml:space="preserve"> </w:t>
-      </w:r>
-      <w:r>
-        <w:t xml:space="preserve">but the great majority of it targets a different problem than this</w:t>
-      </w:r>
-      <w:r>
-        <w:t xml:space="preserve"> </w:t>
-      </w:r>
-      <w:r>
-        <w:t xml:space="preserve">thesis: either the</w:t>
+        <w:t xml:space="preserve">(Section 1.3) deliberately rule out for its own identification stage. A</w:t>
+      </w:r>
+      <w:r>
+        <w:t xml:space="preserve"> </w:t>
+      </w:r>
+      <w:r>
+        <w:t xml:space="preserve">fourth, closely related subarea applies RL to alert</w:t>
       </w:r>
       <w:r>
         <w:t xml:space="preserve"> </w:t>
@@ -3121,35 +3227,53 @@
           <w:iCs/>
           <w:i/>
         </w:rPr>
-        <w:t xml:space="preserve">detection</w:t>
-      </w:r>
-      <w:r>
-        <w:t xml:space="preserve">/</w:t>
+        <w:t xml:space="preserve">prioritization</w:t>
+      </w:r>
+      <w:r>
+        <w:t xml:space="preserve"> </w:t>
+      </w:r>
+      <w:r>
+        <w:t xml:space="preserve">rather than correlation or detection: AlertPro (Wang, Yang, Liang, Zhang,</w:t>
+      </w:r>
+      <w:r>
+        <w:t xml:space="preserve"> </w:t>
+      </w:r>
+      <w:r>
+        <w:t xml:space="preserve">Zhang, and Gong, 2024) uses RL to rank already-generated alerts by</w:t>
+      </w:r>
+      <w:r>
+        <w:t xml:space="preserve"> </w:t>
+      </w:r>
+      <w:r>
+        <w:t xml:space="preserve">priority for analyst review, sharing this thesis’s Section 2.1 alert-</w:t>
+      </w:r>
+      <w:r>
+        <w:t xml:space="preserve"> </w:t>
+      </w:r>
+      <w:r>
+        <w:t xml:space="preserve">fatigue motivation and its focus on multi-step attacks, but addressing a</w:t>
+      </w:r>
+      <w:r>
+        <w:t xml:space="preserve"> </w:t>
       </w:r>
       <w:r>
         <w:rPr>
           <w:iCs/>
           <w:i/>
         </w:rPr>
-        <w:t xml:space="preserve">response</w:t>
-      </w:r>
-      <w:r>
-        <w:t xml:space="preserve"> </w:t>
-      </w:r>
-      <w:r>
-        <w:t xml:space="preserve">decision (this project</w:t>
-      </w:r>
-      <w:r>
-        <w:t xml:space="preserve"> </w:t>
-      </w:r>
-      <w:r>
-        <w:t xml:space="preserve">deliberately excludes RL from detection and response, restricting it to</w:t>
-      </w:r>
-      <w:r>
-        <w:t xml:space="preserve"> </w:t>
-      </w:r>
-      <w:r>
-        <w:t xml:space="preserve">the narrower correlation decision, Section 1.3) or an</w:t>
+        <w:t xml:space="preserve">ranking</w:t>
+      </w:r>
+      <w:r>
+        <w:t xml:space="preserve"> </w:t>
+      </w:r>
+      <w:r>
+        <w:t xml:space="preserve">decision (which alert should an analyst look at first) rather</w:t>
+      </w:r>
+      <w:r>
+        <w:t xml:space="preserve"> </w:t>
+      </w:r>
+      <w:r>
+        <w:t xml:space="preserve">than this thesis’s</w:t>
       </w:r>
       <w:r>
         <w:t xml:space="preserve"> </w:t>
@@ -3159,13 +3283,37 @@
           <w:iCs/>
           <w:i/>
         </w:rPr>
-        <w:t xml:space="preserve">offensive</w:t>
-      </w:r>
-      <w:r>
-        <w:t xml:space="preserve"> </w:t>
-      </w:r>
-      <w:r>
-        <w:t xml:space="preserve">planning problem (attack-path selection), rather than the</w:t>
+        <w:t xml:space="preserve">grouping</w:t>
+      </w:r>
+      <w:r>
+        <w:t xml:space="preserve"> </w:t>
+      </w:r>
+      <w:r>
+        <w:t xml:space="preserve">decision (which alerts belong to the same</w:t>
+      </w:r>
+      <w:r>
+        <w:t xml:space="preserve"> </w:t>
+      </w:r>
+      <w:r>
+        <w:t xml:space="preserve">campaign) — a related but distinct problem, not a competing solution to</w:t>
+      </w:r>
+      <w:r>
+        <w:t xml:space="preserve"> </w:t>
+      </w:r>
+      <w:r>
+        <w:t xml:space="preserve">the one this thesis addresses. This broader literature motivates RL as a</w:t>
+      </w:r>
+      <w:r>
+        <w:t xml:space="preserve"> </w:t>
+      </w:r>
+      <w:r>
+        <w:t xml:space="preserve">viable tool in the security domain generally, and the great majority of</w:t>
+      </w:r>
+      <w:r>
+        <w:t xml:space="preserve"> </w:t>
+      </w:r>
+      <w:r>
+        <w:t xml:space="preserve">it targets a different problem than this thesis — the</w:t>
       </w:r>
       <w:r>
         <w:t xml:space="preserve"> </w:t>
@@ -3175,13 +3323,28 @@
           <w:iCs/>
           <w:i/>
         </w:rPr>
-        <w:t xml:space="preserve">defensive,</w:t>
+        <w:t xml:space="preserve">detection</w:t>
+      </w:r>
+      <w:r>
+        <w:t xml:space="preserve">/</w:t>
+      </w:r>
+      <w:r>
+        <w:t xml:space="preserve"> </w:t>
       </w:r>
       <w:r>
         <w:rPr>
           <w:iCs/>
           <w:i/>
         </w:rPr>
+        <w:t xml:space="preserve">response</w:t>
+      </w:r>
+      <w:r>
+        <w:t xml:space="preserve"> </w:t>
+      </w:r>
+      <w:r>
+        <w:t xml:space="preserve">decision, an</w:t>
+      </w:r>
+      <w:r>
         <w:t xml:space="preserve"> </w:t>
       </w:r>
       <w:r>
@@ -3189,13 +3352,89 @@
           <w:iCs/>
           <w:i/>
         </w:rPr>
+        <w:t xml:space="preserve">offensive</w:t>
+      </w:r>
+      <w:r>
+        <w:t xml:space="preserve"> </w:t>
+      </w:r>
+      <w:r>
+        <w:t xml:space="preserve">planning problem, or, as with</w:t>
+      </w:r>
+      <w:r>
+        <w:t xml:space="preserve"> </w:t>
+      </w:r>
+      <w:r>
+        <w:t xml:space="preserve">AlertPro, a</w:t>
+      </w:r>
+      <w:r>
+        <w:t xml:space="preserve"> </w:t>
+      </w:r>
+      <w:r>
+        <w:rPr>
+          <w:iCs/>
+          <w:i/>
+        </w:rPr>
+        <w:t xml:space="preserve">prioritization</w:t>
+      </w:r>
+      <w:r>
+        <w:t xml:space="preserve"> </w:t>
+      </w:r>
+      <w:r>
+        <w:t xml:space="preserve">decision — rather than the</w:t>
+      </w:r>
+      <w:r>
+        <w:t xml:space="preserve"> </w:t>
+      </w:r>
+      <w:r>
+        <w:rPr>
+          <w:iCs/>
+          <w:i/>
+        </w:rPr>
+        <w:t xml:space="preserve">defensive,</w:t>
+      </w:r>
+      <w:r>
+        <w:rPr>
+          <w:iCs/>
+          <w:i/>
+        </w:rPr>
+        <w:t xml:space="preserve"> </w:t>
+      </w:r>
+      <w:r>
+        <w:rPr>
+          <w:iCs/>
+          <w:i/>
+        </w:rPr>
         <w:t xml:space="preserve">post-hoc correlation</w:t>
       </w:r>
       <w:r>
         <w:t xml:space="preserve"> </w:t>
       </w:r>
       <w:r>
-        <w:t xml:space="preserve">problem this thesis addresses. This project’s</w:t>
+        <w:t xml:space="preserve">problem this thesis addresses. The one substantive</w:t>
+      </w:r>
+      <w:r>
+        <w:t xml:space="preserve"> </w:t>
+      </w:r>
+      <w:r>
+        <w:t xml:space="preserve">exception found is GRAIN (Section 2.2), which applies RL directly to</w:t>
+      </w:r>
+      <w:r>
+        <w:t xml:space="preserve"> </w:t>
+      </w:r>
+      <w:r>
+        <w:t xml:space="preserve">alert correlation for multi-step attacks; this thesis’s positioning</w:t>
+      </w:r>
+      <w:r>
+        <w:t xml:space="preserve"> </w:t>
+      </w:r>
+      <w:r>
+        <w:t xml:space="preserve">relative to that specific work, including what remains unverified about</w:t>
+      </w:r>
+      <w:r>
+        <w:t xml:space="preserve"> </w:t>
+      </w:r>
+      <w:r>
+        <w:t xml:space="preserve">it, is discussed in Section 2.8. Short of that exception, this project’s</w:t>
       </w:r>
       <w:r>
         <w:t xml:space="preserve"> </w:t>
@@ -3578,6 +3817,231 @@
       </w:r>
       <w:r>
         <w:t xml:space="preserve">matters, not only as a caveat about this particular model.</w:t>
+      </w:r>
+    </w:p>
+    <w:p>
+      <w:pPr>
+        <w:pStyle w:val="BodyText"/>
+      </w:pPr>
+      <w:r>
+        <w:t xml:space="preserve">GRAIN (Section 2.2) is the closest published work identified during this</w:t>
+      </w:r>
+      <w:r>
+        <w:t xml:space="preserve"> </w:t>
+      </w:r>
+      <w:r>
+        <w:t xml:space="preserve">project’s literature review, and the honest positioning claim is narrower</w:t>
+      </w:r>
+      <w:r>
+        <w:t xml:space="preserve"> </w:t>
+      </w:r>
+      <w:r>
+        <w:t xml:space="preserve">than</w:t>
+      </w:r>
+      <w:r>
+        <w:t xml:space="preserve"> </w:t>
+      </w:r>
+      <w:r>
+        <w:t xml:space="preserve">“</w:t>
+      </w:r>
+      <w:r>
+        <w:t xml:space="preserve">no prior work applies RL to alert correlation</w:t>
+      </w:r>
+      <w:r>
+        <w:t xml:space="preserve">”</w:t>
+      </w:r>
+      <w:r>
+        <w:t xml:space="preserve">: that claim is false</w:t>
+      </w:r>
+      <w:r>
+        <w:t xml:space="preserve"> </w:t>
+      </w:r>
+      <w:r>
+        <w:t xml:space="preserve">once GRAIN is accounted for. What could and could not be confirmed about</w:t>
+      </w:r>
+      <w:r>
+        <w:t xml:space="preserve"> </w:t>
+      </w:r>
+      <w:r>
+        <w:t xml:space="preserve">it during this review matters for how it should be used in a defense.</w:t>
+      </w:r>
+      <w:r>
+        <w:t xml:space="preserve"> </w:t>
+      </w:r>
+      <w:r>
+        <w:t xml:space="preserve">Confirmed, from published summaries: it uses a GNN plus RL to reconstruct</w:t>
+      </w:r>
+      <w:r>
+        <w:t xml:space="preserve"> </w:t>
+      </w:r>
+      <w:r>
+        <w:t xml:space="preserve">multi-step attack scenarios by screening a causal graph of alerts down to</w:t>
+      </w:r>
+      <w:r>
+        <w:t xml:space="preserve"> </w:t>
+      </w:r>
+      <w:r>
+        <w:t xml:space="preserve">an authentic attack path, evaluated across four public multi-step-attack</w:t>
+      </w:r>
+      <w:r>
+        <w:t xml:space="preserve"> </w:t>
+      </w:r>
+      <w:r>
+        <w:t xml:space="preserve">datasets, and its authors report it</w:t>
+      </w:r>
+      <w:r>
+        <w:t xml:space="preserve"> </w:t>
+      </w:r>
+      <w:r>
+        <w:t xml:space="preserve">“</w:t>
+      </w:r>
+      <w:r>
+        <w:t xml:space="preserve">significantly outperforms existing</w:t>
+      </w:r>
+      <w:r>
+        <w:t xml:space="preserve"> </w:t>
+      </w:r>
+      <w:r>
+        <w:t xml:space="preserve">methods</w:t>
+      </w:r>
+      <w:r>
+        <w:t xml:space="preserve">”</w:t>
+      </w:r>
+      <w:r>
+        <w:t xml:space="preserve"> </w:t>
+      </w:r>
+      <w:r>
+        <w:t xml:space="preserve">on those datasets. Not confirmed, and explicitly flagged here</w:t>
+      </w:r>
+      <w:r>
+        <w:t xml:space="preserve"> </w:t>
+      </w:r>
+      <w:r>
+        <w:t xml:space="preserve">rather than assumed either way: whether its reported evaluation includes</w:t>
+      </w:r>
+      <w:r>
+        <w:t xml:space="preserve"> </w:t>
+      </w:r>
+      <w:r>
+        <w:t xml:space="preserve">a dataset genuinely held out from training and tuning in the sense this</w:t>
+      </w:r>
+      <w:r>
+        <w:t xml:space="preserve"> </w:t>
+      </w:r>
+      <w:r>
+        <w:t xml:space="preserve">thesis’s Stage 5 (Section 4.6) insists on, or whether its four datasets</w:t>
+      </w:r>
+      <w:r>
+        <w:t xml:space="preserve"> </w:t>
+      </w:r>
+      <w:r>
+        <w:t xml:space="preserve">are used in a more conventional same-distribution split; its exact</w:t>
+      </w:r>
+      <w:r>
+        <w:t xml:space="preserve"> </w:t>
+      </w:r>
+      <w:r>
+        <w:t xml:space="preserve">authorship; and whether DARPA2000 specifically is among its four</w:t>
+      </w:r>
+      <w:r>
+        <w:t xml:space="preserve"> </w:t>
+      </w:r>
+      <w:r>
+        <w:t xml:space="preserve">evaluation datasets, which — if confirmed — would make a direct,</w:t>
+      </w:r>
+      <w:r>
+        <w:t xml:space="preserve"> </w:t>
+      </w:r>
+      <w:r>
+        <w:t xml:space="preserve">side-by-side numeric comparison against this thesis’s Section 5.4 table</w:t>
+      </w:r>
+      <w:r>
+        <w:t xml:space="preserve"> </w:t>
+      </w:r>
+      <w:r>
+        <w:t xml:space="preserve">possible. Until those points are checked against the primary source, the</w:t>
+      </w:r>
+      <w:r>
+        <w:t xml:space="preserve"> </w:t>
+      </w:r>
+      <w:r>
+        <w:t xml:space="preserve">defensible comparison to draw is architectural and methodological, not</w:t>
+      </w:r>
+      <w:r>
+        <w:t xml:space="preserve"> </w:t>
+      </w:r>
+      <w:r>
+        <w:t xml:space="preserve">numeric: GRAIN reasons over a full alert causal graph via a GNN, where</w:t>
+      </w:r>
+      <w:r>
+        <w:t xml:space="preserve"> </w:t>
+      </w:r>
+      <w:r>
+        <w:t xml:space="preserve">this thesis’s DQN makes a single pairwise link/don’t-link decision over a</w:t>
+      </w:r>
+      <w:r>
+        <w:t xml:space="preserve"> </w:t>
+      </w:r>
+      <w:r>
+        <w:t xml:space="preserve">compact, seven-feature, hand-auditable state (Section 3.5) — a</w:t>
+      </w:r>
+      <w:r>
+        <w:t xml:space="preserve"> </w:t>
+      </w:r>
+      <w:r>
+        <w:t xml:space="preserve">representational-power-versus-leakage-auditability tradeoff in opposite</w:t>
+      </w:r>
+      <w:r>
+        <w:t xml:space="preserve"> </w:t>
+      </w:r>
+      <w:r>
+        <w:t xml:space="preserve">directions — and this thesis’s central contribution remains the</w:t>
+      </w:r>
+      <w:r>
+        <w:t xml:space="preserve"> </w:t>
+      </w:r>
+      <w:r>
+        <w:rPr>
+          <w:iCs/>
+          <w:i/>
+        </w:rPr>
+        <w:t xml:space="preserve">disclosed</w:t>
+      </w:r>
+      <w:r>
+        <w:t xml:space="preserve"> </w:t>
+      </w:r>
+      <w:r>
+        <w:t xml:space="preserve">generalization gap between same-distribution and external</w:t>
+      </w:r>
+      <w:r>
+        <w:t xml:space="preserve"> </w:t>
+      </w:r>
+      <w:r>
+        <w:t xml:space="preserve">evaluation (Section 6.1), which is a property of how a result was</w:t>
+      </w:r>
+      <w:r>
+        <w:t xml:space="preserve"> </w:t>
+      </w:r>
+      <w:r>
+        <w:t xml:space="preserve">obtained and reported, not of which architecture produced it. That</w:t>
+      </w:r>
+      <w:r>
+        <w:t xml:space="preserve"> </w:t>
+      </w:r>
+      <w:r>
+        <w:t xml:space="preserve">property is what should anchor a comparison to GRAIN, once its own</w:t>
+      </w:r>
+      <w:r>
+        <w:t xml:space="preserve"> </w:t>
+      </w:r>
+      <w:r>
+        <w:t xml:space="preserve">evaluation protocol is confirmed, rather than a bare comparison of</w:t>
+      </w:r>
+      <w:r>
+        <w:t xml:space="preserve"> </w:t>
+      </w:r>
+      <w:r>
+        <w:t xml:space="preserve">headline metric values.</w:t>
       </w:r>
     </w:p>
     <w:bookmarkEnd w:id="35"/>
@@ -16812,6 +17276,202 @@
       </w:r>
       <w:r>
         <w:t xml:space="preserve">intrusion detection, Section 2.6 — verify exact volume/pages.)</w:t>
+      </w:r>
+    </w:p>
+    <w:p>
+      <w:pPr>
+        <w:numPr>
+          <w:ilvl w:val="0"/>
+          <w:numId w:val="1008"/>
+        </w:numPr>
+        <w:pStyle w:val="Compact"/>
+      </w:pPr>
+      <w:r>
+        <w:t xml:space="preserve">Wang, X., Yang, X., Liang, X., Zhang, X., Zhang, W., &amp; Gong, X. (2024).</w:t>
+      </w:r>
+      <w:r>
+        <w:t xml:space="preserve"> </w:t>
+      </w:r>
+      <w:r>
+        <w:t xml:space="preserve">Combating Alert Fatigue with AlertPro: Context-Aware Alert Prioritization</w:t>
+      </w:r>
+      <w:r>
+        <w:t xml:space="preserve"> </w:t>
+      </w:r>
+      <w:r>
+        <w:t xml:space="preserve">Using Reinforcement Learning for Multi-Step Attack Detection.</w:t>
+      </w:r>
+      <w:r>
+        <w:t xml:space="preserve"> </w:t>
+      </w:r>
+      <w:r>
+        <w:rPr>
+          <w:iCs/>
+          <w:i/>
+        </w:rPr>
+        <w:t xml:space="preserve">Computers</w:t>
+      </w:r>
+      <w:r>
+        <w:rPr>
+          <w:iCs/>
+          <w:i/>
+        </w:rPr>
+        <w:t xml:space="preserve"> </w:t>
+      </w:r>
+      <w:r>
+        <w:rPr>
+          <w:iCs/>
+          <w:i/>
+        </w:rPr>
+        <w:t xml:space="preserve">&amp; Security</w:t>
+      </w:r>
+      <w:r>
+        <w:t xml:space="preserve">, 137, 103583. (RL-based alert prioritization, closest</w:t>
+      </w:r>
+      <w:r>
+        <w:t xml:space="preserve"> </w:t>
+      </w:r>
+      <w:r>
+        <w:t xml:space="preserve">published work to this thesis on the alert-fatigue motivation, Section</w:t>
+      </w:r>
+      <w:r>
+        <w:t xml:space="preserve"> </w:t>
+      </w:r>
+      <w:r>
+        <w:t xml:space="preserve">2.1, Section 2.6 — author list and venue found via search and cross-</w:t>
+      </w:r>
+      <w:r>
+        <w:t xml:space="preserve"> </w:t>
+      </w:r>
+      <w:r>
+        <w:t xml:space="preserve">referenced against a dblp record at the time of writing, but not</w:t>
+      </w:r>
+      <w:r>
+        <w:t xml:space="preserve"> </w:t>
+      </w:r>
+      <w:r>
+        <w:t xml:space="preserve">independently verified against the publisher; verify before final</w:t>
+      </w:r>
+      <w:r>
+        <w:t xml:space="preserve"> </w:t>
+      </w:r>
+      <w:r>
+        <w:t xml:space="preserve">citation.)</w:t>
+      </w:r>
+    </w:p>
+    <w:p>
+      <w:pPr>
+        <w:numPr>
+          <w:ilvl w:val="0"/>
+          <w:numId w:val="1008"/>
+        </w:numPr>
+        <w:pStyle w:val="Compact"/>
+      </w:pPr>
+      <w:r>
+        <w:t xml:space="preserve">[AUTHORS UNCONFIRMED] (2024). GRAIN: Graph Neural Network and</w:t>
+      </w:r>
+      <w:r>
+        <w:t xml:space="preserve"> </w:t>
+      </w:r>
+      <w:r>
+        <w:t xml:space="preserve">Reinforcement Learning Aided Causality Discovery for Multi-Step Attack</w:t>
+      </w:r>
+      <w:r>
+        <w:t xml:space="preserve"> </w:t>
+      </w:r>
+      <w:r>
+        <w:t xml:space="preserve">Scenario Reconstruction.</w:t>
+      </w:r>
+      <w:r>
+        <w:t xml:space="preserve"> </w:t>
+      </w:r>
+      <w:r>
+        <w:rPr>
+          <w:iCs/>
+          <w:i/>
+        </w:rPr>
+        <w:t xml:space="preserve">Computers &amp; Security</w:t>
+      </w:r>
+      <w:r>
+        <w:t xml:space="preserve">, 148, 104180. (The</w:t>
+      </w:r>
+      <w:r>
+        <w:t xml:space="preserve"> </w:t>
+      </w:r>
+      <w:r>
+        <w:t xml:space="preserve">closest published work to this thesis’s own correlation approach —</w:t>
+      </w:r>
+      <w:r>
+        <w:t xml:space="preserve"> </w:t>
+      </w:r>
+      <w:r>
+        <w:t xml:space="preserve">RL applied directly to multi-step alert correlation, Section 2.2,</w:t>
+      </w:r>
+      <w:r>
+        <w:t xml:space="preserve"> </w:t>
+      </w:r>
+      <w:r>
+        <w:t xml:space="preserve">Section 2.6, Section 2.8. Title, venue, volume, and DOI were located via</w:t>
+      </w:r>
+      <w:r>
+        <w:t xml:space="preserve"> </w:t>
+      </w:r>
+      <w:r>
+        <w:t xml:space="preserve">search; the author list could NOT be independently confirmed during this</w:t>
+      </w:r>
+      <w:r>
+        <w:t xml:space="preserve"> </w:t>
+      </w:r>
+      <w:r>
+        <w:t xml:space="preserve">review — automated retrieval of the publisher page and a dblp lookup</w:t>
+      </w:r>
+      <w:r>
+        <w:t xml:space="preserve"> </w:t>
+      </w:r>
+      <w:r>
+        <w:t xml:space="preserve">both failed — and is deliberately left unfilled here rather than</w:t>
+      </w:r>
+      <w:r>
+        <w:t xml:space="preserve"> </w:t>
+      </w:r>
+      <w:r>
+        <w:t xml:space="preserve">guessed. Do not cite this entry in a submitted thesis without first</w:t>
+      </w:r>
+      <w:r>
+        <w:t xml:space="preserve"> </w:t>
+      </w:r>
+      <w:r>
+        <w:t xml:space="preserve">pulling the full record directly from the DOI</w:t>
+      </w:r>
+      <w:r>
+        <w:t xml:space="preserve"> </w:t>
+      </w:r>
+      <w:r>
+        <w:t xml:space="preserve">(10.1016/j.cose.2024.104180) or the journal. Its exact evaluation</w:t>
+      </w:r>
+      <w:r>
+        <w:t xml:space="preserve"> </w:t>
+      </w:r>
+      <w:r>
+        <w:t xml:space="preserve">protocol — whether results are reported on a genuinely external holdout</w:t>
+      </w:r>
+      <w:r>
+        <w:t xml:space="preserve"> </w:t>
+      </w:r>
+      <w:r>
+        <w:t xml:space="preserve">or same-distribution splits of its four benchmark datasets, and whether</w:t>
+      </w:r>
+      <w:r>
+        <w:t xml:space="preserve"> </w:t>
+      </w:r>
+      <w:r>
+        <w:t xml:space="preserve">DARPA2000 is among them — is also unconfirmed; see Section 2.8 for what</w:t>
+      </w:r>
+      <w:r>
+        <w:t xml:space="preserve"> </w:t>
+      </w:r>
+      <w:r>
+        <w:t xml:space="preserve">this means for using it as a comparison point.)</w:t>
       </w:r>
     </w:p>
     <w:p>

</xml_diff>

<commit_message>
Confirm GRAIN's authors via direct verification; keep eval protocol flagged
Resolved the author list previously left as [AUTHORS UNCONFIRMED] by
cross-checking Semantic Scholar's Crossref-backed metadata, DBLP, and
co-author Huasen He's own USTC faculty page - three independent sources
agreeing on Xiao, Chen, Yang, He, Jiang, Tan, and Jin (2024/2025, sources
disagree on which). The paper's evaluation protocol (same-distribution vs.
genuinely external holdout, and whether DARPA2000 is among its four
datasets) remains unconfirmed - it's closed-access and no abstract or
full text was retrievable through any legitimate channel - so that caveat
stays in place in Sections 2.2 and 2.8 and in the References entry.

Co-Authored-By: Claude Sonnet 5 <noreply@anthropic.com>
</commit_message>
<xml_diff>
--- a/docs/thesis.docx
+++ b/docs/thesis.docx
@@ -2208,412 +2208,436 @@
         <w:t xml:space="preserve"> </w:t>
       </w:r>
       <w:r>
-        <w:t xml:space="preserve">The closest published work to this thesis’s own approach is GRAIN</w:t>
-      </w:r>
-      <w:r>
-        <w:t xml:space="preserve"> </w:t>
-      </w:r>
-      <w:r>
-        <w:t xml:space="preserve">(</w:t>
+        <w:t xml:space="preserve">The closest published work to this thesis’s own approach is GRAIN (Xiao,</w:t>
+      </w:r>
+      <w:r>
+        <w:t xml:space="preserve"> </w:t>
+      </w:r>
+      <w:r>
+        <w:t xml:space="preserve">Chen, Yang, He, Jiang, Tan, and Jin, 2024 — author list confirmed directly</w:t>
+      </w:r>
+      <w:r>
+        <w:t xml:space="preserve"> </w:t>
+      </w:r>
+      <w:r>
+        <w:t xml:space="preserve">against Semantic Scholar’s Crossref-backed record, DBLP, and a co-author’s</w:t>
+      </w:r>
+      <w:r>
+        <w:t xml:space="preserve"> </w:t>
+      </w:r>
+      <w:r>
+        <w:t xml:space="preserve">own faculty publication page; its exact evaluation protocol was not</w:t>
+      </w:r>
+      <w:r>
+        <w:t xml:space="preserve"> </w:t>
+      </w:r>
+      <w:r>
+        <w:t xml:space="preserve">similarly confirmed, since the paper itself is closed-access and no</w:t>
+      </w:r>
+      <w:r>
+        <w:t xml:space="preserve"> </w:t>
+      </w:r>
+      <w:r>
+        <w:t xml:space="preserve">abstract or full text could be retrieved through any legitimate channel —</w:t>
+      </w:r>
+      <w:r>
+        <w:t xml:space="preserve"> </w:t>
+      </w:r>
+      <w:r>
+        <w:t xml:space="preserve">verify directly against the paper before citing its results further),</w:t>
+      </w:r>
+      <w:r>
+        <w:t xml:space="preserve"> </w:t>
+      </w:r>
+      <w:r>
+        <w:t xml:space="preserve">which builds a</w:t>
+      </w:r>
+      <w:r>
+        <w:t xml:space="preserve"> </w:t>
+      </w:r>
+      <w:r>
+        <w:t xml:space="preserve">graph neural network over an alert causal graph and uses reinforcement</w:t>
+      </w:r>
+      <w:r>
+        <w:t xml:space="preserve"> </w:t>
+      </w:r>
+      <w:r>
+        <w:t xml:space="preserve">learning to screen the causal graph down to the authentic multi-step</w:t>
+      </w:r>
+      <w:r>
+        <w:t xml:space="preserve"> </w:t>
+      </w:r>
+      <w:r>
+        <w:t xml:space="preserve">attack path — RL applied to essentially this thesis’s problem (deciding</w:t>
+      </w:r>
+      <w:r>
+        <w:t xml:space="preserve"> </w:t>
+      </w:r>
+      <w:r>
+        <w:t xml:space="preserve">which alerts belong to the same attack narrative), but via a materially</w:t>
+      </w:r>
+      <w:r>
+        <w:t xml:space="preserve"> </w:t>
+      </w:r>
+      <w:r>
+        <w:t xml:space="preserve">different architecture (a GNN operating over a full alert graph, versus</w:t>
+      </w:r>
+      <w:r>
+        <w:t xml:space="preserve"> </w:t>
+      </w:r>
+      <w:r>
+        <w:t xml:space="preserve">this thesis’s DQN operating on a single hand-engineered seven-feature</w:t>
+      </w:r>
+      <w:r>
+        <w:t xml:space="preserve"> </w:t>
+      </w:r>
+      <w:r>
+        <w:t xml:space="preserve">pairwise state, Section 3.5) and, as far as could be confirmed from</w:t>
+      </w:r>
+      <w:r>
+        <w:t xml:space="preserve"> </w:t>
+      </w:r>
+      <w:r>
+        <w:t xml:space="preserve">published summaries alone, an unconfirmed evaluation protocol — whether</w:t>
+      </w:r>
+      <w:r>
+        <w:t xml:space="preserve"> </w:t>
+      </w:r>
+      <w:r>
+        <w:t xml:space="preserve">its reported results include a genuinely external, never-touched holdout</w:t>
+      </w:r>
+      <w:r>
+        <w:t xml:space="preserve"> </w:t>
+      </w:r>
+      <w:r>
+        <w:t xml:space="preserve">in the sense Section 4.6 insists on, or same-distribution evaluation</w:t>
+      </w:r>
+      <w:r>
+        <w:t xml:space="preserve"> </w:t>
+      </w:r>
+      <w:r>
+        <w:t xml:space="preserve">across its stated four benchmark datasets, was not established here and</w:t>
+      </w:r>
+      <w:r>
+        <w:t xml:space="preserve"> </w:t>
+      </w:r>
+      <w:r>
+        <w:t xml:space="preserve">should be checked directly against the paper before treating it as a</w:t>
+      </w:r>
+      <w:r>
+        <w:t xml:space="preserve"> </w:t>
+      </w:r>
+      <w:r>
+        <w:t xml:space="preserve">directly comparable headline number (Section 2.8). This family is the</w:t>
+      </w:r>
+      <w:r>
+        <w:t xml:space="preserve"> </w:t>
+      </w:r>
+      <w:r>
+        <w:t xml:space="preserve">most flexible but also the most exposed to the data-leakage failure mode</w:t>
+      </w:r>
+      <w:r>
+        <w:t xml:space="preserve"> </w:t>
+      </w:r>
+      <w:r>
+        <w:t xml:space="preserve">discussed in Section 1.4: an ML-based correlator evaluated only on</w:t>
+      </w:r>
+      <w:r>
+        <w:t xml:space="preserve"> </w:t>
+      </w:r>
+      <w:r>
+        <w:t xml:space="preserve">same-distribution held-out data can appear to solve correlation while</w:t>
+      </w:r>
+      <w:r>
+        <w:t xml:space="preserve"> </w:t>
+      </w:r>
+      <w:r>
+        <w:t xml:space="preserve">actually having learned a dataset-specific shortcut (e.g., a fixed</w:t>
+      </w:r>
+      <w:r>
+        <w:t xml:space="preserve"> </w:t>
+      </w:r>
+      <w:r>
+        <w:t xml:space="preserve">attacker IP, a simulation artifact) that a rule-based system never had</w:t>
+      </w:r>
+      <w:r>
+        <w:t xml:space="preserve"> </w:t>
+      </w:r>
+      <w:r>
+        <w:t xml:space="preserve">the flexibility to exploit in the first place. This risk is precisely why</w:t>
+      </w:r>
+      <w:r>
+        <w:t xml:space="preserve"> </w:t>
+      </w:r>
+      <w:r>
+        <w:t xml:space="preserve">this thesis insists on an external, structurally different evaluation</w:t>
+      </w:r>
+      <w:r>
+        <w:t xml:space="preserve"> </w:t>
+      </w:r>
+      <w:r>
+        <w:t xml:space="preserve">dataset (Section 4.6) rather than treating strong same-distribution</w:t>
+      </w:r>
+      <w:r>
+        <w:t xml:space="preserve"> </w:t>
+      </w:r>
+      <w:r>
+        <w:t xml:space="preserve">validation numbers as sufficient evidence on their own.</w:t>
+      </w:r>
+    </w:p>
+    <w:p>
+      <w:pPr>
+        <w:pStyle w:val="BodyText"/>
+      </w:pPr>
+      <w:r>
+        <w:t xml:space="preserve">This project’s DQN-based correlator sits within the machine-learning</w:t>
+      </w:r>
+      <w:r>
+        <w:t xml:space="preserve"> </w:t>
+      </w:r>
+      <w:r>
+        <w:t xml:space="preserve">family but is deliberately restricted to a small, interpretable, seven-</w:t>
+      </w:r>
+      <w:r>
+        <w:t xml:space="preserve"> </w:t>
+      </w:r>
+      <w:r>
+        <w:t xml:space="preserve">dimensional feature vector (Section 3.5) rather than raw alert content, in</w:t>
+      </w:r>
+      <w:r>
+        <w:t xml:space="preserve"> </w:t>
+      </w:r>
+      <w:r>
+        <w:t xml:space="preserve">an attempt to reduce — though, as Chapter 6 shows, not eliminate — this</w:t>
+      </w:r>
+      <w:r>
+        <w:t xml:space="preserve"> </w:t>
+      </w:r>
+      <w:r>
+        <w:t xml:space="preserve">family’s characteristic risk of learning dataset-specific shortcuts rather</w:t>
+      </w:r>
+      <w:r>
+        <w:t xml:space="preserve"> </w:t>
+      </w:r>
+      <w:r>
+        <w:t xml:space="preserve">than genuine correlation signal.</w:t>
+      </w:r>
+    </w:p>
+    <w:bookmarkEnd w:id="29"/>
+    <w:bookmarkStart w:id="30" w:name="kill-chain-and-attack-stage-models"/>
+    <w:p>
+      <w:pPr>
+        <w:pStyle w:val="Heading2"/>
+      </w:pPr>
+      <w:r>
+        <w:t xml:space="preserve">2.3 Kill-Chain and Attack-Stage Models</w:t>
+      </w:r>
+    </w:p>
+    <w:p>
+      <w:pPr>
+        <w:pStyle w:val="FirstParagraph"/>
+      </w:pPr>
+      <w:r>
+        <w:t xml:space="preserve">This project’s notion of a</w:t>
+      </w:r>
+      <w:r>
+        <w:t xml:space="preserve"> </w:t>
+      </w:r>
+      <w:r>
+        <w:t xml:space="preserve">“</w:t>
+      </w:r>
+      <w:r>
+        <w:t xml:space="preserve">multi-stage</w:t>
+      </w:r>
+      <w:r>
+        <w:t xml:space="preserve">”</w:t>
+      </w:r>
+      <w:r>
+        <w:t xml:space="preserve"> </w:t>
+      </w:r>
+      <w:r>
+        <w:t xml:space="preserve">campaign is grounded in the</w:t>
+      </w:r>
+      <w:r>
+        <w:t xml:space="preserve"> </w:t>
+      </w:r>
+      <w:r>
+        <w:t xml:space="preserve">family of kill-chain and attack-lifecycle models used throughout the</w:t>
+      </w:r>
+      <w:r>
+        <w:t xml:space="preserve"> </w:t>
+      </w:r>
+      <w:r>
+        <w:t xml:space="preserve">intrusion-detection and threat-intelligence literature — most influentially</w:t>
+      </w:r>
+      <w:r>
+        <w:t xml:space="preserve"> </w:t>
+      </w:r>
+      <w:r>
+        <w:t xml:space="preserve">the Lockheed Martin Cyber Kill Chain (Hutchins, Cloppert, and Amin, 2011),</w:t>
+      </w:r>
+      <w:r>
+        <w:t xml:space="preserve"> </w:t>
+      </w:r>
+      <w:r>
+        <w:t xml:space="preserve">which decomposes an intrusion into a fixed sequence of stages</w:t>
+      </w:r>
+      <w:r>
+        <w:t xml:space="preserve"> </w:t>
+      </w:r>
+      <w:r>
+        <w:t xml:space="preserve">(reconnaissance, weaponization, delivery, exploitation, installation,</w:t>
+      </w:r>
+      <w:r>
+        <w:t xml:space="preserve"> </w:t>
+      </w:r>
+      <w:r>
+        <w:t xml:space="preserve">command-and-control, and actions on objectives), and the more granular,</w:t>
+      </w:r>
+      <w:r>
+        <w:t xml:space="preserve"> </w:t>
+      </w:r>
+      <w:r>
+        <w:t xml:space="preserve">technique-level MITRE ATT&amp;CK framework, which catalogs specific adversary</w:t>
+      </w:r>
+      <w:r>
+        <w:t xml:space="preserve"> </w:t>
+      </w:r>
+      <w:r>
+        <w:t xml:space="preserve">techniques organized under broadly analogous tactic categories. This</w:t>
+      </w:r>
+      <w:r>
+        <w:t xml:space="preserve"> </w:t>
+      </w:r>
+      <w:r>
+        <w:t xml:space="preserve">project’s</w:t>
+      </w:r>
+      <w:r>
+        <w:t xml:space="preserve"> </w:t>
+      </w:r>
+      <w:r>
+        <w:rPr>
+          <w:rStyle w:val="VerbatimChar"/>
+        </w:rPr>
+        <w:t xml:space="preserve">kill_chain_stage</w:t>
+      </w:r>
+      <w:r>
+        <w:t xml:space="preserve"> </w:t>
+      </w:r>
+      <w:r>
+        <w:t xml:space="preserve">schema field (Section 3.2) is a coarsened</w:t>
+      </w:r>
+      <w:r>
+        <w:t xml:space="preserve"> </w:t>
+      </w:r>
+      <w:r>
+        <w:t xml:space="preserve">version of this family of models, chosen to be granular enough to give the</w:t>
+      </w:r>
+      <w:r>
+        <w:t xml:space="preserve"> </w:t>
+      </w:r>
+      <w:r>
+        <w:t xml:space="preserve">correlation agent a genuine stage-progression signal (Section 3.5) while</w:t>
+      </w:r>
+      <w:r>
+        <w:t xml:space="preserve"> </w:t>
+      </w:r>
+      <w:r>
+        <w:t xml:space="preserve">remaining mappable onto both DARPA2000’s own documented phase structure</w:t>
+      </w:r>
+      <w:r>
+        <w:t xml:space="preserve"> </w:t>
+      </w:r>
+      <w:r>
+        <w:t xml:space="preserve">and CICIDS2017’s flat per-technique labels — the two source datasets do</w:t>
+      </w:r>
+      <w:r>
+        <w:t xml:space="preserve"> </w:t>
+      </w:r>
+      <w:r>
+        <w:t xml:space="preserve">not share a stage taxonomy natively, and reconciling them onto one shared</w:t>
+      </w:r>
+      <w:r>
+        <w:t xml:space="preserve"> </w:t>
+      </w:r>
+      <w:r>
+        <w:t xml:space="preserve">scale was itself one of Stage 2’s concrete tasks (Section 4.2).</w:t>
+      </w:r>
+    </w:p>
+    <w:bookmarkEnd w:id="30"/>
+    <w:bookmarkStart w:id="31" w:name="reinforcement-learning-foundations"/>
+    <w:p>
+      <w:pPr>
+        <w:pStyle w:val="Heading2"/>
+      </w:pPr>
+      <w:r>
+        <w:t xml:space="preserve">2.4 Reinforcement Learning Foundations</w:t>
+      </w:r>
+    </w:p>
+    <w:p>
+      <w:pPr>
+        <w:pStyle w:val="FirstParagraph"/>
+      </w:pPr>
+      <w:r>
+        <w:t xml:space="preserve">Reinforcement learning formalizes sequential decision-making as a Markov</w:t>
+      </w:r>
+      <w:r>
+        <w:t xml:space="preserve"> </w:t>
+      </w:r>
+      <w:r>
+        <w:t xml:space="preserve">Decision Process (MDP; Sutton and Barto, 2018): an agent observes a</w:t>
+      </w:r>
+      <w:r>
+        <w:t xml:space="preserve"> </w:t>
+      </w:r>
+      <w:r>
+        <w:t xml:space="preserve">state, takes an action, receives a reward, and transitions to a next</w:t>
+      </w:r>
+      <w:r>
+        <w:t xml:space="preserve"> </w:t>
+      </w:r>
+      <w:r>
+        <w:t xml:space="preserve">state, with the goal of learning a policy that maximizes expected</w:t>
+      </w:r>
+      <w:r>
+        <w:t xml:space="preserve"> </w:t>
+      </w:r>
+      <w:r>
+        <w:t xml:space="preserve">cumulative (discounted) reward. Q-learning (Watkins and Dayan, 1992) is</w:t>
+      </w:r>
+      <w:r>
+        <w:t xml:space="preserve"> </w:t>
+      </w:r>
+      <w:r>
+        <w:t xml:space="preserve">the foundational value-based</w:t>
+      </w:r>
+      <w:r>
+        <w:t xml:space="preserve"> </w:t>
+      </w:r>
+      <w:r>
+        <w:t xml:space="preserve">algorithm in this family: it learns an action-value function, Q(s, a),</w:t>
+      </w:r>
+      <w:r>
+        <w:t xml:space="preserve"> </w:t>
+      </w:r>
+      <w:r>
+        <w:t xml:space="preserve">estimating the expected return of taking action</w:t>
+      </w:r>
+      <w:r>
+        <w:t xml:space="preserve"> </w:t>
       </w:r>
       <w:r>
         <w:rPr>
           <w:iCs/>
           <w:i/>
         </w:rPr>
-        <w:t xml:space="preserve">Computers &amp; Security</w:t>
-      </w:r>
-      <w:r>
-        <w:t xml:space="preserve">, Vol. 148, 2024 — author list not independently</w:t>
-      </w:r>
-      <w:r>
-        <w:t xml:space="preserve"> </w:t>
-      </w:r>
-      <w:r>
-        <w:t xml:space="preserve">confirmed during this review and deliberately not stated here rather than</w:t>
-      </w:r>
-      <w:r>
-        <w:t xml:space="preserve"> </w:t>
-      </w:r>
-      <w:r>
-        <w:t xml:space="preserve">guessed; verify directly from the publisher record before citing further),</w:t>
-      </w:r>
-      <w:r>
-        <w:t xml:space="preserve"> </w:t>
-      </w:r>
-      <w:r>
-        <w:t xml:space="preserve">which builds a</w:t>
-      </w:r>
-      <w:r>
-        <w:t xml:space="preserve"> </w:t>
-      </w:r>
-      <w:r>
-        <w:t xml:space="preserve">graph neural network over an alert causal graph and uses reinforcement</w:t>
-      </w:r>
-      <w:r>
-        <w:t xml:space="preserve"> </w:t>
-      </w:r>
-      <w:r>
-        <w:t xml:space="preserve">learning to screen the causal graph down to the authentic multi-step</w:t>
-      </w:r>
-      <w:r>
-        <w:t xml:space="preserve"> </w:t>
-      </w:r>
-      <w:r>
-        <w:t xml:space="preserve">attack path — RL applied to essentially this thesis’s problem (deciding</w:t>
-      </w:r>
-      <w:r>
-        <w:t xml:space="preserve"> </w:t>
-      </w:r>
-      <w:r>
-        <w:t xml:space="preserve">which alerts belong to the same attack narrative), but via a materially</w:t>
-      </w:r>
-      <w:r>
-        <w:t xml:space="preserve"> </w:t>
-      </w:r>
-      <w:r>
-        <w:t xml:space="preserve">different architecture (a GNN operating over a full alert graph, versus</w:t>
-      </w:r>
-      <w:r>
-        <w:t xml:space="preserve"> </w:t>
-      </w:r>
-      <w:r>
-        <w:t xml:space="preserve">this thesis’s DQN operating on a single hand-engineered seven-feature</w:t>
-      </w:r>
-      <w:r>
-        <w:t xml:space="preserve"> </w:t>
-      </w:r>
-      <w:r>
-        <w:t xml:space="preserve">pairwise state, Section 3.5) and, as far as could be confirmed from</w:t>
-      </w:r>
-      <w:r>
-        <w:t xml:space="preserve"> </w:t>
-      </w:r>
-      <w:r>
-        <w:t xml:space="preserve">published summaries alone, an unconfirmed evaluation protocol — whether</w:t>
-      </w:r>
-      <w:r>
-        <w:t xml:space="preserve"> </w:t>
-      </w:r>
-      <w:r>
-        <w:t xml:space="preserve">its reported results include a genuinely external, never-touched holdout</w:t>
-      </w:r>
-      <w:r>
-        <w:t xml:space="preserve"> </w:t>
-      </w:r>
-      <w:r>
-        <w:t xml:space="preserve">in the sense Section 4.6 insists on, or same-distribution evaluation</w:t>
-      </w:r>
-      <w:r>
-        <w:t xml:space="preserve"> </w:t>
-      </w:r>
-      <w:r>
-        <w:t xml:space="preserve">across its stated four benchmark datasets, was not established here and</w:t>
-      </w:r>
-      <w:r>
-        <w:t xml:space="preserve"> </w:t>
-      </w:r>
-      <w:r>
-        <w:t xml:space="preserve">should be checked directly against the paper before treating it as a</w:t>
-      </w:r>
-      <w:r>
-        <w:t xml:space="preserve"> </w:t>
-      </w:r>
-      <w:r>
-        <w:t xml:space="preserve">directly comparable headline number (Section 2.8). This family is the</w:t>
-      </w:r>
-      <w:r>
-        <w:t xml:space="preserve"> </w:t>
-      </w:r>
-      <w:r>
-        <w:t xml:space="preserve">most flexible but also the most exposed to the data-leakage failure mode</w:t>
-      </w:r>
-      <w:r>
-        <w:t xml:space="preserve"> </w:t>
-      </w:r>
-      <w:r>
-        <w:t xml:space="preserve">discussed in Section 1.4: an ML-based correlator evaluated only on</w:t>
-      </w:r>
-      <w:r>
-        <w:t xml:space="preserve"> </w:t>
-      </w:r>
-      <w:r>
-        <w:t xml:space="preserve">same-distribution held-out data can appear to solve correlation while</w:t>
-      </w:r>
-      <w:r>
-        <w:t xml:space="preserve"> </w:t>
-      </w:r>
-      <w:r>
-        <w:t xml:space="preserve">actually having learned a dataset-specific shortcut (e.g., a fixed</w:t>
-      </w:r>
-      <w:r>
-        <w:t xml:space="preserve"> </w:t>
-      </w:r>
-      <w:r>
-        <w:t xml:space="preserve">attacker IP, a simulation artifact) that a rule-based system never had</w:t>
-      </w:r>
-      <w:r>
-        <w:t xml:space="preserve"> </w:t>
-      </w:r>
-      <w:r>
-        <w:t xml:space="preserve">the flexibility to exploit in the first place. This risk is precisely why</w:t>
-      </w:r>
-      <w:r>
-        <w:t xml:space="preserve"> </w:t>
-      </w:r>
-      <w:r>
-        <w:t xml:space="preserve">this thesis insists on an external, structurally different evaluation</w:t>
-      </w:r>
-      <w:r>
-        <w:t xml:space="preserve"> </w:t>
-      </w:r>
-      <w:r>
-        <w:t xml:space="preserve">dataset (Section 4.6) rather than treating strong same-distribution</w:t>
-      </w:r>
-      <w:r>
-        <w:t xml:space="preserve"> </w:t>
-      </w:r>
-      <w:r>
-        <w:t xml:space="preserve">validation numbers as sufficient evidence on their own.</w:t>
-      </w:r>
-    </w:p>
-    <w:p>
-      <w:pPr>
-        <w:pStyle w:val="BodyText"/>
-      </w:pPr>
-      <w:r>
-        <w:t xml:space="preserve">This project’s DQN-based correlator sits within the machine-learning</w:t>
-      </w:r>
-      <w:r>
-        <w:t xml:space="preserve"> </w:t>
-      </w:r>
-      <w:r>
-        <w:t xml:space="preserve">family but is deliberately restricted to a small, interpretable, seven-</w:t>
-      </w:r>
-      <w:r>
-        <w:t xml:space="preserve"> </w:t>
-      </w:r>
-      <w:r>
-        <w:t xml:space="preserve">dimensional feature vector (Section 3.5) rather than raw alert content, in</w:t>
-      </w:r>
-      <w:r>
-        <w:t xml:space="preserve"> </w:t>
-      </w:r>
-      <w:r>
-        <w:t xml:space="preserve">an attempt to reduce — though, as Chapter 6 shows, not eliminate — this</w:t>
-      </w:r>
-      <w:r>
-        <w:t xml:space="preserve"> </w:t>
-      </w:r>
-      <w:r>
-        <w:t xml:space="preserve">family’s characteristic risk of learning dataset-specific shortcuts rather</w:t>
-      </w:r>
-      <w:r>
-        <w:t xml:space="preserve"> </w:t>
-      </w:r>
-      <w:r>
-        <w:t xml:space="preserve">than genuine correlation signal.</w:t>
-      </w:r>
-    </w:p>
-    <w:bookmarkEnd w:id="29"/>
-    <w:bookmarkStart w:id="30" w:name="kill-chain-and-attack-stage-models"/>
-    <w:p>
-      <w:pPr>
-        <w:pStyle w:val="Heading2"/>
-      </w:pPr>
-      <w:r>
-        <w:t xml:space="preserve">2.3 Kill-Chain and Attack-Stage Models</w:t>
-      </w:r>
-    </w:p>
-    <w:p>
-      <w:pPr>
-        <w:pStyle w:val="FirstParagraph"/>
-      </w:pPr>
-      <w:r>
-        <w:t xml:space="preserve">This project’s notion of a</w:t>
-      </w:r>
-      <w:r>
-        <w:t xml:space="preserve"> </w:t>
-      </w:r>
-      <w:r>
-        <w:t xml:space="preserve">“</w:t>
-      </w:r>
-      <w:r>
-        <w:t xml:space="preserve">multi-stage</w:t>
-      </w:r>
-      <w:r>
-        <w:t xml:space="preserve">”</w:t>
-      </w:r>
-      <w:r>
-        <w:t xml:space="preserve"> </w:t>
-      </w:r>
-      <w:r>
-        <w:t xml:space="preserve">campaign is grounded in the</w:t>
-      </w:r>
-      <w:r>
-        <w:t xml:space="preserve"> </w:t>
-      </w:r>
-      <w:r>
-        <w:t xml:space="preserve">family of kill-chain and attack-lifecycle models used throughout the</w:t>
-      </w:r>
-      <w:r>
-        <w:t xml:space="preserve"> </w:t>
-      </w:r>
-      <w:r>
-        <w:t xml:space="preserve">intrusion-detection and threat-intelligence literature — most influentially</w:t>
-      </w:r>
-      <w:r>
-        <w:t xml:space="preserve"> </w:t>
-      </w:r>
-      <w:r>
-        <w:t xml:space="preserve">the Lockheed Martin Cyber Kill Chain (Hutchins, Cloppert, and Amin, 2011),</w:t>
-      </w:r>
-      <w:r>
-        <w:t xml:space="preserve"> </w:t>
-      </w:r>
-      <w:r>
-        <w:t xml:space="preserve">which decomposes an intrusion into a fixed sequence of stages</w:t>
-      </w:r>
-      <w:r>
-        <w:t xml:space="preserve"> </w:t>
-      </w:r>
-      <w:r>
-        <w:t xml:space="preserve">(reconnaissance, weaponization, delivery, exploitation, installation,</w:t>
-      </w:r>
-      <w:r>
-        <w:t xml:space="preserve"> </w:t>
-      </w:r>
-      <w:r>
-        <w:t xml:space="preserve">command-and-control, and actions on objectives), and the more granular,</w:t>
-      </w:r>
-      <w:r>
-        <w:t xml:space="preserve"> </w:t>
-      </w:r>
-      <w:r>
-        <w:t xml:space="preserve">technique-level MITRE ATT&amp;CK framework, which catalogs specific adversary</w:t>
-      </w:r>
-      <w:r>
-        <w:t xml:space="preserve"> </w:t>
-      </w:r>
-      <w:r>
-        <w:t xml:space="preserve">techniques organized under broadly analogous tactic categories. This</w:t>
-      </w:r>
-      <w:r>
-        <w:t xml:space="preserve"> </w:t>
-      </w:r>
-      <w:r>
-        <w:t xml:space="preserve">project’s</w:t>
-      </w:r>
-      <w:r>
-        <w:t xml:space="preserve"> </w:t>
-      </w:r>
-      <w:r>
-        <w:rPr>
-          <w:rStyle w:val="VerbatimChar"/>
-        </w:rPr>
-        <w:t xml:space="preserve">kill_chain_stage</w:t>
-      </w:r>
-      <w:r>
-        <w:t xml:space="preserve"> </w:t>
-      </w:r>
-      <w:r>
-        <w:t xml:space="preserve">schema field (Section 3.2) is a coarsened</w:t>
-      </w:r>
-      <w:r>
-        <w:t xml:space="preserve"> </w:t>
-      </w:r>
-      <w:r>
-        <w:t xml:space="preserve">version of this family of models, chosen to be granular enough to give the</w:t>
-      </w:r>
-      <w:r>
-        <w:t xml:space="preserve"> </w:t>
-      </w:r>
-      <w:r>
-        <w:t xml:space="preserve">correlation agent a genuine stage-progression signal (Section 3.5) while</w:t>
-      </w:r>
-      <w:r>
-        <w:t xml:space="preserve"> </w:t>
-      </w:r>
-      <w:r>
-        <w:t xml:space="preserve">remaining mappable onto both DARPA2000’s own documented phase structure</w:t>
-      </w:r>
-      <w:r>
-        <w:t xml:space="preserve"> </w:t>
-      </w:r>
-      <w:r>
-        <w:t xml:space="preserve">and CICIDS2017’s flat per-technique labels — the two source datasets do</w:t>
-      </w:r>
-      <w:r>
-        <w:t xml:space="preserve"> </w:t>
-      </w:r>
-      <w:r>
-        <w:t xml:space="preserve">not share a stage taxonomy natively, and reconciling them onto one shared</w:t>
-      </w:r>
-      <w:r>
-        <w:t xml:space="preserve"> </w:t>
-      </w:r>
-      <w:r>
-        <w:t xml:space="preserve">scale was itself one of Stage 2’s concrete tasks (Section 4.2).</w:t>
-      </w:r>
-    </w:p>
-    <w:bookmarkEnd w:id="30"/>
-    <w:bookmarkStart w:id="31" w:name="reinforcement-learning-foundations"/>
-    <w:p>
-      <w:pPr>
-        <w:pStyle w:val="Heading2"/>
-      </w:pPr>
-      <w:r>
-        <w:t xml:space="preserve">2.4 Reinforcement Learning Foundations</w:t>
-      </w:r>
-    </w:p>
-    <w:p>
-      <w:pPr>
-        <w:pStyle w:val="FirstParagraph"/>
-      </w:pPr>
-      <w:r>
-        <w:t xml:space="preserve">Reinforcement learning formalizes sequential decision-making as a Markov</w:t>
-      </w:r>
-      <w:r>
-        <w:t xml:space="preserve"> </w:t>
-      </w:r>
-      <w:r>
-        <w:t xml:space="preserve">Decision Process (MDP; Sutton and Barto, 2018): an agent observes a</w:t>
-      </w:r>
-      <w:r>
-        <w:t xml:space="preserve"> </w:t>
-      </w:r>
-      <w:r>
-        <w:t xml:space="preserve">state, takes an action, receives a reward, and transitions to a next</w:t>
-      </w:r>
-      <w:r>
-        <w:t xml:space="preserve"> </w:t>
-      </w:r>
-      <w:r>
-        <w:t xml:space="preserve">state, with the goal of learning a policy that maximizes expected</w:t>
-      </w:r>
-      <w:r>
-        <w:t xml:space="preserve"> </w:t>
-      </w:r>
-      <w:r>
-        <w:t xml:space="preserve">cumulative (discounted) reward. Q-learning (Watkins and Dayan, 1992) is</w:t>
-      </w:r>
-      <w:r>
-        <w:t xml:space="preserve"> </w:t>
-      </w:r>
-      <w:r>
-        <w:t xml:space="preserve">the foundational value-based</w:t>
-      </w:r>
-      <w:r>
-        <w:t xml:space="preserve"> </w:t>
-      </w:r>
-      <w:r>
-        <w:t xml:space="preserve">algorithm in this family: it learns an action-value function, Q(s, a),</w:t>
-      </w:r>
-      <w:r>
-        <w:t xml:space="preserve"> </w:t>
-      </w:r>
-      <w:r>
-        <w:t xml:space="preserve">estimating the expected return of taking action</w:t>
+        <w:t xml:space="preserve">a</w:t>
+      </w:r>
+      <w:r>
+        <w:t xml:space="preserve"> </w:t>
+      </w:r>
+      <w:r>
+        <w:t xml:space="preserve">in state</w:t>
       </w:r>
       <w:r>
         <w:t xml:space="preserve"> </w:t>
@@ -2623,948 +2647,1028 @@
           <w:iCs/>
           <w:i/>
         </w:rPr>
-        <w:t xml:space="preserve">a</w:t>
-      </w:r>
-      <w:r>
-        <w:t xml:space="preserve"> </w:t>
-      </w:r>
-      <w:r>
-        <w:t xml:space="preserve">in state</w:t>
-      </w:r>
-      <w:r>
-        <w:t xml:space="preserve"> </w:t>
+        <w:t xml:space="preserve">s</w:t>
+      </w:r>
+      <w:r>
+        <w:t xml:space="preserve"> </w:t>
+      </w:r>
+      <w:r>
+        <w:t xml:space="preserve">and</w:t>
+      </w:r>
+      <w:r>
+        <w:t xml:space="preserve"> </w:t>
+      </w:r>
+      <w:r>
+        <w:t xml:space="preserve">acting optimally thereafter, without requiring a model of the environment’s</w:t>
+      </w:r>
+      <w:r>
+        <w:t xml:space="preserve"> </w:t>
+      </w:r>
+      <w:r>
+        <w:t xml:space="preserve">transition dynamics. Deep Q-Networks (DQN; Mnih et al., 2015) extend</w:t>
+      </w:r>
+      <w:r>
+        <w:t xml:space="preserve"> </w:t>
+      </w:r>
+      <w:r>
+        <w:t xml:space="preserve">tabular Q-learning to large or continuous state spaces by approximating</w:t>
+      </w:r>
+      <w:r>
+        <w:t xml:space="preserve"> </w:t>
+      </w:r>
+      <w:r>
+        <w:t xml:space="preserve">Q(s, a) with a neural network, and introduced two mechanisms specifically</w:t>
+      </w:r>
+      <w:r>
+        <w:t xml:space="preserve"> </w:t>
+      </w:r>
+      <w:r>
+        <w:t xml:space="preserve">to stabilize this combination: an experience replay buffer, which</w:t>
+      </w:r>
+      <w:r>
+        <w:t xml:space="preserve"> </w:t>
+      </w:r>
+      <w:r>
+        <w:t xml:space="preserve">decorrelates the sequential training samples a naive online update would</w:t>
+      </w:r>
+      <w:r>
+        <w:t xml:space="preserve"> </w:t>
+      </w:r>
+      <w:r>
+        <w:t xml:space="preserve">otherwise produce, and a separate, periodically-synchronized target</w:t>
+      </w:r>
+      <w:r>
+        <w:t xml:space="preserve"> </w:t>
+      </w:r>
+      <w:r>
+        <w:t xml:space="preserve">network, which prevents the bootstrapped Q-value target from chasing a</w:t>
+      </w:r>
+      <w:r>
+        <w:t xml:space="preserve"> </w:t>
+      </w:r>
+      <w:r>
+        <w:t xml:space="preserve">rapidly-shifting estimate of itself. Subsequent work identified and</w:t>
+      </w:r>
+      <w:r>
+        <w:t xml:space="preserve"> </w:t>
+      </w:r>
+      <w:r>
+        <w:t xml:space="preserve">addressed specific weaknesses in vanilla DQN — most notably Double DQN</w:t>
+      </w:r>
+      <w:r>
+        <w:t xml:space="preserve"> </w:t>
+      </w:r>
+      <w:r>
+        <w:t xml:space="preserve">(Van Hasselt, Guez, and Silver, 2016), which addresses DQN’s tendency to</w:t>
+      </w:r>
+      <w:r>
+        <w:t xml:space="preserve"> </w:t>
+      </w:r>
+      <w:r>
+        <w:t xml:space="preserve">systematically overestimate Q-values by decoupling action selection from</w:t>
+      </w:r>
+      <w:r>
+        <w:t xml:space="preserve"> </w:t>
+      </w:r>
+      <w:r>
+        <w:t xml:space="preserve">action evaluation, and prioritized experience replay (Schaul, Quan,</w:t>
+      </w:r>
+      <w:r>
+        <w:t xml:space="preserve"> </w:t>
+      </w:r>
+      <w:r>
+        <w:t xml:space="preserve">Antonoglou, and Silver, 2016), which samples high-error transitions more</w:t>
+      </w:r>
+      <w:r>
+        <w:t xml:space="preserve"> </w:t>
+      </w:r>
+      <w:r>
+        <w:t xml:space="preserve">often than uniform replay does. This project’s</w:t>
+      </w:r>
+      <w:r>
+        <w:t xml:space="preserve"> </w:t>
+      </w:r>
+      <w:r>
+        <w:t xml:space="preserve">implementation (Section 4.4) uses standard uniform replay and single-</w:t>
+      </w:r>
+      <w:r>
+        <w:t xml:space="preserve"> </w:t>
+      </w:r>
+      <w:r>
+        <w:t xml:space="preserve">network action selection rather than these refinements; this is a</w:t>
+      </w:r>
+      <w:r>
+        <w:t xml:space="preserve"> </w:t>
+      </w:r>
+      <w:r>
+        <w:t xml:space="preserve">deliberate scope limitation, not an oversight, and is revisited in</w:t>
+      </w:r>
+      <w:r>
+        <w:t xml:space="preserve"> </w:t>
+      </w:r>
+      <w:r>
+        <w:t xml:space="preserve">Section 7.4.</w:t>
+      </w:r>
+    </w:p>
+    <w:p>
+      <w:pPr>
+        <w:pStyle w:val="BodyText"/>
+      </w:pPr>
+      <w:r>
+        <w:t xml:space="preserve">Policy-gradient methods take a different approach, directly parameterizing</w:t>
+      </w:r>
+      <w:r>
+        <w:t xml:space="preserve"> </w:t>
+      </w:r>
+      <w:r>
+        <w:t xml:space="preserve">and optimizing a stochastic policy rather than a value function. Trust</w:t>
+      </w:r>
+      <w:r>
+        <w:t xml:space="preserve"> </w:t>
+      </w:r>
+      <w:r>
+        <w:t xml:space="preserve">Region Policy Optimization (TRPO; Schulman et al., 2015) constrains each</w:t>
+      </w:r>
+      <w:r>
+        <w:t xml:space="preserve"> </w:t>
+      </w:r>
+      <w:r>
+        <w:t xml:space="preserve">policy update to a trust region around the current policy to guarantee</w:t>
+      </w:r>
+      <w:r>
+        <w:t xml:space="preserve"> </w:t>
+      </w:r>
+      <w:r>
+        <w:t xml:space="preserve">stable improvement, at significant computational cost per update; Proximal</w:t>
+      </w:r>
+      <w:r>
+        <w:t xml:space="preserve"> </w:t>
+      </w:r>
+      <w:r>
+        <w:t xml:space="preserve">Policy Optimization (PPO; Schulman et al., 2017) approximates the same</w:t>
+      </w:r>
+      <w:r>
+        <w:t xml:space="preserve"> </w:t>
+      </w:r>
+      <w:r>
+        <w:t xml:space="preserve">stabilizing effect far more cheaply via a clipped surrogate objective, and</w:t>
+      </w:r>
+      <w:r>
+        <w:t xml:space="preserve"> </w:t>
+      </w:r>
+      <w:r>
+        <w:t xml:space="preserve">has become one of the most widely used general-purpose deep-RL algorithms,</w:t>
+      </w:r>
+      <w:r>
+        <w:t xml:space="preserve"> </w:t>
+      </w:r>
+      <w:r>
+        <w:t xml:space="preserve">particularly for continuous-control and large-action-space problems.</w:t>
+      </w:r>
+    </w:p>
+    <w:bookmarkEnd w:id="31"/>
+    <w:bookmarkStart w:id="32" w:name="dqn-vs.-ppo-for-this-problem"/>
+    <w:p>
+      <w:pPr>
+        <w:pStyle w:val="Heading2"/>
+      </w:pPr>
+      <w:r>
+        <w:t xml:space="preserve">2.5 DQN vs. PPO for This Problem</w:t>
+      </w:r>
+    </w:p>
+    <w:p>
+      <w:pPr>
+        <w:pStyle w:val="FirstParagraph"/>
+      </w:pPr>
+      <w:r>
+        <w:t xml:space="preserve">Section 2.4’s algorithm families differ principally in the action spaces</w:t>
+      </w:r>
+      <w:r>
+        <w:t xml:space="preserve"> </w:t>
+      </w:r>
+      <w:r>
+        <w:t xml:space="preserve">and update stability tradeoffs they were designed around. PPO’s clipped-</w:t>
+      </w:r>
+      <w:r>
+        <w:t xml:space="preserve"> </w:t>
+      </w:r>
+      <w:r>
+        <w:t xml:space="preserve">surrogate mechanism earns its complexity in continuous or very large</w:t>
+      </w:r>
+      <w:r>
+        <w:t xml:space="preserve"> </w:t>
+      </w:r>
+      <w:r>
+        <w:t xml:space="preserve">discrete action spaces, where naive value-based methods struggle to</w:t>
+      </w:r>
+      <w:r>
+        <w:t xml:space="preserve"> </w:t>
+      </w:r>
+      <w:r>
+        <w:t xml:space="preserve">represent or search over the action set efficiently. The correlation</w:t>
+      </w:r>
+      <w:r>
+        <w:t xml:space="preserve"> </w:t>
+      </w:r>
+      <w:r>
+        <w:t xml:space="preserve">decision in this project is a</w:t>
+      </w:r>
+      <w:r>
+        <w:t xml:space="preserve"> </w:t>
+      </w:r>
+      <w:r>
+        <w:rPr>
+          <w:bCs/>
+          <w:b/>
+        </w:rPr>
+        <w:t xml:space="preserve">binary, discrete</w:t>
+      </w:r>
+      <w:r>
+        <w:t xml:space="preserve"> </w:t>
+      </w:r>
+      <w:r>
+        <w:t xml:space="preserve">action — link or</w:t>
+      </w:r>
+      <w:r>
+        <w:t xml:space="preserve"> </w:t>
+      </w:r>
+      <w:r>
+        <w:t xml:space="preserve">don’t-link — which is precisely the small, discrete action space DQN was</w:t>
+      </w:r>
+      <w:r>
+        <w:t xml:space="preserve"> </w:t>
+      </w:r>
+      <w:r>
+        <w:t xml:space="preserve">designed for, and does not require any of the machinery PPO adds value</w:t>
+      </w:r>
+      <w:r>
+        <w:t xml:space="preserve"> </w:t>
+      </w:r>
+      <w:r>
+        <w:t xml:space="preserve">for. DQN was selected as the better-fitting, simpler algorithm for this</w:t>
+      </w:r>
+      <w:r>
+        <w:t xml:space="preserve"> </w:t>
+      </w:r>
+      <w:r>
+        <w:t xml:space="preserve">specific action space, not as a default or a convenience choice; a</w:t>
+      </w:r>
+      <w:r>
+        <w:t xml:space="preserve"> </w:t>
+      </w:r>
+      <w:r>
+        <w:t xml:space="preserve">policy-gradient method remains a reasonable alternative worth testing in</w:t>
+      </w:r>
+      <w:r>
+        <w:t xml:space="preserve"> </w:t>
+      </w:r>
+      <w:r>
+        <w:t xml:space="preserve">future work (Section 8.2), but nothing about this problem’s action space</w:t>
+      </w:r>
+      <w:r>
+        <w:t xml:space="preserve"> </w:t>
+      </w:r>
+      <w:r>
+        <w:t xml:space="preserve">argues for one over DQN.</w:t>
+      </w:r>
+    </w:p>
+    <w:p>
+      <w:pPr>
+        <w:pStyle w:val="BodyText"/>
+      </w:pPr>
+      <w:r>
+        <w:t xml:space="preserve">The DQN implementation in this project includes the algorithm’s core</w:t>
+      </w:r>
+      <w:r>
+        <w:t xml:space="preserve"> </w:t>
+      </w:r>
+      <w:r>
+        <w:t xml:space="preserve">stabilizing components described in Section 2.4: an experience replay</w:t>
+      </w:r>
+      <w:r>
+        <w:t xml:space="preserve"> </w:t>
+      </w:r>
+      <w:r>
+        <w:t xml:space="preserve">buffer, a target network synchronized periodically with the policy</w:t>
+      </w:r>
+      <w:r>
+        <w:t xml:space="preserve"> </w:t>
+      </w:r>
+      <w:r>
+        <w:t xml:space="preserve">network, epsilon-greedy exploration with decay, and a discount factor</w:t>
+      </w:r>
+      <w:r>
+        <w:t xml:space="preserve"> </w:t>
+      </w:r>
+      <w:r>
+        <w:t xml:space="preserve">applied over genuine multi-step episodes (Section 2.2 above; formalized as</w:t>
+      </w:r>
+      <w:r>
+        <w:t xml:space="preserve"> </w:t>
+      </w:r>
+      <w:r>
+        <w:t xml:space="preserve">an MDP in Section 3.5). It does not include Double DQN’s decoupled action</w:t>
+      </w:r>
+      <w:r>
+        <w:t xml:space="preserve"> </w:t>
+      </w:r>
+      <w:r>
+        <w:t xml:space="preserve">selection or prioritized replay (Section 2.4), a disclosed scope</w:t>
+      </w:r>
+      <w:r>
+        <w:t xml:space="preserve"> </w:t>
+      </w:r>
+      <w:r>
+        <w:t xml:space="preserve">limitation. It also substitutes</w:t>
+      </w:r>
+      <w:r>
+        <w:t xml:space="preserve"> </w:t>
+      </w:r>
+      <w:r>
+        <w:rPr>
+          <w:rStyle w:val="VerbatimChar"/>
+        </w:rPr>
+        <w:t xml:space="preserve">scikit-learn</w:t>
+      </w:r>
+      <w:r>
+        <w:t xml:space="preserve">’s</w:t>
+      </w:r>
+      <w:r>
+        <w:t xml:space="preserve"> </w:t>
+      </w:r>
+      <w:r>
+        <w:rPr>
+          <w:rStyle w:val="VerbatimChar"/>
+        </w:rPr>
+        <w:t xml:space="preserve">MLPRegressor</w:t>
+      </w:r>
+      <w:r>
+        <w:t xml:space="preserve"> </w:t>
+      </w:r>
+      <w:r>
+        <w:t xml:space="preserve">for a</w:t>
+      </w:r>
+      <w:r>
+        <w:t xml:space="preserve"> </w:t>
+      </w:r>
+      <w:r>
+        <w:t xml:space="preserve">standard deep-learning framework, a disclosed environment-driven</w:t>
+      </w:r>
+      <w:r>
+        <w:t xml:space="preserve"> </w:t>
+      </w:r>
+      <w:r>
+        <w:t xml:space="preserve">engineering decision described in Section 4.4 and revisited as a</w:t>
+      </w:r>
+      <w:r>
+        <w:t xml:space="preserve"> </w:t>
+      </w:r>
+      <w:r>
+        <w:t xml:space="preserve">limitation in Section 7.4.</w:t>
+      </w:r>
+    </w:p>
+    <w:bookmarkEnd w:id="32"/>
+    <w:bookmarkStart w:id="33" w:name="X544b8a4a762e9019c19b03031eaa7dbcfa5b3c6"/>
+    <w:p>
+      <w:pPr>
+        <w:pStyle w:val="Heading2"/>
+      </w:pPr>
+      <w:r>
+        <w:t xml:space="preserve">2.6 Reinforcement Learning Applied to Cybersecurity</w:t>
+      </w:r>
+    </w:p>
+    <w:p>
+      <w:pPr>
+        <w:pStyle w:val="FirstParagraph"/>
+      </w:pPr>
+      <w:r>
+        <w:t xml:space="preserve">Beyond alert correlation specifically, reinforcement learning has been</w:t>
+      </w:r>
+      <w:r>
+        <w:t xml:space="preserve"> </w:t>
+      </w:r>
+      <w:r>
+        <w:t xml:space="preserve">applied across several cybersecurity subareas, surveyed broadly by Nguyen</w:t>
+      </w:r>
+      <w:r>
+        <w:t xml:space="preserve"> </w:t>
+      </w:r>
+      <w:r>
+        <w:t xml:space="preserve">and Reddi (2021). Adaptive intrusion-</w:t>
       </w:r>
       <w:r>
         <w:rPr>
           <w:iCs/>
           <w:i/>
         </w:rPr>
-        <w:t xml:space="preserve">s</w:t>
-      </w:r>
-      <w:r>
-        <w:t xml:space="preserve"> </w:t>
-      </w:r>
-      <w:r>
-        <w:t xml:space="preserve">and</w:t>
-      </w:r>
-      <w:r>
-        <w:t xml:space="preserve"> </w:t>
-      </w:r>
-      <w:r>
-        <w:t xml:space="preserve">acting optimally thereafter, without requiring a model of the environment’s</w:t>
-      </w:r>
-      <w:r>
-        <w:t xml:space="preserve"> </w:t>
-      </w:r>
-      <w:r>
-        <w:t xml:space="preserve">transition dynamics. Deep Q-Networks (DQN; Mnih et al., 2015) extend</w:t>
-      </w:r>
-      <w:r>
-        <w:t xml:space="preserve"> </w:t>
-      </w:r>
-      <w:r>
-        <w:t xml:space="preserve">tabular Q-learning to large or continuous state spaces by approximating</w:t>
-      </w:r>
-      <w:r>
-        <w:t xml:space="preserve"> </w:t>
-      </w:r>
-      <w:r>
-        <w:t xml:space="preserve">Q(s, a) with a neural network, and introduced two mechanisms specifically</w:t>
-      </w:r>
-      <w:r>
-        <w:t xml:space="preserve"> </w:t>
-      </w:r>
-      <w:r>
-        <w:t xml:space="preserve">to stabilize this combination: an experience replay buffer, which</w:t>
-      </w:r>
-      <w:r>
-        <w:t xml:space="preserve"> </w:t>
-      </w:r>
-      <w:r>
-        <w:t xml:space="preserve">decorrelates the sequential training samples a naive online update would</w:t>
-      </w:r>
-      <w:r>
-        <w:t xml:space="preserve"> </w:t>
-      </w:r>
-      <w:r>
-        <w:t xml:space="preserve">otherwise produce, and a separate, periodically-synchronized target</w:t>
-      </w:r>
-      <w:r>
-        <w:t xml:space="preserve"> </w:t>
-      </w:r>
-      <w:r>
-        <w:t xml:space="preserve">network, which prevents the bootstrapped Q-value target from chasing a</w:t>
-      </w:r>
-      <w:r>
-        <w:t xml:space="preserve"> </w:t>
-      </w:r>
-      <w:r>
-        <w:t xml:space="preserve">rapidly-shifting estimate of itself. Subsequent work identified and</w:t>
-      </w:r>
-      <w:r>
-        <w:t xml:space="preserve"> </w:t>
-      </w:r>
-      <w:r>
-        <w:t xml:space="preserve">addressed specific weaknesses in vanilla DQN — most notably Double DQN</w:t>
-      </w:r>
-      <w:r>
-        <w:t xml:space="preserve"> </w:t>
-      </w:r>
-      <w:r>
-        <w:t xml:space="preserve">(Van Hasselt, Guez, and Silver, 2016), which addresses DQN’s tendency to</w:t>
-      </w:r>
-      <w:r>
-        <w:t xml:space="preserve"> </w:t>
-      </w:r>
-      <w:r>
-        <w:t xml:space="preserve">systematically overestimate Q-values by decoupling action selection from</w:t>
-      </w:r>
-      <w:r>
-        <w:t xml:space="preserve"> </w:t>
-      </w:r>
-      <w:r>
-        <w:t xml:space="preserve">action evaluation, and prioritized experience replay (Schaul, Quan,</w:t>
-      </w:r>
-      <w:r>
-        <w:t xml:space="preserve"> </w:t>
-      </w:r>
-      <w:r>
-        <w:t xml:space="preserve">Antonoglou, and Silver, 2016), which samples high-error transitions more</w:t>
-      </w:r>
-      <w:r>
-        <w:t xml:space="preserve"> </w:t>
-      </w:r>
-      <w:r>
-        <w:t xml:space="preserve">often than uniform replay does. This project’s</w:t>
-      </w:r>
-      <w:r>
-        <w:t xml:space="preserve"> </w:t>
-      </w:r>
-      <w:r>
-        <w:t xml:space="preserve">implementation (Section 4.4) uses standard uniform replay and single-</w:t>
-      </w:r>
-      <w:r>
-        <w:t xml:space="preserve"> </w:t>
-      </w:r>
-      <w:r>
-        <w:t xml:space="preserve">network action selection rather than these refinements; this is a</w:t>
-      </w:r>
-      <w:r>
-        <w:t xml:space="preserve"> </w:t>
-      </w:r>
-      <w:r>
-        <w:t xml:space="preserve">deliberate scope limitation, not an oversight, and is revisited in</w:t>
-      </w:r>
-      <w:r>
-        <w:t xml:space="preserve"> </w:t>
-      </w:r>
-      <w:r>
-        <w:t xml:space="preserve">Section 7.4.</w:t>
-      </w:r>
-    </w:p>
-    <w:p>
-      <w:pPr>
-        <w:pStyle w:val="BodyText"/>
-      </w:pPr>
-      <w:r>
-        <w:t xml:space="preserve">Policy-gradient methods take a different approach, directly parameterizing</w:t>
-      </w:r>
-      <w:r>
-        <w:t xml:space="preserve"> </w:t>
-      </w:r>
-      <w:r>
-        <w:t xml:space="preserve">and optimizing a stochastic policy rather than a value function. Trust</w:t>
-      </w:r>
-      <w:r>
-        <w:t xml:space="preserve"> </w:t>
-      </w:r>
-      <w:r>
-        <w:t xml:space="preserve">Region Policy Optimization (TRPO; Schulman et al., 2015) constrains each</w:t>
-      </w:r>
-      <w:r>
-        <w:t xml:space="preserve"> </w:t>
-      </w:r>
-      <w:r>
-        <w:t xml:space="preserve">policy update to a trust region around the current policy to guarantee</w:t>
-      </w:r>
-      <w:r>
-        <w:t xml:space="preserve"> </w:t>
-      </w:r>
-      <w:r>
-        <w:t xml:space="preserve">stable improvement, at significant computational cost per update; Proximal</w:t>
-      </w:r>
-      <w:r>
-        <w:t xml:space="preserve"> </w:t>
-      </w:r>
-      <w:r>
-        <w:t xml:space="preserve">Policy Optimization (PPO; Schulman et al., 2017) approximates the same</w:t>
-      </w:r>
-      <w:r>
-        <w:t xml:space="preserve"> </w:t>
-      </w:r>
-      <w:r>
-        <w:t xml:space="preserve">stabilizing effect far more cheaply via a clipped surrogate objective, and</w:t>
-      </w:r>
-      <w:r>
-        <w:t xml:space="preserve"> </w:t>
-      </w:r>
-      <w:r>
-        <w:t xml:space="preserve">has become one of the most widely used general-purpose deep-RL algorithms,</w:t>
-      </w:r>
-      <w:r>
-        <w:t xml:space="preserve"> </w:t>
-      </w:r>
-      <w:r>
-        <w:t xml:space="preserve">particularly for continuous-control and large-action-space problems.</w:t>
-      </w:r>
-    </w:p>
-    <w:bookmarkEnd w:id="31"/>
-    <w:bookmarkStart w:id="32" w:name="dqn-vs.-ppo-for-this-problem"/>
+        <w:t xml:space="preserve">response</w:t>
+      </w:r>
+      <w:r>
+        <w:t xml:space="preserve"> </w:t>
+      </w:r>
+      <w:r>
+        <w:t xml:space="preserve">and mitigation-selection</w:t>
+      </w:r>
+      <w:r>
+        <w:t xml:space="preserve"> </w:t>
+      </w:r>
+      <w:r>
+        <w:t xml:space="preserve">systems learn which defensive action to take given an observed attack</w:t>
+      </w:r>
+      <w:r>
+        <w:t xml:space="preserve"> </w:t>
+      </w:r>
+      <w:r>
+        <w:t xml:space="preserve">state — a</w:t>
+      </w:r>
+      <w:r>
+        <w:t xml:space="preserve"> </w:t>
+      </w:r>
+      <w:r>
+        <w:rPr>
+          <w:iCs/>
+          <w:i/>
+        </w:rPr>
+        <w:t xml:space="preserve">response</w:t>
+      </w:r>
+      <w:r>
+        <w:t xml:space="preserve"> </w:t>
+      </w:r>
+      <w:r>
+        <w:t xml:space="preserve">decision, made after detection, rather than the</w:t>
+      </w:r>
+      <w:r>
+        <w:t xml:space="preserve"> </w:t>
+      </w:r>
+      <w:r>
+        <w:t xml:space="preserve">correlation decision this thesis addresses. Autonomous penetration-testing</w:t>
+      </w:r>
+      <w:r>
+        <w:t xml:space="preserve"> </w:t>
+      </w:r>
+      <w:r>
+        <w:t xml:space="preserve">and red-teaming agents (e.g., Schwartz and Kurniawati, 2019) learn</w:t>
+      </w:r>
+      <w:r>
+        <w:t xml:space="preserve"> </w:t>
+      </w:r>
+      <w:r>
+        <w:t xml:space="preserve">attack-</w:t>
+      </w:r>
+      <w:r>
+        <w:rPr>
+          <w:iCs/>
+          <w:i/>
+        </w:rPr>
+        <w:t xml:space="preserve">path</w:t>
+      </w:r>
+      <w:r>
+        <w:t xml:space="preserve"> </w:t>
+      </w:r>
+      <w:r>
+        <w:t xml:space="preserve">selection within a network model — an</w:t>
+      </w:r>
+      <w:r>
+        <w:t xml:space="preserve"> </w:t>
+      </w:r>
+      <w:r>
+        <w:rPr>
+          <w:iCs/>
+          <w:i/>
+        </w:rPr>
+        <w:t xml:space="preserve">offensive</w:t>
+      </w:r>
+      <w:r>
+        <w:t xml:space="preserve"> </w:t>
+      </w:r>
+      <w:r>
+        <w:t xml:space="preserve">planning</w:t>
+      </w:r>
+      <w:r>
+        <w:t xml:space="preserve"> </w:t>
+      </w:r>
+      <w:r>
+        <w:t xml:space="preserve">problem, structurally closer to classical RL benchmarks (an agent</w:t>
+      </w:r>
+      <w:r>
+        <w:t xml:space="preserve"> </w:t>
+      </w:r>
+      <w:r>
+        <w:t xml:space="preserve">navigating toward a goal state through a graph of hosts) than to</w:t>
+      </w:r>
+      <w:r>
+        <w:t xml:space="preserve"> </w:t>
+      </w:r>
+      <w:r>
+        <w:t xml:space="preserve">correlating already-observed alerts. RL-based intrusion</w:t>
+      </w:r>
+      <w:r>
+        <w:t xml:space="preserve"> </w:t>
+      </w:r>
+      <w:r>
+        <w:rPr>
+          <w:iCs/>
+          <w:i/>
+        </w:rPr>
+        <w:t xml:space="preserve">detection</w:t>
+      </w:r>
+      <w:r>
+        <w:t xml:space="preserve"> </w:t>
+      </w:r>
+      <w:r>
+        <w:t xml:space="preserve">(as</w:t>
+      </w:r>
+      <w:r>
+        <w:t xml:space="preserve"> </w:t>
+      </w:r>
+      <w:r>
+        <w:t xml:space="preserve">opposed to correlation) has also been explored directly — for example,</w:t>
+      </w:r>
+      <w:r>
+        <w:t xml:space="preserve"> </w:t>
+      </w:r>
+      <w:r>
+        <w:t xml:space="preserve">Lopez-Martin, Carro, and Sanchez-Esguevillas (2020) apply a DQN to network</w:t>
+      </w:r>
+      <w:r>
+        <w:t xml:space="preserve"> </w:t>
+      </w:r>
+      <w:r>
+        <w:t xml:space="preserve">intrusion detection framed as a classification problem — exactly the kind</w:t>
+      </w:r>
+      <w:r>
+        <w:t xml:space="preserve"> </w:t>
+      </w:r>
+      <w:r>
+        <w:t xml:space="preserve">of RL-for-</w:t>
+      </w:r>
+      <w:r>
+        <w:rPr>
+          <w:iCs/>
+          <w:i/>
+        </w:rPr>
+        <w:t xml:space="preserve">detection</w:t>
+      </w:r>
+      <w:r>
+        <w:t xml:space="preserve"> </w:t>
+      </w:r>
+      <w:r>
+        <w:t xml:space="preserve">application this thesis’s scope commitments</w:t>
+      </w:r>
+      <w:r>
+        <w:t xml:space="preserve"> </w:t>
+      </w:r>
+      <w:r>
+        <w:t xml:space="preserve">(Section 1.3) deliberately rule out for its own identification stage. A</w:t>
+      </w:r>
+      <w:r>
+        <w:t xml:space="preserve"> </w:t>
+      </w:r>
+      <w:r>
+        <w:t xml:space="preserve">fourth, closely related subarea applies RL to alert</w:t>
+      </w:r>
+      <w:r>
+        <w:t xml:space="preserve"> </w:t>
+      </w:r>
+      <w:r>
+        <w:rPr>
+          <w:iCs/>
+          <w:i/>
+        </w:rPr>
+        <w:t xml:space="preserve">prioritization</w:t>
+      </w:r>
+      <w:r>
+        <w:t xml:space="preserve"> </w:t>
+      </w:r>
+      <w:r>
+        <w:t xml:space="preserve">rather than correlation or detection: AlertPro (Wang, Yang, Liang, Zhang,</w:t>
+      </w:r>
+      <w:r>
+        <w:t xml:space="preserve"> </w:t>
+      </w:r>
+      <w:r>
+        <w:t xml:space="preserve">Zhang, and Gong, 2024) uses RL to rank already-generated alerts by</w:t>
+      </w:r>
+      <w:r>
+        <w:t xml:space="preserve"> </w:t>
+      </w:r>
+      <w:r>
+        <w:t xml:space="preserve">priority for analyst review, sharing this thesis’s Section 2.1 alert-</w:t>
+      </w:r>
+      <w:r>
+        <w:t xml:space="preserve"> </w:t>
+      </w:r>
+      <w:r>
+        <w:t xml:space="preserve">fatigue motivation and its focus on multi-step attacks, but addressing a</w:t>
+      </w:r>
+      <w:r>
+        <w:t xml:space="preserve"> </w:t>
+      </w:r>
+      <w:r>
+        <w:rPr>
+          <w:iCs/>
+          <w:i/>
+        </w:rPr>
+        <w:t xml:space="preserve">ranking</w:t>
+      </w:r>
+      <w:r>
+        <w:t xml:space="preserve"> </w:t>
+      </w:r>
+      <w:r>
+        <w:t xml:space="preserve">decision (which alert should an analyst look at first) rather</w:t>
+      </w:r>
+      <w:r>
+        <w:t xml:space="preserve"> </w:t>
+      </w:r>
+      <w:r>
+        <w:t xml:space="preserve">than this thesis’s</w:t>
+      </w:r>
+      <w:r>
+        <w:t xml:space="preserve"> </w:t>
+      </w:r>
+      <w:r>
+        <w:rPr>
+          <w:iCs/>
+          <w:i/>
+        </w:rPr>
+        <w:t xml:space="preserve">grouping</w:t>
+      </w:r>
+      <w:r>
+        <w:t xml:space="preserve"> </w:t>
+      </w:r>
+      <w:r>
+        <w:t xml:space="preserve">decision (which alerts belong to the same</w:t>
+      </w:r>
+      <w:r>
+        <w:t xml:space="preserve"> </w:t>
+      </w:r>
+      <w:r>
+        <w:t xml:space="preserve">campaign) — a related but distinct problem, not a competing solution to</w:t>
+      </w:r>
+      <w:r>
+        <w:t xml:space="preserve"> </w:t>
+      </w:r>
+      <w:r>
+        <w:t xml:space="preserve">the one this thesis addresses. This broader literature motivates RL as a</w:t>
+      </w:r>
+      <w:r>
+        <w:t xml:space="preserve"> </w:t>
+      </w:r>
+      <w:r>
+        <w:t xml:space="preserve">viable tool in the security domain generally, and the great majority of</w:t>
+      </w:r>
+      <w:r>
+        <w:t xml:space="preserve"> </w:t>
+      </w:r>
+      <w:r>
+        <w:t xml:space="preserve">it targets a different problem than this thesis — the</w:t>
+      </w:r>
+      <w:r>
+        <w:t xml:space="preserve"> </w:t>
+      </w:r>
+      <w:r>
+        <w:rPr>
+          <w:iCs/>
+          <w:i/>
+        </w:rPr>
+        <w:t xml:space="preserve">detection</w:t>
+      </w:r>
+      <w:r>
+        <w:t xml:space="preserve">/</w:t>
+      </w:r>
+      <w:r>
+        <w:t xml:space="preserve"> </w:t>
+      </w:r>
+      <w:r>
+        <w:rPr>
+          <w:iCs/>
+          <w:i/>
+        </w:rPr>
+        <w:t xml:space="preserve">response</w:t>
+      </w:r>
+      <w:r>
+        <w:t xml:space="preserve"> </w:t>
+      </w:r>
+      <w:r>
+        <w:t xml:space="preserve">decision, an</w:t>
+      </w:r>
+      <w:r>
+        <w:t xml:space="preserve"> </w:t>
+      </w:r>
+      <w:r>
+        <w:rPr>
+          <w:iCs/>
+          <w:i/>
+        </w:rPr>
+        <w:t xml:space="preserve">offensive</w:t>
+      </w:r>
+      <w:r>
+        <w:t xml:space="preserve"> </w:t>
+      </w:r>
+      <w:r>
+        <w:t xml:space="preserve">planning problem, or, as with</w:t>
+      </w:r>
+      <w:r>
+        <w:t xml:space="preserve"> </w:t>
+      </w:r>
+      <w:r>
+        <w:t xml:space="preserve">AlertPro, a</w:t>
+      </w:r>
+      <w:r>
+        <w:t xml:space="preserve"> </w:t>
+      </w:r>
+      <w:r>
+        <w:rPr>
+          <w:iCs/>
+          <w:i/>
+        </w:rPr>
+        <w:t xml:space="preserve">prioritization</w:t>
+      </w:r>
+      <w:r>
+        <w:t xml:space="preserve"> </w:t>
+      </w:r>
+      <w:r>
+        <w:t xml:space="preserve">decision — rather than the</w:t>
+      </w:r>
+      <w:r>
+        <w:t xml:space="preserve"> </w:t>
+      </w:r>
+      <w:r>
+        <w:rPr>
+          <w:iCs/>
+          <w:i/>
+        </w:rPr>
+        <w:t xml:space="preserve">defensive,</w:t>
+      </w:r>
+      <w:r>
+        <w:rPr>
+          <w:iCs/>
+          <w:i/>
+        </w:rPr>
+        <w:t xml:space="preserve"> </w:t>
+      </w:r>
+      <w:r>
+        <w:rPr>
+          <w:iCs/>
+          <w:i/>
+        </w:rPr>
+        <w:t xml:space="preserve">post-hoc correlation</w:t>
+      </w:r>
+      <w:r>
+        <w:t xml:space="preserve"> </w:t>
+      </w:r>
+      <w:r>
+        <w:t xml:space="preserve">problem this thesis addresses. The one substantive</w:t>
+      </w:r>
+      <w:r>
+        <w:t xml:space="preserve"> </w:t>
+      </w:r>
+      <w:r>
+        <w:t xml:space="preserve">exception found is GRAIN (Section 2.2), which applies RL directly to</w:t>
+      </w:r>
+      <w:r>
+        <w:t xml:space="preserve"> </w:t>
+      </w:r>
+      <w:r>
+        <w:t xml:space="preserve">alert correlation for multi-step attacks; this thesis’s positioning</w:t>
+      </w:r>
+      <w:r>
+        <w:t xml:space="preserve"> </w:t>
+      </w:r>
+      <w:r>
+        <w:t xml:space="preserve">relative to that specific work, including what remains unverified about</w:t>
+      </w:r>
+      <w:r>
+        <w:t xml:space="preserve"> </w:t>
+      </w:r>
+      <w:r>
+        <w:t xml:space="preserve">it, is discussed in Section 2.8. Short of that exception, this project’s</w:t>
+      </w:r>
+      <w:r>
+        <w:t xml:space="preserve"> </w:t>
+      </w:r>
+      <w:r>
+        <w:t xml:space="preserve">specific combination — RL restricted to a binary correlation decision,</w:t>
+      </w:r>
+      <w:r>
+        <w:t xml:space="preserve"> </w:t>
+      </w:r>
+      <w:r>
+        <w:t xml:space="preserve">evaluated with a genuinely external, structurally different test set — is</w:t>
+      </w:r>
+      <w:r>
+        <w:t xml:space="preserve"> </w:t>
+      </w:r>
+      <w:r>
+        <w:t xml:space="preserve">comparatively underrepresented in this literature relative to RL-based</w:t>
+      </w:r>
+      <w:r>
+        <w:t xml:space="preserve"> </w:t>
+      </w:r>
+      <w:r>
+        <w:t xml:space="preserve">detection work, which more commonly reports same-distribution validation</w:t>
+      </w:r>
+      <w:r>
+        <w:t xml:space="preserve"> </w:t>
+      </w:r>
+      <w:r>
+        <w:t xml:space="preserve">results only, a gap this thesis’s Chapter 6 finding speaks directly to.</w:t>
+      </w:r>
+    </w:p>
+    <w:bookmarkEnd w:id="33"/>
+    <w:bookmarkStart w:id="34" w:name="datasets"/>
     <w:p>
       <w:pPr>
         <w:pStyle w:val="Heading2"/>
       </w:pPr>
       <w:r>
-        <w:t xml:space="preserve">2.5 DQN vs. PPO for This Problem</w:t>
+        <w:t xml:space="preserve">2.7 Datasets</w:t>
       </w:r>
     </w:p>
     <w:p>
       <w:pPr>
         <w:pStyle w:val="FirstParagraph"/>
       </w:pPr>
-      <w:r>
-        <w:t xml:space="preserve">Section 2.4’s algorithm families differ principally in the action spaces</w:t>
-      </w:r>
-      <w:r>
-        <w:t xml:space="preserve"> </w:t>
-      </w:r>
-      <w:r>
-        <w:t xml:space="preserve">and update stability tradeoffs they were designed around. PPO’s clipped-</w:t>
-      </w:r>
-      <w:r>
-        <w:t xml:space="preserve"> </w:t>
-      </w:r>
-      <w:r>
-        <w:t xml:space="preserve">surrogate mechanism earns its complexity in continuous or very large</w:t>
-      </w:r>
-      <w:r>
-        <w:t xml:space="preserve"> </w:t>
-      </w:r>
-      <w:r>
-        <w:t xml:space="preserve">discrete action spaces, where naive value-based methods struggle to</w:t>
-      </w:r>
-      <w:r>
-        <w:t xml:space="preserve"> </w:t>
-      </w:r>
-      <w:r>
-        <w:t xml:space="preserve">represent or search over the action set efficiently. The correlation</w:t>
-      </w:r>
-      <w:r>
-        <w:t xml:space="preserve"> </w:t>
-      </w:r>
-      <w:r>
-        <w:t xml:space="preserve">decision in this project is a</w:t>
-      </w:r>
-      <w:r>
-        <w:t xml:space="preserve"> </w:t>
-      </w:r>
       <w:r>
         <w:rPr>
           <w:bCs/>
           <w:b/>
         </w:rPr>
-        <w:t xml:space="preserve">binary, discrete</w:t>
-      </w:r>
-      <w:r>
-        <w:t xml:space="preserve"> </w:t>
-      </w:r>
-      <w:r>
-        <w:t xml:space="preserve">action — link or</w:t>
-      </w:r>
-      <w:r>
-        <w:t xml:space="preserve"> </w:t>
-      </w:r>
-      <w:r>
-        <w:t xml:space="preserve">don’t-link — which is precisely the small, discrete action space DQN was</w:t>
-      </w:r>
-      <w:r>
-        <w:t xml:space="preserve"> </w:t>
-      </w:r>
-      <w:r>
-        <w:t xml:space="preserve">designed for, and does not require any of the machinery PPO adds value</w:t>
-      </w:r>
-      <w:r>
-        <w:t xml:space="preserve"> </w:t>
-      </w:r>
-      <w:r>
-        <w:t xml:space="preserve">for. DQN was selected as the better-fitting, simpler algorithm for this</w:t>
-      </w:r>
-      <w:r>
-        <w:t xml:space="preserve"> </w:t>
-      </w:r>
-      <w:r>
-        <w:t xml:space="preserve">specific action space, not as a default or a convenience choice; a</w:t>
-      </w:r>
-      <w:r>
-        <w:t xml:space="preserve"> </w:t>
-      </w:r>
-      <w:r>
-        <w:t xml:space="preserve">policy-gradient method remains a reasonable alternative worth testing in</w:t>
-      </w:r>
-      <w:r>
-        <w:t xml:space="preserve"> </w:t>
-      </w:r>
-      <w:r>
-        <w:t xml:space="preserve">future work (Section 8.2), but nothing about this problem’s action space</w:t>
-      </w:r>
-      <w:r>
-        <w:t xml:space="preserve"> </w:t>
-      </w:r>
-      <w:r>
-        <w:t xml:space="preserve">argues for one over DQN.</w:t>
+        <w:t xml:space="preserve">DARPA2000</w:t>
+      </w:r>
+      <w:r>
+        <w:t xml:space="preserve"> </w:t>
+      </w:r>
+      <w:r>
+        <w:t xml:space="preserve">(MIT Lincoln Laboratory) is used as this project’s external,</w:t>
+      </w:r>
+      <w:r>
+        <w:t xml:space="preserve"> </w:t>
+      </w:r>
+      <w:r>
+        <w:t xml:space="preserve">held-out evaluation set. It comprises two labeled multi-stage intrusion</w:t>
+      </w:r>
+      <w:r>
+        <w:t xml:space="preserve"> </w:t>
+      </w:r>
+      <w:r>
+        <w:t xml:space="preserve">scenarios, LLDOS 1.0 and LLDOS 2.0.2, and remains, as of this writing, one</w:t>
+      </w:r>
+      <w:r>
+        <w:t xml:space="preserve"> </w:t>
+      </w:r>
+      <w:r>
+        <w:t xml:space="preserve">of the few datasets with genuine, dataset-native multi-phase campaign</w:t>
+      </w:r>
+      <w:r>
+        <w:t xml:space="preserve"> </w:t>
+      </w:r>
+      <w:r>
+        <w:t xml:space="preserve">ground truth designed specifically to exercise correlation research — a</w:t>
+      </w:r>
+      <w:r>
+        <w:t xml:space="preserve"> </w:t>
+      </w:r>
+      <w:r>
+        <w:t xml:space="preserve">property this project’s own Stage 2 work confirmed newer flow-centric</w:t>
+      </w:r>
+      <w:r>
+        <w:t xml:space="preserve"> </w:t>
+      </w:r>
+      <w:r>
+        <w:t xml:space="preserve">datasets do not have natively (Chapter 4). Its age and known limitations</w:t>
+      </w:r>
+      <w:r>
+        <w:t xml:space="preserve"> </w:t>
+      </w:r>
+      <w:r>
+        <w:t xml:space="preserve">(Section 7.3) are a standard, acknowledged tradeoff in the correlation</w:t>
+      </w:r>
+      <w:r>
+        <w:t xml:space="preserve"> </w:t>
+      </w:r>
+      <w:r>
+        <w:t xml:space="preserve">literature, not unique to this project: newer datasets with realistic</w:t>
+      </w:r>
+      <w:r>
+        <w:t xml:space="preserve"> </w:t>
+      </w:r>
+      <w:r>
+        <w:t xml:space="preserve">traffic volumes have generally not been constructed with genuine</w:t>
+      </w:r>
+      <w:r>
+        <w:t xml:space="preserve"> </w:t>
+      </w:r>
+      <w:r>
+        <w:t xml:space="preserve">multi-phase campaign ground truth as a design goal, which is itself an</w:t>
+      </w:r>
+      <w:r>
+        <w:t xml:space="preserve"> </w:t>
+      </w:r>
+      <w:r>
+        <w:t xml:space="preserve">observation this project’s Stage 2 work makes concrete (Section 2.7,</w:t>
+      </w:r>
+      <w:r>
+        <w:t xml:space="preserve"> </w:t>
+      </w:r>
+      <w:r>
+        <w:t xml:space="preserve">CICIDS2017 below).</w:t>
       </w:r>
     </w:p>
     <w:p>
       <w:pPr>
         <w:pStyle w:val="BodyText"/>
-      </w:pPr>
-      <w:r>
-        <w:t xml:space="preserve">The DQN implementation in this project includes the algorithm’s core</w:t>
-      </w:r>
-      <w:r>
-        <w:t xml:space="preserve"> </w:t>
-      </w:r>
-      <w:r>
-        <w:t xml:space="preserve">stabilizing components described in Section 2.4: an experience replay</w:t>
-      </w:r>
-      <w:r>
-        <w:t xml:space="preserve"> </w:t>
-      </w:r>
-      <w:r>
-        <w:t xml:space="preserve">buffer, a target network synchronized periodically with the policy</w:t>
-      </w:r>
-      <w:r>
-        <w:t xml:space="preserve"> </w:t>
-      </w:r>
-      <w:r>
-        <w:t xml:space="preserve">network, epsilon-greedy exploration with decay, and a discount factor</w:t>
-      </w:r>
-      <w:r>
-        <w:t xml:space="preserve"> </w:t>
-      </w:r>
-      <w:r>
-        <w:t xml:space="preserve">applied over genuine multi-step episodes (Section 2.2 above; formalized as</w:t>
-      </w:r>
-      <w:r>
-        <w:t xml:space="preserve"> </w:t>
-      </w:r>
-      <w:r>
-        <w:t xml:space="preserve">an MDP in Section 3.5). It does not include Double DQN’s decoupled action</w:t>
-      </w:r>
-      <w:r>
-        <w:t xml:space="preserve"> </w:t>
-      </w:r>
-      <w:r>
-        <w:t xml:space="preserve">selection or prioritized replay (Section 2.4), a disclosed scope</w:t>
-      </w:r>
-      <w:r>
-        <w:t xml:space="preserve"> </w:t>
-      </w:r>
-      <w:r>
-        <w:t xml:space="preserve">limitation. It also substitutes</w:t>
-      </w:r>
-      <w:r>
-        <w:t xml:space="preserve"> </w:t>
-      </w:r>
-      <w:r>
-        <w:rPr>
-          <w:rStyle w:val="VerbatimChar"/>
-        </w:rPr>
-        <w:t xml:space="preserve">scikit-learn</w:t>
-      </w:r>
-      <w:r>
-        <w:t xml:space="preserve">’s</w:t>
-      </w:r>
-      <w:r>
-        <w:t xml:space="preserve"> </w:t>
-      </w:r>
-      <w:r>
-        <w:rPr>
-          <w:rStyle w:val="VerbatimChar"/>
-        </w:rPr>
-        <w:t xml:space="preserve">MLPRegressor</w:t>
-      </w:r>
-      <w:r>
-        <w:t xml:space="preserve"> </w:t>
-      </w:r>
-      <w:r>
-        <w:t xml:space="preserve">for a</w:t>
-      </w:r>
-      <w:r>
-        <w:t xml:space="preserve"> </w:t>
-      </w:r>
-      <w:r>
-        <w:t xml:space="preserve">standard deep-learning framework, a disclosed environment-driven</w:t>
-      </w:r>
-      <w:r>
-        <w:t xml:space="preserve"> </w:t>
-      </w:r>
-      <w:r>
-        <w:t xml:space="preserve">engineering decision described in Section 4.4 and revisited as a</w:t>
-      </w:r>
-      <w:r>
-        <w:t xml:space="preserve"> </w:t>
-      </w:r>
-      <w:r>
-        <w:t xml:space="preserve">limitation in Section 7.4.</w:t>
-      </w:r>
-    </w:p>
-    <w:bookmarkEnd w:id="32"/>
-    <w:bookmarkStart w:id="33" w:name="X544b8a4a762e9019c19b03031eaa7dbcfa5b3c6"/>
-    <w:p>
-      <w:pPr>
-        <w:pStyle w:val="Heading2"/>
-      </w:pPr>
-      <w:r>
-        <w:t xml:space="preserve">2.6 Reinforcement Learning Applied to Cybersecurity</w:t>
-      </w:r>
-    </w:p>
-    <w:p>
-      <w:pPr>
-        <w:pStyle w:val="FirstParagraph"/>
-      </w:pPr>
-      <w:r>
-        <w:t xml:space="preserve">Beyond alert correlation specifically, reinforcement learning has been</w:t>
-      </w:r>
-      <w:r>
-        <w:t xml:space="preserve"> </w:t>
-      </w:r>
-      <w:r>
-        <w:t xml:space="preserve">applied across several cybersecurity subareas, surveyed broadly by Nguyen</w:t>
-      </w:r>
-      <w:r>
-        <w:t xml:space="preserve"> </w:t>
-      </w:r>
-      <w:r>
-        <w:t xml:space="preserve">and Reddi (2021). Adaptive intrusion-</w:t>
-      </w:r>
-      <w:r>
-        <w:rPr>
-          <w:iCs/>
-          <w:i/>
-        </w:rPr>
-        <w:t xml:space="preserve">response</w:t>
-      </w:r>
-      <w:r>
-        <w:t xml:space="preserve"> </w:t>
-      </w:r>
-      <w:r>
-        <w:t xml:space="preserve">and mitigation-selection</w:t>
-      </w:r>
-      <w:r>
-        <w:t xml:space="preserve"> </w:t>
-      </w:r>
-      <w:r>
-        <w:t xml:space="preserve">systems learn which defensive action to take given an observed attack</w:t>
-      </w:r>
-      <w:r>
-        <w:t xml:space="preserve"> </w:t>
-      </w:r>
-      <w:r>
-        <w:t xml:space="preserve">state — a</w:t>
-      </w:r>
-      <w:r>
-        <w:t xml:space="preserve"> </w:t>
-      </w:r>
-      <w:r>
-        <w:rPr>
-          <w:iCs/>
-          <w:i/>
-        </w:rPr>
-        <w:t xml:space="preserve">response</w:t>
-      </w:r>
-      <w:r>
-        <w:t xml:space="preserve"> </w:t>
-      </w:r>
-      <w:r>
-        <w:t xml:space="preserve">decision, made after detection, rather than the</w:t>
-      </w:r>
-      <w:r>
-        <w:t xml:space="preserve"> </w:t>
-      </w:r>
-      <w:r>
-        <w:t xml:space="preserve">correlation decision this thesis addresses. Autonomous penetration-testing</w:t>
-      </w:r>
-      <w:r>
-        <w:t xml:space="preserve"> </w:t>
-      </w:r>
-      <w:r>
-        <w:t xml:space="preserve">and red-teaming agents (e.g., Schwartz and Kurniawati, 2019) learn</w:t>
-      </w:r>
-      <w:r>
-        <w:t xml:space="preserve"> </w:t>
-      </w:r>
-      <w:r>
-        <w:t xml:space="preserve">attack-</w:t>
-      </w:r>
-      <w:r>
-        <w:rPr>
-          <w:iCs/>
-          <w:i/>
-        </w:rPr>
-        <w:t xml:space="preserve">path</w:t>
-      </w:r>
-      <w:r>
-        <w:t xml:space="preserve"> </w:t>
-      </w:r>
-      <w:r>
-        <w:t xml:space="preserve">selection within a network model — an</w:t>
-      </w:r>
-      <w:r>
-        <w:t xml:space="preserve"> </w:t>
-      </w:r>
-      <w:r>
-        <w:rPr>
-          <w:iCs/>
-          <w:i/>
-        </w:rPr>
-        <w:t xml:space="preserve">offensive</w:t>
-      </w:r>
-      <w:r>
-        <w:t xml:space="preserve"> </w:t>
-      </w:r>
-      <w:r>
-        <w:t xml:space="preserve">planning</w:t>
-      </w:r>
-      <w:r>
-        <w:t xml:space="preserve"> </w:t>
-      </w:r>
-      <w:r>
-        <w:t xml:space="preserve">problem, structurally closer to classical RL benchmarks (an agent</w:t>
-      </w:r>
-      <w:r>
-        <w:t xml:space="preserve"> </w:t>
-      </w:r>
-      <w:r>
-        <w:t xml:space="preserve">navigating toward a goal state through a graph of hosts) than to</w:t>
-      </w:r>
-      <w:r>
-        <w:t xml:space="preserve"> </w:t>
-      </w:r>
-      <w:r>
-        <w:t xml:space="preserve">correlating already-observed alerts. RL-based intrusion</w:t>
-      </w:r>
-      <w:r>
-        <w:t xml:space="preserve"> </w:t>
-      </w:r>
-      <w:r>
-        <w:rPr>
-          <w:iCs/>
-          <w:i/>
-        </w:rPr>
-        <w:t xml:space="preserve">detection</w:t>
-      </w:r>
-      <w:r>
-        <w:t xml:space="preserve"> </w:t>
-      </w:r>
-      <w:r>
-        <w:t xml:space="preserve">(as</w:t>
-      </w:r>
-      <w:r>
-        <w:t xml:space="preserve"> </w:t>
-      </w:r>
-      <w:r>
-        <w:t xml:space="preserve">opposed to correlation) has also been explored directly — for example,</w:t>
-      </w:r>
-      <w:r>
-        <w:t xml:space="preserve"> </w:t>
-      </w:r>
-      <w:r>
-        <w:t xml:space="preserve">Lopez-Martin, Carro, and Sanchez-Esguevillas (2020) apply a DQN to network</w:t>
-      </w:r>
-      <w:r>
-        <w:t xml:space="preserve"> </w:t>
-      </w:r>
-      <w:r>
-        <w:t xml:space="preserve">intrusion detection framed as a classification problem — exactly the kind</w:t>
-      </w:r>
-      <w:r>
-        <w:t xml:space="preserve"> </w:t>
-      </w:r>
-      <w:r>
-        <w:t xml:space="preserve">of RL-for-</w:t>
-      </w:r>
-      <w:r>
-        <w:rPr>
-          <w:iCs/>
-          <w:i/>
-        </w:rPr>
-        <w:t xml:space="preserve">detection</w:t>
-      </w:r>
-      <w:r>
-        <w:t xml:space="preserve"> </w:t>
-      </w:r>
-      <w:r>
-        <w:t xml:space="preserve">application this thesis’s scope commitments</w:t>
-      </w:r>
-      <w:r>
-        <w:t xml:space="preserve"> </w:t>
-      </w:r>
-      <w:r>
-        <w:t xml:space="preserve">(Section 1.3) deliberately rule out for its own identification stage. A</w:t>
-      </w:r>
-      <w:r>
-        <w:t xml:space="preserve"> </w:t>
-      </w:r>
-      <w:r>
-        <w:t xml:space="preserve">fourth, closely related subarea applies RL to alert</w:t>
-      </w:r>
-      <w:r>
-        <w:t xml:space="preserve"> </w:t>
-      </w:r>
-      <w:r>
-        <w:rPr>
-          <w:iCs/>
-          <w:i/>
-        </w:rPr>
-        <w:t xml:space="preserve">prioritization</w:t>
-      </w:r>
-      <w:r>
-        <w:t xml:space="preserve"> </w:t>
-      </w:r>
-      <w:r>
-        <w:t xml:space="preserve">rather than correlation or detection: AlertPro (Wang, Yang, Liang, Zhang,</w:t>
-      </w:r>
-      <w:r>
-        <w:t xml:space="preserve"> </w:t>
-      </w:r>
-      <w:r>
-        <w:t xml:space="preserve">Zhang, and Gong, 2024) uses RL to rank already-generated alerts by</w:t>
-      </w:r>
-      <w:r>
-        <w:t xml:space="preserve"> </w:t>
-      </w:r>
-      <w:r>
-        <w:t xml:space="preserve">priority for analyst review, sharing this thesis’s Section 2.1 alert-</w:t>
-      </w:r>
-      <w:r>
-        <w:t xml:space="preserve"> </w:t>
-      </w:r>
-      <w:r>
-        <w:t xml:space="preserve">fatigue motivation and its focus on multi-step attacks, but addressing a</w:t>
-      </w:r>
-      <w:r>
-        <w:t xml:space="preserve"> </w:t>
-      </w:r>
-      <w:r>
-        <w:rPr>
-          <w:iCs/>
-          <w:i/>
-        </w:rPr>
-        <w:t xml:space="preserve">ranking</w:t>
-      </w:r>
-      <w:r>
-        <w:t xml:space="preserve"> </w:t>
-      </w:r>
-      <w:r>
-        <w:t xml:space="preserve">decision (which alert should an analyst look at first) rather</w:t>
-      </w:r>
-      <w:r>
-        <w:t xml:space="preserve"> </w:t>
-      </w:r>
-      <w:r>
-        <w:t xml:space="preserve">than this thesis’s</w:t>
-      </w:r>
-      <w:r>
-        <w:t xml:space="preserve"> </w:t>
-      </w:r>
-      <w:r>
-        <w:rPr>
-          <w:iCs/>
-          <w:i/>
-        </w:rPr>
-        <w:t xml:space="preserve">grouping</w:t>
-      </w:r>
-      <w:r>
-        <w:t xml:space="preserve"> </w:t>
-      </w:r>
-      <w:r>
-        <w:t xml:space="preserve">decision (which alerts belong to the same</w:t>
-      </w:r>
-      <w:r>
-        <w:t xml:space="preserve"> </w:t>
-      </w:r>
-      <w:r>
-        <w:t xml:space="preserve">campaign) — a related but distinct problem, not a competing solution to</w:t>
-      </w:r>
-      <w:r>
-        <w:t xml:space="preserve"> </w:t>
-      </w:r>
-      <w:r>
-        <w:t xml:space="preserve">the one this thesis addresses. This broader literature motivates RL as a</w:t>
-      </w:r>
-      <w:r>
-        <w:t xml:space="preserve"> </w:t>
-      </w:r>
-      <w:r>
-        <w:t xml:space="preserve">viable tool in the security domain generally, and the great majority of</w:t>
-      </w:r>
-      <w:r>
-        <w:t xml:space="preserve"> </w:t>
-      </w:r>
-      <w:r>
-        <w:t xml:space="preserve">it targets a different problem than this thesis — the</w:t>
-      </w:r>
-      <w:r>
-        <w:t xml:space="preserve"> </w:t>
-      </w:r>
-      <w:r>
-        <w:rPr>
-          <w:iCs/>
-          <w:i/>
-        </w:rPr>
-        <w:t xml:space="preserve">detection</w:t>
-      </w:r>
-      <w:r>
-        <w:t xml:space="preserve">/</w:t>
-      </w:r>
-      <w:r>
-        <w:t xml:space="preserve"> </w:t>
-      </w:r>
-      <w:r>
-        <w:rPr>
-          <w:iCs/>
-          <w:i/>
-        </w:rPr>
-        <w:t xml:space="preserve">response</w:t>
-      </w:r>
-      <w:r>
-        <w:t xml:space="preserve"> </w:t>
-      </w:r>
-      <w:r>
-        <w:t xml:space="preserve">decision, an</w:t>
-      </w:r>
-      <w:r>
-        <w:t xml:space="preserve"> </w:t>
-      </w:r>
-      <w:r>
-        <w:rPr>
-          <w:iCs/>
-          <w:i/>
-        </w:rPr>
-        <w:t xml:space="preserve">offensive</w:t>
-      </w:r>
-      <w:r>
-        <w:t xml:space="preserve"> </w:t>
-      </w:r>
-      <w:r>
-        <w:t xml:space="preserve">planning problem, or, as with</w:t>
-      </w:r>
-      <w:r>
-        <w:t xml:space="preserve"> </w:t>
-      </w:r>
-      <w:r>
-        <w:t xml:space="preserve">AlertPro, a</w:t>
-      </w:r>
-      <w:r>
-        <w:t xml:space="preserve"> </w:t>
-      </w:r>
-      <w:r>
-        <w:rPr>
-          <w:iCs/>
-          <w:i/>
-        </w:rPr>
-        <w:t xml:space="preserve">prioritization</w:t>
-      </w:r>
-      <w:r>
-        <w:t xml:space="preserve"> </w:t>
-      </w:r>
-      <w:r>
-        <w:t xml:space="preserve">decision — rather than the</w:t>
-      </w:r>
-      <w:r>
-        <w:t xml:space="preserve"> </w:t>
-      </w:r>
-      <w:r>
-        <w:rPr>
-          <w:iCs/>
-          <w:i/>
-        </w:rPr>
-        <w:t xml:space="preserve">defensive,</w:t>
-      </w:r>
-      <w:r>
-        <w:rPr>
-          <w:iCs/>
-          <w:i/>
-        </w:rPr>
-        <w:t xml:space="preserve"> </w:t>
-      </w:r>
-      <w:r>
-        <w:rPr>
-          <w:iCs/>
-          <w:i/>
-        </w:rPr>
-        <w:t xml:space="preserve">post-hoc correlation</w:t>
-      </w:r>
-      <w:r>
-        <w:t xml:space="preserve"> </w:t>
-      </w:r>
-      <w:r>
-        <w:t xml:space="preserve">problem this thesis addresses. The one substantive</w:t>
-      </w:r>
-      <w:r>
-        <w:t xml:space="preserve"> </w:t>
-      </w:r>
-      <w:r>
-        <w:t xml:space="preserve">exception found is GRAIN (Section 2.2), which applies RL directly to</w:t>
-      </w:r>
-      <w:r>
-        <w:t xml:space="preserve"> </w:t>
-      </w:r>
-      <w:r>
-        <w:t xml:space="preserve">alert correlation for multi-step attacks; this thesis’s positioning</w:t>
-      </w:r>
-      <w:r>
-        <w:t xml:space="preserve"> </w:t>
-      </w:r>
-      <w:r>
-        <w:t xml:space="preserve">relative to that specific work, including what remains unverified about</w:t>
-      </w:r>
-      <w:r>
-        <w:t xml:space="preserve"> </w:t>
-      </w:r>
-      <w:r>
-        <w:t xml:space="preserve">it, is discussed in Section 2.8. Short of that exception, this project’s</w:t>
-      </w:r>
-      <w:r>
-        <w:t xml:space="preserve"> </w:t>
-      </w:r>
-      <w:r>
-        <w:t xml:space="preserve">specific combination — RL restricted to a binary correlation decision,</w:t>
-      </w:r>
-      <w:r>
-        <w:t xml:space="preserve"> </w:t>
-      </w:r>
-      <w:r>
-        <w:t xml:space="preserve">evaluated with a genuinely external, structurally different test set — is</w:t>
-      </w:r>
-      <w:r>
-        <w:t xml:space="preserve"> </w:t>
-      </w:r>
-      <w:r>
-        <w:t xml:space="preserve">comparatively underrepresented in this literature relative to RL-based</w:t>
-      </w:r>
-      <w:r>
-        <w:t xml:space="preserve"> </w:t>
-      </w:r>
-      <w:r>
-        <w:t xml:space="preserve">detection work, which more commonly reports same-distribution validation</w:t>
-      </w:r>
-      <w:r>
-        <w:t xml:space="preserve"> </w:t>
-      </w:r>
-      <w:r>
-        <w:t xml:space="preserve">results only, a gap this thesis’s Chapter 6 finding speaks directly to.</w:t>
-      </w:r>
-    </w:p>
-    <w:bookmarkEnd w:id="33"/>
-    <w:bookmarkStart w:id="34" w:name="datasets"/>
-    <w:p>
-      <w:pPr>
-        <w:pStyle w:val="Heading2"/>
-      </w:pPr>
-      <w:r>
-        <w:t xml:space="preserve">2.7 Datasets</w:t>
-      </w:r>
-    </w:p>
-    <w:p>
-      <w:pPr>
-        <w:pStyle w:val="FirstParagraph"/>
       </w:pPr>
       <w:r>
         <w:rPr>
           <w:bCs/>
           <w:b/>
         </w:rPr>
-        <w:t xml:space="preserve">DARPA2000</w:t>
-      </w:r>
-      <w:r>
-        <w:t xml:space="preserve"> </w:t>
-      </w:r>
-      <w:r>
-        <w:t xml:space="preserve">(MIT Lincoln Laboratory) is used as this project’s external,</w:t>
-      </w:r>
-      <w:r>
-        <w:t xml:space="preserve"> </w:t>
-      </w:r>
-      <w:r>
-        <w:t xml:space="preserve">held-out evaluation set. It comprises two labeled multi-stage intrusion</w:t>
-      </w:r>
-      <w:r>
-        <w:t xml:space="preserve"> </w:t>
-      </w:r>
-      <w:r>
-        <w:t xml:space="preserve">scenarios, LLDOS 1.0 and LLDOS 2.0.2, and remains, as of this writing, one</w:t>
-      </w:r>
-      <w:r>
-        <w:t xml:space="preserve"> </w:t>
-      </w:r>
-      <w:r>
-        <w:t xml:space="preserve">of the few datasets with genuine, dataset-native multi-phase campaign</w:t>
-      </w:r>
-      <w:r>
-        <w:t xml:space="preserve"> </w:t>
-      </w:r>
-      <w:r>
-        <w:t xml:space="preserve">ground truth designed specifically to exercise correlation research — a</w:t>
-      </w:r>
-      <w:r>
-        <w:t xml:space="preserve"> </w:t>
-      </w:r>
-      <w:r>
-        <w:t xml:space="preserve">property this project’s own Stage 2 work confirmed newer flow-centric</w:t>
-      </w:r>
-      <w:r>
-        <w:t xml:space="preserve"> </w:t>
-      </w:r>
-      <w:r>
-        <w:t xml:space="preserve">datasets do not have natively (Chapter 4). Its age and known limitations</w:t>
-      </w:r>
-      <w:r>
-        <w:t xml:space="preserve"> </w:t>
-      </w:r>
-      <w:r>
-        <w:t xml:space="preserve">(Section 7.3) are a standard, acknowledged tradeoff in the correlation</w:t>
-      </w:r>
-      <w:r>
-        <w:t xml:space="preserve"> </w:t>
-      </w:r>
-      <w:r>
-        <w:t xml:space="preserve">literature, not unique to this project: newer datasets with realistic</w:t>
-      </w:r>
-      <w:r>
-        <w:t xml:space="preserve"> </w:t>
-      </w:r>
-      <w:r>
-        <w:t xml:space="preserve">traffic volumes have generally not been constructed with genuine</w:t>
-      </w:r>
-      <w:r>
-        <w:t xml:space="preserve"> </w:t>
-      </w:r>
-      <w:r>
-        <w:t xml:space="preserve">multi-phase campaign ground truth as a design goal, which is itself an</w:t>
-      </w:r>
-      <w:r>
-        <w:t xml:space="preserve"> </w:t>
-      </w:r>
-      <w:r>
-        <w:t xml:space="preserve">observation this project’s Stage 2 work makes concrete (Section 2.7,</w:t>
-      </w:r>
-      <w:r>
-        <w:t xml:space="preserve"> </w:t>
-      </w:r>
-      <w:r>
-        <w:t xml:space="preserve">CICIDS2017 below).</w:t>
+        <w:t xml:space="preserve">CICIDS2017</w:t>
+      </w:r>
+      <w:r>
+        <w:t xml:space="preserve"> </w:t>
+      </w:r>
+      <w:r>
+        <w:t xml:space="preserve">(Sharafaldin, Lashkari, and Ghorbani, 2018) is used as the</w:t>
+      </w:r>
+      <w:r>
+        <w:t xml:space="preserve"> </w:t>
+      </w:r>
+      <w:r>
+        <w:t xml:space="preserve">primary training and same-distribution validation dataset for both the</w:t>
+      </w:r>
+      <w:r>
+        <w:t xml:space="preserve"> </w:t>
+      </w:r>
+      <w:r>
+        <w:t xml:space="preserve">Stage 3 identifier and the Stage 4 correlator. It is a large, modern,</w:t>
+      </w:r>
+      <w:r>
+        <w:t xml:space="preserve"> </w:t>
+      </w:r>
+      <w:r>
+        <w:t xml:space="preserve">labeled network-traffic dataset built specifically to address well-known</w:t>
+      </w:r>
+      <w:r>
+        <w:t xml:space="preserve"> </w:t>
+      </w:r>
+      <w:r>
+        <w:t xml:space="preserve">shortcomings of older intrusion-detection datasets (limited traffic</w:t>
+      </w:r>
+      <w:r>
+        <w:t xml:space="preserve"> </w:t>
+      </w:r>
+      <w:r>
+        <w:t xml:space="preserve">diversity, unrealistic background traffic, missing modern attack types),</w:t>
+      </w:r>
+      <w:r>
+        <w:t xml:space="preserve"> </w:t>
+      </w:r>
+      <w:r>
+        <w:t xml:space="preserve">and has become one of the most widely used benchmarks in recent network-</w:t>
+      </w:r>
+      <w:r>
+        <w:t xml:space="preserve"> </w:t>
+      </w:r>
+      <w:r>
+        <w:t xml:space="preserve">intrusion-detection ML research. It ships no native multi-stage campaign</w:t>
+      </w:r>
+      <w:r>
+        <w:t xml:space="preserve"> </w:t>
+      </w:r>
+      <w:r>
+        <w:t xml:space="preserve">labels, however — every attack type is captured as a separate, single-</w:t>
+      </w:r>
+      <w:r>
+        <w:t xml:space="preserve"> </w:t>
+      </w:r>
+      <w:r>
+        <w:t xml:space="preserve">technique file — which is precisely why Stage 2 had to derive campaign</w:t>
+      </w:r>
+      <w:r>
+        <w:t xml:space="preserve"> </w:t>
+      </w:r>
+      <w:r>
+        <w:t xml:space="preserve">structure rather than read it directly (Section 4.2), and is the dataset</w:t>
+      </w:r>
+      <w:r>
+        <w:t xml:space="preserve"> </w:t>
+      </w:r>
+      <w:r>
+        <w:t xml:space="preserve">property most directly responsible for this project’s insistence on a</w:t>
+      </w:r>
+      <w:r>
+        <w:t xml:space="preserve"> </w:t>
+      </w:r>
+      <w:r>
+        <w:t xml:space="preserve">second, genuinely campaign-labeled dataset (DARPA2000) for the headline</w:t>
+      </w:r>
+      <w:r>
+        <w:t xml:space="preserve"> </w:t>
+      </w:r>
+      <w:r>
+        <w:t xml:space="preserve">evaluation.</w:t>
       </w:r>
     </w:p>
     <w:p>
@@ -3576,102 +3680,6 @@
           <w:bCs/>
           <w:b/>
         </w:rPr>
-        <w:t xml:space="preserve">CICIDS2017</w:t>
-      </w:r>
-      <w:r>
-        <w:t xml:space="preserve"> </w:t>
-      </w:r>
-      <w:r>
-        <w:t xml:space="preserve">(Sharafaldin, Lashkari, and Ghorbani, 2018) is used as the</w:t>
-      </w:r>
-      <w:r>
-        <w:t xml:space="preserve"> </w:t>
-      </w:r>
-      <w:r>
-        <w:t xml:space="preserve">primary training and same-distribution validation dataset for both the</w:t>
-      </w:r>
-      <w:r>
-        <w:t xml:space="preserve"> </w:t>
-      </w:r>
-      <w:r>
-        <w:t xml:space="preserve">Stage 3 identifier and the Stage 4 correlator. It is a large, modern,</w:t>
-      </w:r>
-      <w:r>
-        <w:t xml:space="preserve"> </w:t>
-      </w:r>
-      <w:r>
-        <w:t xml:space="preserve">labeled network-traffic dataset built specifically to address well-known</w:t>
-      </w:r>
-      <w:r>
-        <w:t xml:space="preserve"> </w:t>
-      </w:r>
-      <w:r>
-        <w:t xml:space="preserve">shortcomings of older intrusion-detection datasets (limited traffic</w:t>
-      </w:r>
-      <w:r>
-        <w:t xml:space="preserve"> </w:t>
-      </w:r>
-      <w:r>
-        <w:t xml:space="preserve">diversity, unrealistic background traffic, missing modern attack types),</w:t>
-      </w:r>
-      <w:r>
-        <w:t xml:space="preserve"> </w:t>
-      </w:r>
-      <w:r>
-        <w:t xml:space="preserve">and has become one of the most widely used benchmarks in recent network-</w:t>
-      </w:r>
-      <w:r>
-        <w:t xml:space="preserve"> </w:t>
-      </w:r>
-      <w:r>
-        <w:t xml:space="preserve">intrusion-detection ML research. It ships no native multi-stage campaign</w:t>
-      </w:r>
-      <w:r>
-        <w:t xml:space="preserve"> </w:t>
-      </w:r>
-      <w:r>
-        <w:t xml:space="preserve">labels, however — every attack type is captured as a separate, single-</w:t>
-      </w:r>
-      <w:r>
-        <w:t xml:space="preserve"> </w:t>
-      </w:r>
-      <w:r>
-        <w:t xml:space="preserve">technique file — which is precisely why Stage 2 had to derive campaign</w:t>
-      </w:r>
-      <w:r>
-        <w:t xml:space="preserve"> </w:t>
-      </w:r>
-      <w:r>
-        <w:t xml:space="preserve">structure rather than read it directly (Section 4.2), and is the dataset</w:t>
-      </w:r>
-      <w:r>
-        <w:t xml:space="preserve"> </w:t>
-      </w:r>
-      <w:r>
-        <w:t xml:space="preserve">property most directly responsible for this project’s insistence on a</w:t>
-      </w:r>
-      <w:r>
-        <w:t xml:space="preserve"> </w:t>
-      </w:r>
-      <w:r>
-        <w:t xml:space="preserve">second, genuinely campaign-labeled dataset (DARPA2000) for the headline</w:t>
-      </w:r>
-      <w:r>
-        <w:t xml:space="preserve"> </w:t>
-      </w:r>
-      <w:r>
-        <w:t xml:space="preserve">evaluation.</w:t>
-      </w:r>
-    </w:p>
-    <w:p>
-      <w:pPr>
-        <w:pStyle w:val="BodyText"/>
-      </w:pPr>
-      <w:r>
-        <w:rPr>
-          <w:bCs/>
-          <w:b/>
-        </w:rPr>
         <w:t xml:space="preserve">UNSW-NB15</w:t>
       </w:r>
       <w:r>
@@ -3824,19 +3832,19 @@
         <w:pStyle w:val="BodyText"/>
       </w:pPr>
       <w:r>
-        <w:t xml:space="preserve">GRAIN (Section 2.2) is the closest published work identified during this</w:t>
-      </w:r>
-      <w:r>
-        <w:t xml:space="preserve"> </w:t>
-      </w:r>
-      <w:r>
-        <w:t xml:space="preserve">project’s literature review, and the honest positioning claim is narrower</w:t>
-      </w:r>
-      <w:r>
-        <w:t xml:space="preserve"> </w:t>
-      </w:r>
-      <w:r>
-        <w:t xml:space="preserve">than</w:t>
+        <w:t xml:space="preserve">GRAIN (Xiao et al., 2024 — Section 2.2) is the closest published work</w:t>
+      </w:r>
+      <w:r>
+        <w:t xml:space="preserve"> </w:t>
+      </w:r>
+      <w:r>
+        <w:t xml:space="preserve">identified during this project’s literature review, and the honest</w:t>
+      </w:r>
+      <w:r>
+        <w:t xml:space="preserve"> </w:t>
+      </w:r>
+      <w:r>
+        <w:t xml:space="preserve">positioning claim is narrower than</w:t>
       </w:r>
       <w:r>
         <w:t xml:space="preserve"> </w:t>
@@ -3845,43 +3853,67 @@
         <w:t xml:space="preserve">“</w:t>
       </w:r>
       <w:r>
-        <w:t xml:space="preserve">no prior work applies RL to alert correlation</w:t>
+        <w:t xml:space="preserve">no prior work applies RL to alert</w:t>
+      </w:r>
+      <w:r>
+        <w:t xml:space="preserve"> </w:t>
+      </w:r>
+      <w:r>
+        <w:t xml:space="preserve">correlation</w:t>
       </w:r>
       <w:r>
         <w:t xml:space="preserve">”</w:t>
       </w:r>
       <w:r>
-        <w:t xml:space="preserve">: that claim is false</w:t>
-      </w:r>
-      <w:r>
-        <w:t xml:space="preserve"> </w:t>
-      </w:r>
-      <w:r>
-        <w:t xml:space="preserve">once GRAIN is accounted for. What could and could not be confirmed about</w:t>
-      </w:r>
-      <w:r>
-        <w:t xml:space="preserve"> </w:t>
-      </w:r>
-      <w:r>
-        <w:t xml:space="preserve">it during this review matters for how it should be used in a defense.</w:t>
-      </w:r>
-      <w:r>
-        <w:t xml:space="preserve"> </w:t>
-      </w:r>
-      <w:r>
-        <w:t xml:space="preserve">Confirmed, from published summaries: it uses a GNN plus RL to reconstruct</w:t>
-      </w:r>
-      <w:r>
-        <w:t xml:space="preserve"> </w:t>
-      </w:r>
-      <w:r>
-        <w:t xml:space="preserve">multi-step attack scenarios by screening a causal graph of alerts down to</w:t>
-      </w:r>
-      <w:r>
-        <w:t xml:space="preserve"> </w:t>
-      </w:r>
-      <w:r>
-        <w:t xml:space="preserve">an authentic attack path, evaluated across four public multi-step-attack</w:t>
+        <w:t xml:space="preserve">: that claim is false once GRAIN is accounted for. What could</w:t>
+      </w:r>
+      <w:r>
+        <w:t xml:space="preserve"> </w:t>
+      </w:r>
+      <w:r>
+        <w:t xml:space="preserve">and could not be confirmed about it during this review matters for how it</w:t>
+      </w:r>
+      <w:r>
+        <w:t xml:space="preserve"> </w:t>
+      </w:r>
+      <w:r>
+        <w:t xml:space="preserve">should be used in a defense. Confirmed, cross-checked against Semantic</w:t>
+      </w:r>
+      <w:r>
+        <w:t xml:space="preserve"> </w:t>
+      </w:r>
+      <w:r>
+        <w:t xml:space="preserve">Scholar’s Crossref-backed metadata, DBLP, and a co-author’s own faculty</w:t>
+      </w:r>
+      <w:r>
+        <w:t xml:space="preserve"> </w:t>
+      </w:r>
+      <w:r>
+        <w:t xml:space="preserve">publication page (three independent sources agreeing): its full author</w:t>
+      </w:r>
+      <w:r>
+        <w:t xml:space="preserve"> </w:t>
+      </w:r>
+      <w:r>
+        <w:t xml:space="preserve">list, exact venue, volume, and article number. Confirmed from published</w:t>
+      </w:r>
+      <w:r>
+        <w:t xml:space="preserve"> </w:t>
+      </w:r>
+      <w:r>
+        <w:t xml:space="preserve">summaries of its abstract: it uses a GNN plus RL to reconstruct multi-step</w:t>
+      </w:r>
+      <w:r>
+        <w:t xml:space="preserve"> </w:t>
+      </w:r>
+      <w:r>
+        <w:t xml:space="preserve">attack scenarios by screening a causal graph of alerts down to an</w:t>
+      </w:r>
+      <w:r>
+        <w:t xml:space="preserve"> </w:t>
+      </w:r>
+      <w:r>
+        <w:t xml:space="preserve">authentic attack path, evaluated across four public multi-step-attack</w:t>
       </w:r>
       <w:r>
         <w:t xml:space="preserve"> </w:t>
@@ -3917,49 +3949,67 @@
         <w:t xml:space="preserve"> </w:t>
       </w:r>
       <w:r>
-        <w:t xml:space="preserve">rather than assumed either way: whether its reported evaluation includes</w:t>
-      </w:r>
-      <w:r>
-        <w:t xml:space="preserve"> </w:t>
-      </w:r>
-      <w:r>
-        <w:t xml:space="preserve">a dataset genuinely held out from training and tuning in the sense this</w:t>
-      </w:r>
-      <w:r>
-        <w:t xml:space="preserve"> </w:t>
-      </w:r>
-      <w:r>
-        <w:t xml:space="preserve">thesis’s Stage 5 (Section 4.6) insists on, or whether its four datasets</w:t>
-      </w:r>
-      <w:r>
-        <w:t xml:space="preserve"> </w:t>
-      </w:r>
-      <w:r>
-        <w:t xml:space="preserve">are used in a more conventional same-distribution split; its exact</w:t>
-      </w:r>
-      <w:r>
-        <w:t xml:space="preserve"> </w:t>
-      </w:r>
-      <w:r>
-        <w:t xml:space="preserve">authorship; and whether DARPA2000 specifically is among its four</w:t>
-      </w:r>
-      <w:r>
-        <w:t xml:space="preserve"> </w:t>
-      </w:r>
-      <w:r>
-        <w:t xml:space="preserve">evaluation datasets, which — if confirmed — would make a direct,</w:t>
-      </w:r>
-      <w:r>
-        <w:t xml:space="preserve"> </w:t>
-      </w:r>
-      <w:r>
-        <w:t xml:space="preserve">side-by-side numeric comparison against this thesis’s Section 5.4 table</w:t>
-      </w:r>
-      <w:r>
-        <w:t xml:space="preserve"> </w:t>
-      </w:r>
-      <w:r>
-        <w:t xml:space="preserve">possible. Until those points are checked against the primary source, the</w:t>
+        <w:t xml:space="preserve">rather than assumed either way, because the paper itself is closed-access</w:t>
+      </w:r>
+      <w:r>
+        <w:t xml:space="preserve"> </w:t>
+      </w:r>
+      <w:r>
+        <w:t xml:space="preserve">and neither an abstract nor full text could be retrieved through any</w:t>
+      </w:r>
+      <w:r>
+        <w:t xml:space="preserve"> </w:t>
+      </w:r>
+      <w:r>
+        <w:t xml:space="preserve">legitimate channel during this review: whether its reported evaluation</w:t>
+      </w:r>
+      <w:r>
+        <w:t xml:space="preserve"> </w:t>
+      </w:r>
+      <w:r>
+        <w:t xml:space="preserve">includes a dataset genuinely held out from training and tuning in the</w:t>
+      </w:r>
+      <w:r>
+        <w:t xml:space="preserve"> </w:t>
+      </w:r>
+      <w:r>
+        <w:t xml:space="preserve">sense this thesis’s Stage 5 (Section 4.6) insists on, or whether its four</w:t>
+      </w:r>
+      <w:r>
+        <w:t xml:space="preserve"> </w:t>
+      </w:r>
+      <w:r>
+        <w:t xml:space="preserve">datasets are used in a more conventional same-distribution split; and</w:t>
+      </w:r>
+      <w:r>
+        <w:t xml:space="preserve"> </w:t>
+      </w:r>
+      <w:r>
+        <w:t xml:space="preserve">whether DARPA2000 specifically is among its four evaluation datasets,</w:t>
+      </w:r>
+      <w:r>
+        <w:t xml:space="preserve"> </w:t>
+      </w:r>
+      <w:r>
+        <w:t xml:space="preserve">which — if confirmed — would make a direct, side-by-side numeric</w:t>
+      </w:r>
+      <w:r>
+        <w:t xml:space="preserve"> </w:t>
+      </w:r>
+      <w:r>
+        <w:t xml:space="preserve">comparison against this thesis’s Section 5.4 table possible. Until those</w:t>
+      </w:r>
+      <w:r>
+        <w:t xml:space="preserve"> </w:t>
+      </w:r>
+      <w:r>
+        <w:t xml:space="preserve">two points are checked against the primary source (which requires</w:t>
+      </w:r>
+      <w:r>
+        <w:t xml:space="preserve"> </w:t>
+      </w:r>
+      <w:r>
+        <w:t xml:space="preserve">institutional access this review did not have), the</w:t>
       </w:r>
       <w:r>
         <w:t xml:space="preserve"> </w:t>
@@ -17368,19 +17418,19 @@
         <w:pStyle w:val="Compact"/>
       </w:pPr>
       <w:r>
-        <w:t xml:space="preserve">[AUTHORS UNCONFIRMED] (2024). GRAIN: Graph Neural Network and</w:t>
-      </w:r>
-      <w:r>
-        <w:t xml:space="preserve"> </w:t>
-      </w:r>
-      <w:r>
-        <w:t xml:space="preserve">Reinforcement Learning Aided Causality Discovery for Multi-Step Attack</w:t>
-      </w:r>
-      <w:r>
-        <w:t xml:space="preserve"> </w:t>
-      </w:r>
-      <w:r>
-        <w:t xml:space="preserve">Scenario Reconstruction.</w:t>
+        <w:t xml:space="preserve">Xiao, F., Chen, S., Yang, J., He, H., Jiang, X., Tan, X., &amp; Jin, D.</w:t>
+      </w:r>
+      <w:r>
+        <w:t xml:space="preserve"> </w:t>
+      </w:r>
+      <w:r>
+        <w:t xml:space="preserve">(2024). GRAIN: Graph Neural Network and Reinforcement Learning Aided</w:t>
+      </w:r>
+      <w:r>
+        <w:t xml:space="preserve"> </w:t>
+      </w:r>
+      <w:r>
+        <w:t xml:space="preserve">Causality Discovery for Multi-Step Attack Scenario Reconstruction.</w:t>
       </w:r>
       <w:r>
         <w:t xml:space="preserve"> </w:t>
@@ -17393,61 +17443,73 @@
         <w:t xml:space="preserve">Computers &amp; Security</w:t>
       </w:r>
       <w:r>
-        <w:t xml:space="preserve">, 148, 104180. (The</w:t>
-      </w:r>
-      <w:r>
-        <w:t xml:space="preserve"> </w:t>
-      </w:r>
-      <w:r>
-        <w:t xml:space="preserve">closest published work to this thesis’s own correlation approach —</w:t>
-      </w:r>
-      <w:r>
-        <w:t xml:space="preserve"> </w:t>
-      </w:r>
-      <w:r>
-        <w:t xml:space="preserve">RL applied directly to multi-step alert correlation, Section 2.2,</w:t>
-      </w:r>
-      <w:r>
-        <w:t xml:space="preserve"> </w:t>
-      </w:r>
-      <w:r>
-        <w:t xml:space="preserve">Section 2.6, Section 2.8. Title, venue, volume, and DOI were located via</w:t>
-      </w:r>
-      <w:r>
-        <w:t xml:space="preserve"> </w:t>
-      </w:r>
-      <w:r>
-        <w:t xml:space="preserve">search; the author list could NOT be independently confirmed during this</w:t>
-      </w:r>
-      <w:r>
-        <w:t xml:space="preserve"> </w:t>
-      </w:r>
-      <w:r>
-        <w:t xml:space="preserve">review — automated retrieval of the publisher page and a dblp lookup</w:t>
-      </w:r>
-      <w:r>
-        <w:t xml:space="preserve"> </w:t>
-      </w:r>
-      <w:r>
-        <w:t xml:space="preserve">both failed — and is deliberately left unfilled here rather than</w:t>
-      </w:r>
-      <w:r>
-        <w:t xml:space="preserve"> </w:t>
-      </w:r>
-      <w:r>
-        <w:t xml:space="preserve">guessed. Do not cite this entry in a submitted thesis without first</w:t>
-      </w:r>
-      <w:r>
-        <w:t xml:space="preserve"> </w:t>
-      </w:r>
-      <w:r>
-        <w:t xml:space="preserve">pulling the full record directly from the DOI</w:t>
-      </w:r>
-      <w:r>
-        <w:t xml:space="preserve"> </w:t>
-      </w:r>
-      <w:r>
-        <w:t xml:space="preserve">(10.1016/j.cose.2024.104180) or the journal. Its exact evaluation</w:t>
+        <w:t xml:space="preserve">, 148, 104180. (The closest published work to</w:t>
+      </w:r>
+      <w:r>
+        <w:t xml:space="preserve"> </w:t>
+      </w:r>
+      <w:r>
+        <w:t xml:space="preserve">this thesis’s own correlation approach — RL applied directly to</w:t>
+      </w:r>
+      <w:r>
+        <w:t xml:space="preserve"> </w:t>
+      </w:r>
+      <w:r>
+        <w:t xml:space="preserve">multi-step alert correlation, Section 2.2, Section 2.6, Section 2.8.</w:t>
+      </w:r>
+      <w:r>
+        <w:t xml:space="preserve"> </w:t>
+      </w:r>
+      <w:r>
+        <w:t xml:space="preserve">Author list, venue, volume, and article number cross-confirmed against</w:t>
+      </w:r>
+      <w:r>
+        <w:t xml:space="preserve"> </w:t>
+      </w:r>
+      <w:r>
+        <w:t xml:space="preserve">three independent sources — Semantic Scholar’s Crossref-backed record,</w:t>
+      </w:r>
+      <w:r>
+        <w:t xml:space="preserve"> </w:t>
+      </w:r>
+      <w:r>
+        <w:t xml:space="preserve">DBLP (which lists this as a 2025-volume publication against Elsevier’s</w:t>
+      </w:r>
+      <w:r>
+        <w:t xml:space="preserve"> </w:t>
+      </w:r>
+      <w:r>
+        <w:t xml:space="preserve">October 2024 online-first date — both years appear across sources,</w:t>
+      </w:r>
+      <w:r>
+        <w:t xml:space="preserve"> </w:t>
+      </w:r>
+      <w:r>
+        <w:t xml:space="preserve">verify which is correct for formal citation), and co-author Huasen He’s</w:t>
+      </w:r>
+      <w:r>
+        <w:t xml:space="preserve"> </w:t>
+      </w:r>
+      <w:r>
+        <w:t xml:space="preserve">own USTC faculty publication page — so authorship itself should be</w:t>
+      </w:r>
+      <w:r>
+        <w:t xml:space="preserve"> </w:t>
+      </w:r>
+      <w:r>
+        <w:t xml:space="preserve">reliable. What remains unconfirmed: the paper is closed-access, and</w:t>
+      </w:r>
+      <w:r>
+        <w:t xml:space="preserve"> </w:t>
+      </w:r>
+      <w:r>
+        <w:t xml:space="preserve">neither its abstract nor full text could be retrieved through any</w:t>
+      </w:r>
+      <w:r>
+        <w:t xml:space="preserve"> </w:t>
+      </w:r>
+      <w:r>
+        <w:t xml:space="preserve">legitimate channel during this review, so its exact evaluation</w:t>
       </w:r>
       <w:r>
         <w:t xml:space="preserve"> </w:t>
@@ -17465,13 +17527,25 @@
         <w:t xml:space="preserve"> </w:t>
       </w:r>
       <w:r>
-        <w:t xml:space="preserve">DARPA2000 is among them — is also unconfirmed; see Section 2.8 for what</w:t>
-      </w:r>
-      <w:r>
-        <w:t xml:space="preserve"> </w:t>
-      </w:r>
-      <w:r>
-        <w:t xml:space="preserve">this means for using it as a comparison point.)</w:t>
+        <w:t xml:space="preserve">DARPA2000 is among them — is unverified. Do not cite specific numeric</w:t>
+      </w:r>
+      <w:r>
+        <w:t xml:space="preserve"> </w:t>
+      </w:r>
+      <w:r>
+        <w:t xml:space="preserve">results from this paper without first reading it directly via</w:t>
+      </w:r>
+      <w:r>
+        <w:t xml:space="preserve"> </w:t>
+      </w:r>
+      <w:r>
+        <w:t xml:space="preserve">institutional access; see Section 2.8 for what this means for using it</w:t>
+      </w:r>
+      <w:r>
+        <w:t xml:space="preserve"> </w:t>
+      </w:r>
+      <w:r>
+        <w:t xml:space="preserve">as a comparison point.)</w:t>
       </w:r>
     </w:p>
     <w:p>

</xml_diff>